<commit_message>
db diagramm es figma
</commit_message>
<xml_diff>
--- a/docs/RaktarPro_dokumentacio.docx
+++ b/docs/RaktarPro_dokumentacio.docx
@@ -27,10 +27,10 @@
           <w:lang w:val="hu-HU"/>
         </w:rPr>
         <w:drawing>
-          <wp:anchor distT="0" distB="0" distL="114300" distR="114300" simplePos="0" relativeHeight="251661312" behindDoc="0" locked="0" layoutInCell="1" allowOverlap="1" wp14:anchorId="218AD6A4" wp14:editId="33948B51">
+          <wp:anchor distT="0" distB="0" distL="114300" distR="114300" simplePos="0" relativeHeight="251661312" behindDoc="0" locked="0" layoutInCell="1" allowOverlap="1" wp14:anchorId="218AD6A4" wp14:editId="1EF44B6C">
             <wp:simplePos x="0" y="0"/>
             <wp:positionH relativeFrom="column">
-              <wp:posOffset>3581400</wp:posOffset>
+              <wp:posOffset>3371850</wp:posOffset>
             </wp:positionH>
             <wp:positionV relativeFrom="paragraph">
               <wp:posOffset>285750</wp:posOffset>
@@ -79,7 +79,7 @@
     </w:p>
     <w:p>
       <w:pPr>
-        <w:jc w:val="center"/>
+        <w:ind w:left="2160" w:firstLine="720"/>
         <w:rPr>
           <w:rStyle w:val="Knyvcme"/>
           <w:rFonts w:ascii="Times New Roman" w:hAnsi="Times New Roman" w:cs="Times New Roman"/>
@@ -88,6 +88,7 @@
           <w:lang w:val="hu-HU"/>
         </w:rPr>
       </w:pPr>
+      <w:proofErr w:type="spellStart"/>
       <w:r>
         <w:rPr>
           <w:rStyle w:val="Knyvcme"/>
@@ -98,6 +99,7 @@
         </w:rPr>
         <w:t>Raktárpro</w:t>
       </w:r>
+      <w:proofErr w:type="spellEnd"/>
     </w:p>
     <w:p>
       <w:pPr>
@@ -233,7 +235,28 @@
           <w:lang w:val="hu-HU"/>
         </w:rPr>
         <w:br/>
-        <w:t>Trubics Gorán – backend fejlesztő</w:t>
+      </w:r>
+      <w:proofErr w:type="spellStart"/>
+      <w:r>
+        <w:rPr>
+          <w:rStyle w:val="Knyvcme"/>
+          <w:rFonts w:ascii="Times New Roman" w:hAnsi="Times New Roman" w:cs="Times New Roman"/>
+          <w:sz w:val="52"/>
+          <w:szCs w:val="52"/>
+          <w:lang w:val="hu-HU"/>
+        </w:rPr>
+        <w:t>Trubics</w:t>
+      </w:r>
+      <w:proofErr w:type="spellEnd"/>
+      <w:r>
+        <w:rPr>
+          <w:rStyle w:val="Knyvcme"/>
+          <w:rFonts w:ascii="Times New Roman" w:hAnsi="Times New Roman" w:cs="Times New Roman"/>
+          <w:sz w:val="52"/>
+          <w:szCs w:val="52"/>
+          <w:lang w:val="hu-HU"/>
+        </w:rPr>
+        <w:t xml:space="preserve"> Gorán – backend fejlesztő</w:t>
       </w:r>
     </w:p>
     <w:p>
@@ -5296,9 +5319,17 @@
         <w:rPr>
           <w:szCs w:val="32"/>
         </w:rPr>
-        <w:t>1. Bevezetés</w:t>
+        <w:t xml:space="preserve">1. </w:t>
+      </w:r>
+      <w:proofErr w:type="spellStart"/>
+      <w:r>
+        <w:rPr>
+          <w:szCs w:val="32"/>
+        </w:rPr>
+        <w:t>Bevezetés</w:t>
       </w:r>
       <w:bookmarkEnd w:id="0"/>
+      <w:proofErr w:type="spellEnd"/>
     </w:p>
     <w:p>
       <w:pPr>
@@ -5351,12 +5382,10 @@
           <w:szCs w:val="28"/>
           <w:lang w:val="hu-HU"/>
         </w:rPr>
-        <w:t>A RaktárPro egy komplex, több rétegből felépülő webalkalmazás, amelynek célja egy modern, skálázható és felhasználóközpontú rendszer létrehozása volt. A projekt egy három fős fejlesztői csapat együttműködésében valósult meg, ahol a különböző szakterületek – frontend, backend és adatbázis-kezelés – egymásra épülve alkották a teljes rendszert.</w:t>
-      </w:r>
-    </w:p>
-    <w:p>
-      <w:pPr>
-        <w:spacing w:before="0"/>
+        <w:t xml:space="preserve">A </w:t>
+      </w:r>
+      <w:proofErr w:type="spellStart"/>
+      <w:r>
         <w:rPr>
           <w:rFonts w:ascii="Times New Roman" w:eastAsiaTheme="majorEastAsia" w:hAnsi="Times New Roman" w:cs="Times New Roman"/>
           <w:color w:val="000000" w:themeColor="text1"/>
@@ -5366,7 +5395,9 @@
           <w:szCs w:val="28"/>
           <w:lang w:val="hu-HU"/>
         </w:rPr>
-      </w:pPr>
+        <w:t>RaktárPro</w:t>
+      </w:r>
+      <w:proofErr w:type="spellEnd"/>
       <w:r>
         <w:rPr>
           <w:rFonts w:ascii="Times New Roman" w:eastAsiaTheme="majorEastAsia" w:hAnsi="Times New Roman" w:cs="Times New Roman"/>
@@ -5377,7 +5408,85 @@
           <w:szCs w:val="28"/>
           <w:lang w:val="hu-HU"/>
         </w:rPr>
-        <w:t>A fejlesztés során kiemelt szerepet kapott a strukturált tervezés és a fokozatos felépítés. A rendszer nem egy egyszerű statikus weboldal, hanem egy dinamikus, adatvezérelt alkalmazás, amely képes valós idejű adatkezelésre, felhasználói autentikációra, valamint komplex üzleti logika kiszolgálására.</w:t>
+        <w:t xml:space="preserve"> egy komplex, több rétegből felépülő webalkalmazás, amelynek célja egy modern, skálázható és felhasználóközpontú rendszer létrehozása volt. A projekt egy három fős fejlesztői csapat együttműködésében valósult meg, ahol a különböző szakterületek – frontend, backend és adatbázis-kezelés – egymásra épülve alkották a teljes rendszert.</w:t>
+      </w:r>
+    </w:p>
+    <w:p>
+      <w:pPr>
+        <w:spacing w:before="0"/>
+        <w:rPr>
+          <w:rFonts w:ascii="Times New Roman" w:eastAsiaTheme="majorEastAsia" w:hAnsi="Times New Roman" w:cs="Times New Roman"/>
+          <w:color w:val="000000" w:themeColor="text1"/>
+          <w:spacing w:val="5"/>
+          <w:kern w:val="28"/>
+          <w:sz w:val="28"/>
+          <w:szCs w:val="28"/>
+          <w:lang w:val="hu-HU"/>
+        </w:rPr>
+      </w:pPr>
+      <w:r>
+        <w:rPr>
+          <w:rFonts w:ascii="Times New Roman" w:eastAsiaTheme="majorEastAsia" w:hAnsi="Times New Roman" w:cs="Times New Roman"/>
+          <w:color w:val="000000" w:themeColor="text1"/>
+          <w:spacing w:val="5"/>
+          <w:kern w:val="28"/>
+          <w:sz w:val="28"/>
+          <w:szCs w:val="28"/>
+          <w:lang w:val="hu-HU"/>
+        </w:rPr>
+        <w:t xml:space="preserve">A fejlesztés során kiemelt szerepet kapott a strukturált tervezés és a fokozatos felépítés. A rendszer nem egy egyszerű statikus weboldal, hanem egy dinamikus, </w:t>
+      </w:r>
+      <w:proofErr w:type="spellStart"/>
+      <w:r>
+        <w:rPr>
+          <w:rFonts w:ascii="Times New Roman" w:eastAsiaTheme="majorEastAsia" w:hAnsi="Times New Roman" w:cs="Times New Roman"/>
+          <w:color w:val="000000" w:themeColor="text1"/>
+          <w:spacing w:val="5"/>
+          <w:kern w:val="28"/>
+          <w:sz w:val="28"/>
+          <w:szCs w:val="28"/>
+          <w:lang w:val="hu-HU"/>
+        </w:rPr>
+        <w:t>adatvezérelt</w:t>
+      </w:r>
+      <w:proofErr w:type="spellEnd"/>
+      <w:r>
+        <w:rPr>
+          <w:rFonts w:ascii="Times New Roman" w:eastAsiaTheme="majorEastAsia" w:hAnsi="Times New Roman" w:cs="Times New Roman"/>
+          <w:color w:val="000000" w:themeColor="text1"/>
+          <w:spacing w:val="5"/>
+          <w:kern w:val="28"/>
+          <w:sz w:val="28"/>
+          <w:szCs w:val="28"/>
+          <w:lang w:val="hu-HU"/>
+        </w:rPr>
+        <w:t xml:space="preserve"> alkalmazás, amely képes valós idejű adatkezelésre, felhasználói </w:t>
+      </w:r>
+      <w:proofErr w:type="spellStart"/>
+      <w:r>
+        <w:rPr>
+          <w:rFonts w:ascii="Times New Roman" w:eastAsiaTheme="majorEastAsia" w:hAnsi="Times New Roman" w:cs="Times New Roman"/>
+          <w:color w:val="000000" w:themeColor="text1"/>
+          <w:spacing w:val="5"/>
+          <w:kern w:val="28"/>
+          <w:sz w:val="28"/>
+          <w:szCs w:val="28"/>
+          <w:lang w:val="hu-HU"/>
+        </w:rPr>
+        <w:t>autentikációra</w:t>
+      </w:r>
+      <w:proofErr w:type="spellEnd"/>
+      <w:r>
+        <w:rPr>
+          <w:rFonts w:ascii="Times New Roman" w:eastAsiaTheme="majorEastAsia" w:hAnsi="Times New Roman" w:cs="Times New Roman"/>
+          <w:color w:val="000000" w:themeColor="text1"/>
+          <w:spacing w:val="5"/>
+          <w:kern w:val="28"/>
+          <w:sz w:val="28"/>
+          <w:szCs w:val="28"/>
+          <w:lang w:val="hu-HU"/>
+        </w:rPr>
+        <w:t>, valamint komplex üzleti logika kiszolgálására.</w:t>
       </w:r>
     </w:p>
     <w:p>
@@ -5658,9 +5767,17 @@
         <w:rPr>
           <w:szCs w:val="32"/>
         </w:rPr>
-        <w:t>2. Projekt célja</w:t>
+        <w:t xml:space="preserve">2. Projekt </w:t>
+      </w:r>
+      <w:proofErr w:type="spellStart"/>
+      <w:r>
+        <w:rPr>
+          <w:szCs w:val="32"/>
+        </w:rPr>
+        <w:t>célja</w:t>
       </w:r>
       <w:bookmarkEnd w:id="1"/>
+      <w:proofErr w:type="spellEnd"/>
     </w:p>
     <w:p>
       <w:pPr>
@@ -5699,12 +5816,10 @@
           <w:szCs w:val="28"/>
           <w:lang w:val="hu-HU"/>
         </w:rPr>
-        <w:t>A RaktárPro projekt elsődleges célja egy olyan webes rendszer létrehozása volt, amely képes kezelni egy komplex termék- és rendeléskezelési környezetet. A fejlesztés során különös hangsúlyt kapott a megbízhatóság, az adatkezelés pontossága, valamint a felhasználói élmény optimalizálása.</w:t>
-      </w:r>
-    </w:p>
-    <w:p>
-      <w:pPr>
-        <w:spacing w:before="0"/>
+        <w:t xml:space="preserve">A </w:t>
+      </w:r>
+      <w:proofErr w:type="spellStart"/>
+      <w:r>
         <w:rPr>
           <w:rFonts w:ascii="Times New Roman" w:eastAsiaTheme="majorEastAsia" w:hAnsi="Times New Roman" w:cs="Times New Roman"/>
           <w:color w:val="000000" w:themeColor="text1"/>
@@ -5714,7 +5829,9 @@
           <w:szCs w:val="28"/>
           <w:lang w:val="hu-HU"/>
         </w:rPr>
-      </w:pPr>
+        <w:t>RaktárPro</w:t>
+      </w:r>
+      <w:proofErr w:type="spellEnd"/>
       <w:r>
         <w:rPr>
           <w:rFonts w:ascii="Times New Roman" w:eastAsiaTheme="majorEastAsia" w:hAnsi="Times New Roman" w:cs="Times New Roman"/>
@@ -5725,7 +5842,59 @@
           <w:szCs w:val="28"/>
           <w:lang w:val="hu-HU"/>
         </w:rPr>
-        <w:t>A rendszer célja nem csupán az volt, hogy adatokat jelenítsen meg, hanem hogy egy olyan integrált platformként működjön, amely:</w:t>
+        <w:t xml:space="preserve"> projekt elsődleges célja egy olyan webes rendszer létrehozása volt, amely képes kezelni egy komplex termék- és rendeléskezelési környezetet. A fejlesztés során különös hangsúlyt kapott a megbízhatóság, az adatkezelés pontossága, valamint a felhasználói élmény optimalizálása.</w:t>
+      </w:r>
+    </w:p>
+    <w:p>
+      <w:pPr>
+        <w:spacing w:before="0"/>
+        <w:rPr>
+          <w:rFonts w:ascii="Times New Roman" w:eastAsiaTheme="majorEastAsia" w:hAnsi="Times New Roman" w:cs="Times New Roman"/>
+          <w:color w:val="000000" w:themeColor="text1"/>
+          <w:spacing w:val="5"/>
+          <w:kern w:val="28"/>
+          <w:sz w:val="28"/>
+          <w:szCs w:val="28"/>
+          <w:lang w:val="hu-HU"/>
+        </w:rPr>
+      </w:pPr>
+      <w:r>
+        <w:rPr>
+          <w:rFonts w:ascii="Times New Roman" w:eastAsiaTheme="majorEastAsia" w:hAnsi="Times New Roman" w:cs="Times New Roman"/>
+          <w:color w:val="000000" w:themeColor="text1"/>
+          <w:spacing w:val="5"/>
+          <w:kern w:val="28"/>
+          <w:sz w:val="28"/>
+          <w:szCs w:val="28"/>
+          <w:lang w:val="hu-HU"/>
+        </w:rPr>
+        <w:t xml:space="preserve">A rendszer célja nem csupán az volt, hogy adatokat jelenítsen meg, hanem hogy egy olyan integrált platformként </w:t>
+      </w:r>
+      <w:proofErr w:type="spellStart"/>
+      <w:r>
+        <w:rPr>
+          <w:rFonts w:ascii="Times New Roman" w:eastAsiaTheme="majorEastAsia" w:hAnsi="Times New Roman" w:cs="Times New Roman"/>
+          <w:color w:val="000000" w:themeColor="text1"/>
+          <w:spacing w:val="5"/>
+          <w:kern w:val="28"/>
+          <w:sz w:val="28"/>
+          <w:szCs w:val="28"/>
+          <w:lang w:val="hu-HU"/>
+        </w:rPr>
+        <w:t>működjön</w:t>
+      </w:r>
+      <w:proofErr w:type="spellEnd"/>
+      <w:r>
+        <w:rPr>
+          <w:rFonts w:ascii="Times New Roman" w:eastAsiaTheme="majorEastAsia" w:hAnsi="Times New Roman" w:cs="Times New Roman"/>
+          <w:color w:val="000000" w:themeColor="text1"/>
+          <w:spacing w:val="5"/>
+          <w:kern w:val="28"/>
+          <w:sz w:val="28"/>
+          <w:szCs w:val="28"/>
+          <w:lang w:val="hu-HU"/>
+        </w:rPr>
+        <w:t>, amely:</w:t>
       </w:r>
     </w:p>
     <w:p>
@@ -5961,7 +6130,33 @@
           <w:szCs w:val="28"/>
           <w:lang w:val="hu-HU"/>
         </w:rPr>
-        <w:t xml:space="preserve">a gyors és megbízható adatlekérdezést, </w:t>
+        <w:t xml:space="preserve">a gyors és megbízható </w:t>
+      </w:r>
+      <w:proofErr w:type="spellStart"/>
+      <w:r>
+        <w:rPr>
+          <w:rFonts w:ascii="Times New Roman" w:eastAsiaTheme="majorEastAsia" w:hAnsi="Times New Roman" w:cs="Times New Roman"/>
+          <w:color w:val="000000" w:themeColor="text1"/>
+          <w:spacing w:val="5"/>
+          <w:kern w:val="28"/>
+          <w:sz w:val="28"/>
+          <w:szCs w:val="28"/>
+          <w:lang w:val="hu-HU"/>
+        </w:rPr>
+        <w:t>adatlekérdezést</w:t>
+      </w:r>
+      <w:proofErr w:type="spellEnd"/>
+      <w:r>
+        <w:rPr>
+          <w:rFonts w:ascii="Times New Roman" w:eastAsiaTheme="majorEastAsia" w:hAnsi="Times New Roman" w:cs="Times New Roman"/>
+          <w:color w:val="000000" w:themeColor="text1"/>
+          <w:spacing w:val="5"/>
+          <w:kern w:val="28"/>
+          <w:sz w:val="28"/>
+          <w:szCs w:val="28"/>
+          <w:lang w:val="hu-HU"/>
+        </w:rPr>
+        <w:t xml:space="preserve">, </w:t>
       </w:r>
     </w:p>
     <w:p>
@@ -5991,7 +6186,33 @@
           <w:szCs w:val="28"/>
           <w:lang w:val="hu-HU"/>
         </w:rPr>
-        <w:t xml:space="preserve">valamint a biztonságos autentikációs mechanizmusokat. </w:t>
+        <w:t xml:space="preserve">valamint a biztonságos </w:t>
+      </w:r>
+      <w:proofErr w:type="spellStart"/>
+      <w:r>
+        <w:rPr>
+          <w:rFonts w:ascii="Times New Roman" w:eastAsiaTheme="majorEastAsia" w:hAnsi="Times New Roman" w:cs="Times New Roman"/>
+          <w:color w:val="000000" w:themeColor="text1"/>
+          <w:spacing w:val="5"/>
+          <w:kern w:val="28"/>
+          <w:sz w:val="28"/>
+          <w:szCs w:val="28"/>
+          <w:lang w:val="hu-HU"/>
+        </w:rPr>
+        <w:t>autentikációs</w:t>
+      </w:r>
+      <w:proofErr w:type="spellEnd"/>
+      <w:r>
+        <w:rPr>
+          <w:rFonts w:ascii="Times New Roman" w:eastAsiaTheme="majorEastAsia" w:hAnsi="Times New Roman" w:cs="Times New Roman"/>
+          <w:color w:val="000000" w:themeColor="text1"/>
+          <w:spacing w:val="5"/>
+          <w:kern w:val="28"/>
+          <w:sz w:val="28"/>
+          <w:szCs w:val="28"/>
+          <w:lang w:val="hu-HU"/>
+        </w:rPr>
+        <w:t xml:space="preserve"> mechanizmusokat. </w:t>
       </w:r>
     </w:p>
     <w:p>
@@ -6114,9 +6335,31 @@
         <w:rPr>
           <w:szCs w:val="32"/>
         </w:rPr>
-        <w:t>3. Fejlesztési folyamat</w:t>
+        <w:t xml:space="preserve">3. </w:t>
+      </w:r>
+      <w:proofErr w:type="spellStart"/>
+      <w:r>
+        <w:rPr>
+          <w:szCs w:val="32"/>
+        </w:rPr>
+        <w:t>Fejlesztési</w:t>
+      </w:r>
+      <w:proofErr w:type="spellEnd"/>
+      <w:r>
+        <w:rPr>
+          <w:szCs w:val="32"/>
+        </w:rPr>
+        <w:t xml:space="preserve"> </w:t>
+      </w:r>
+      <w:proofErr w:type="spellStart"/>
+      <w:r>
+        <w:rPr>
+          <w:szCs w:val="32"/>
+        </w:rPr>
+        <w:t>folyamat</w:t>
       </w:r>
       <w:bookmarkEnd w:id="2"/>
+      <w:proofErr w:type="spellEnd"/>
     </w:p>
     <w:p>
       <w:pPr>
@@ -6155,7 +6398,33 @@
           <w:szCs w:val="28"/>
           <w:lang w:val="hu-HU"/>
         </w:rPr>
-        <w:t>A RaktárPro fejlesztése strukturált, több lépésből álló folyamatként valósult meg, amely során a csapat tagjai meghatározott szerepkörök mentén dolgoztak együtt.</w:t>
+        <w:t xml:space="preserve">A </w:t>
+      </w:r>
+      <w:proofErr w:type="spellStart"/>
+      <w:r>
+        <w:rPr>
+          <w:rFonts w:ascii="Times New Roman" w:eastAsiaTheme="majorEastAsia" w:hAnsi="Times New Roman" w:cs="Times New Roman"/>
+          <w:color w:val="000000" w:themeColor="text1"/>
+          <w:spacing w:val="5"/>
+          <w:kern w:val="28"/>
+          <w:sz w:val="28"/>
+          <w:szCs w:val="28"/>
+          <w:lang w:val="hu-HU"/>
+        </w:rPr>
+        <w:t>RaktárPro</w:t>
+      </w:r>
+      <w:proofErr w:type="spellEnd"/>
+      <w:r>
+        <w:rPr>
+          <w:rFonts w:ascii="Times New Roman" w:eastAsiaTheme="majorEastAsia" w:hAnsi="Times New Roman" w:cs="Times New Roman"/>
+          <w:color w:val="000000" w:themeColor="text1"/>
+          <w:spacing w:val="5"/>
+          <w:kern w:val="28"/>
+          <w:sz w:val="28"/>
+          <w:szCs w:val="28"/>
+          <w:lang w:val="hu-HU"/>
+        </w:rPr>
+        <w:t xml:space="preserve"> fejlesztése strukturált, több lépésből álló folyamatként valósult meg, amely során a csapat tagjai meghatározott szerepkörök mentén dolgoztak együtt.</w:t>
       </w:r>
     </w:p>
     <w:p>
@@ -6307,6 +6576,7 @@
           <w:lang w:val="hu-HU"/>
         </w:rPr>
       </w:pPr>
+      <w:proofErr w:type="spellStart"/>
       <w:r>
         <w:rPr>
           <w:rFonts w:ascii="Times New Roman" w:eastAsiaTheme="majorEastAsia" w:hAnsi="Times New Roman" w:cs="Times New Roman"/>
@@ -6317,8 +6587,9 @@
           <w:szCs w:val="28"/>
           <w:lang w:val="hu-HU"/>
         </w:rPr>
-        <w:t>Trubics Gorán – backend fejlesztő</w:t>
-      </w:r>
+        <w:t>Trubics</w:t>
+      </w:r>
+      <w:proofErr w:type="spellEnd"/>
       <w:r>
         <w:rPr>
           <w:rFonts w:ascii="Times New Roman" w:eastAsiaTheme="majorEastAsia" w:hAnsi="Times New Roman" w:cs="Times New Roman"/>
@@ -6329,8 +6600,46 @@
           <w:szCs w:val="28"/>
           <w:lang w:val="hu-HU"/>
         </w:rPr>
+        <w:t xml:space="preserve"> Gorán – backend fejlesztő</w:t>
+      </w:r>
+      <w:r>
+        <w:rPr>
+          <w:rFonts w:ascii="Times New Roman" w:eastAsiaTheme="majorEastAsia" w:hAnsi="Times New Roman" w:cs="Times New Roman"/>
+          <w:color w:val="000000" w:themeColor="text1"/>
+          <w:spacing w:val="5"/>
+          <w:kern w:val="28"/>
+          <w:sz w:val="28"/>
+          <w:szCs w:val="28"/>
+          <w:lang w:val="hu-HU"/>
+        </w:rPr>
         <w:br/>
-        <w:t xml:space="preserve">Feladata a backend logika megvalósítása volt, beleértve az API kialakítását, az adatbázis és frontend közötti kommunikáció biztosítását, valamint az autentikáció kezelését. </w:t>
+        <w:t xml:space="preserve">Feladata a backend logika megvalósítása volt, beleértve az API kialakítását, az adatbázis és frontend közötti kommunikáció biztosítását, valamint az </w:t>
+      </w:r>
+      <w:proofErr w:type="spellStart"/>
+      <w:r>
+        <w:rPr>
+          <w:rFonts w:ascii="Times New Roman" w:eastAsiaTheme="majorEastAsia" w:hAnsi="Times New Roman" w:cs="Times New Roman"/>
+          <w:color w:val="000000" w:themeColor="text1"/>
+          <w:spacing w:val="5"/>
+          <w:kern w:val="28"/>
+          <w:sz w:val="28"/>
+          <w:szCs w:val="28"/>
+          <w:lang w:val="hu-HU"/>
+        </w:rPr>
+        <w:t>autentikáció</w:t>
+      </w:r>
+      <w:proofErr w:type="spellEnd"/>
+      <w:r>
+        <w:rPr>
+          <w:rFonts w:ascii="Times New Roman" w:eastAsiaTheme="majorEastAsia" w:hAnsi="Times New Roman" w:cs="Times New Roman"/>
+          <w:color w:val="000000" w:themeColor="text1"/>
+          <w:spacing w:val="5"/>
+          <w:kern w:val="28"/>
+          <w:sz w:val="28"/>
+          <w:szCs w:val="28"/>
+          <w:lang w:val="hu-HU"/>
+        </w:rPr>
+        <w:t xml:space="preserve"> kezelését. </w:t>
       </w:r>
     </w:p>
     <w:p>
@@ -6422,7 +6731,25 @@
           <w:szCs w:val="28"/>
           <w:lang w:val="hu-HU"/>
         </w:rPr>
-        <w:t>Tervezés – Figma design</w:t>
+        <w:t xml:space="preserve">Tervezés – </w:t>
+      </w:r>
+      <w:proofErr w:type="spellStart"/>
+      <w:r>
+        <w:rPr>
+          <w:bCs/>
+          <w:szCs w:val="28"/>
+          <w:lang w:val="hu-HU"/>
+        </w:rPr>
+        <w:t>Figma</w:t>
+      </w:r>
+      <w:proofErr w:type="spellEnd"/>
+      <w:r>
+        <w:rPr>
+          <w:bCs/>
+          <w:szCs w:val="28"/>
+          <w:lang w:val="hu-HU"/>
+        </w:rPr>
+        <w:t xml:space="preserve"> design</w:t>
       </w:r>
       <w:bookmarkEnd w:id="5"/>
     </w:p>
@@ -6449,7 +6776,33 @@
           <w:szCs w:val="28"/>
           <w:lang w:val="hu-HU"/>
         </w:rPr>
-        <w:t>A fejlesztés első lépése a felhasználói felület megtervezése volt. A csapat közösen dolgozott a Figma designon, amely biztosította, hogy minden résztvevő egy egységes vizuális koncepció alapján dolgozzon.</w:t>
+        <w:t xml:space="preserve">A fejlesztés első lépése a felhasználói felület megtervezése volt. A csapat közösen dolgozott a </w:t>
+      </w:r>
+      <w:proofErr w:type="spellStart"/>
+      <w:r>
+        <w:rPr>
+          <w:rFonts w:ascii="Times New Roman" w:eastAsiaTheme="majorEastAsia" w:hAnsi="Times New Roman" w:cs="Times New Roman"/>
+          <w:color w:val="000000" w:themeColor="text1"/>
+          <w:spacing w:val="5"/>
+          <w:kern w:val="28"/>
+          <w:sz w:val="28"/>
+          <w:szCs w:val="28"/>
+          <w:lang w:val="hu-HU"/>
+        </w:rPr>
+        <w:t>Figma</w:t>
+      </w:r>
+      <w:proofErr w:type="spellEnd"/>
+      <w:r>
+        <w:rPr>
+          <w:rFonts w:ascii="Times New Roman" w:eastAsiaTheme="majorEastAsia" w:hAnsi="Times New Roman" w:cs="Times New Roman"/>
+          <w:color w:val="000000" w:themeColor="text1"/>
+          <w:spacing w:val="5"/>
+          <w:kern w:val="28"/>
+          <w:sz w:val="28"/>
+          <w:szCs w:val="28"/>
+          <w:lang w:val="hu-HU"/>
+        </w:rPr>
+        <w:t xml:space="preserve"> designon, amely biztosította, hogy minden résztvevő egy egységes vizuális koncepció alapján dolgozzon.</w:t>
       </w:r>
       <w:r>
         <w:rPr>
@@ -6784,6 +7137,7 @@
           <w:lang w:val="hu-HU"/>
         </w:rPr>
       </w:pPr>
+      <w:proofErr w:type="spellStart"/>
       <w:r>
         <w:rPr>
           <w:rFonts w:ascii="Times New Roman" w:eastAsiaTheme="majorEastAsia" w:hAnsi="Times New Roman" w:cs="Times New Roman"/>
@@ -6794,7 +7148,20 @@
           <w:szCs w:val="28"/>
           <w:lang w:val="hu-HU"/>
         </w:rPr>
-        <w:t xml:space="preserve">Jira – feladatkezelés és sprint alapú fejlesztés </w:t>
+        <w:t>Jira</w:t>
+      </w:r>
+      <w:proofErr w:type="spellEnd"/>
+      <w:r>
+        <w:rPr>
+          <w:rFonts w:ascii="Times New Roman" w:eastAsiaTheme="majorEastAsia" w:hAnsi="Times New Roman" w:cs="Times New Roman"/>
+          <w:color w:val="000000" w:themeColor="text1"/>
+          <w:spacing w:val="5"/>
+          <w:kern w:val="28"/>
+          <w:sz w:val="28"/>
+          <w:szCs w:val="28"/>
+          <w:lang w:val="hu-HU"/>
+        </w:rPr>
+        <w:t xml:space="preserve"> – feladatkezelés és sprint alapú fejlesztés </w:t>
       </w:r>
     </w:p>
     <w:p>
@@ -6814,6 +7181,7 @@
           <w:lang w:val="hu-HU"/>
         </w:rPr>
       </w:pPr>
+      <w:proofErr w:type="spellStart"/>
       <w:r>
         <w:rPr>
           <w:rFonts w:ascii="Times New Roman" w:eastAsiaTheme="majorEastAsia" w:hAnsi="Times New Roman" w:cs="Times New Roman"/>
@@ -6824,7 +7192,20 @@
           <w:szCs w:val="28"/>
           <w:lang w:val="hu-HU"/>
         </w:rPr>
-        <w:t xml:space="preserve">Git – verziókezelés és csapatmunka támogatása </w:t>
+        <w:t>Git</w:t>
+      </w:r>
+      <w:proofErr w:type="spellEnd"/>
+      <w:r>
+        <w:rPr>
+          <w:rFonts w:ascii="Times New Roman" w:eastAsiaTheme="majorEastAsia" w:hAnsi="Times New Roman" w:cs="Times New Roman"/>
+          <w:color w:val="000000" w:themeColor="text1"/>
+          <w:spacing w:val="5"/>
+          <w:kern w:val="28"/>
+          <w:sz w:val="28"/>
+          <w:szCs w:val="28"/>
+          <w:lang w:val="hu-HU"/>
+        </w:rPr>
+        <w:t xml:space="preserve"> – verziókezelés és csapatmunka támogatása </w:t>
       </w:r>
     </w:p>
     <w:p>
@@ -6844,6 +7225,7 @@
           <w:lang w:val="hu-HU"/>
         </w:rPr>
       </w:pPr>
+      <w:proofErr w:type="spellStart"/>
       <w:r>
         <w:rPr>
           <w:rFonts w:ascii="Times New Roman" w:eastAsiaTheme="majorEastAsia" w:hAnsi="Times New Roman" w:cs="Times New Roman"/>
@@ -6854,7 +7236,20 @@
           <w:szCs w:val="28"/>
           <w:lang w:val="hu-HU"/>
         </w:rPr>
-        <w:t xml:space="preserve">Figma – UI/UX tervezés </w:t>
+        <w:t>Figma</w:t>
+      </w:r>
+      <w:proofErr w:type="spellEnd"/>
+      <w:r>
+        <w:rPr>
+          <w:rFonts w:ascii="Times New Roman" w:eastAsiaTheme="majorEastAsia" w:hAnsi="Times New Roman" w:cs="Times New Roman"/>
+          <w:color w:val="000000" w:themeColor="text1"/>
+          <w:spacing w:val="5"/>
+          <w:kern w:val="28"/>
+          <w:sz w:val="28"/>
+          <w:szCs w:val="28"/>
+          <w:lang w:val="hu-HU"/>
+        </w:rPr>
+        <w:t xml:space="preserve"> – UI/UX tervezés </w:t>
       </w:r>
     </w:p>
     <w:p>
@@ -7128,7 +7523,33 @@
           <w:szCs w:val="28"/>
           <w:lang w:val="hu-HU"/>
         </w:rPr>
-        <w:t>A backend réteg kialakítása során Trubics Gorán implementálta azokat az API végpontokat, amelyek biztosítják a frontend és az adatbázis közötti kommunikációt.</w:t>
+        <w:t xml:space="preserve">A backend réteg kialakítása során </w:t>
+      </w:r>
+      <w:proofErr w:type="spellStart"/>
+      <w:r>
+        <w:rPr>
+          <w:rFonts w:ascii="Times New Roman" w:eastAsiaTheme="majorEastAsia" w:hAnsi="Times New Roman" w:cs="Times New Roman"/>
+          <w:color w:val="000000" w:themeColor="text1"/>
+          <w:spacing w:val="5"/>
+          <w:kern w:val="28"/>
+          <w:sz w:val="28"/>
+          <w:szCs w:val="28"/>
+          <w:lang w:val="hu-HU"/>
+        </w:rPr>
+        <w:t>Trubics</w:t>
+      </w:r>
+      <w:proofErr w:type="spellEnd"/>
+      <w:r>
+        <w:rPr>
+          <w:rFonts w:ascii="Times New Roman" w:eastAsiaTheme="majorEastAsia" w:hAnsi="Times New Roman" w:cs="Times New Roman"/>
+          <w:color w:val="000000" w:themeColor="text1"/>
+          <w:spacing w:val="5"/>
+          <w:kern w:val="28"/>
+          <w:sz w:val="28"/>
+          <w:szCs w:val="28"/>
+          <w:lang w:val="hu-HU"/>
+        </w:rPr>
+        <w:t xml:space="preserve"> Gorán implementálta azokat az API végpontokat, amelyek biztosítják a frontend és az adatbázis közötti kommunikációt.</w:t>
       </w:r>
     </w:p>
     <w:p>
@@ -7214,7 +7635,33 @@
           <w:szCs w:val="28"/>
           <w:lang w:val="hu-HU"/>
         </w:rPr>
-        <w:t xml:space="preserve">az adatok feldolgozása és validálása, </w:t>
+        <w:t xml:space="preserve">az adatok feldolgozása és </w:t>
+      </w:r>
+      <w:proofErr w:type="spellStart"/>
+      <w:r>
+        <w:rPr>
+          <w:rFonts w:ascii="Times New Roman" w:eastAsiaTheme="majorEastAsia" w:hAnsi="Times New Roman" w:cs="Times New Roman"/>
+          <w:color w:val="000000" w:themeColor="text1"/>
+          <w:spacing w:val="5"/>
+          <w:kern w:val="28"/>
+          <w:sz w:val="28"/>
+          <w:szCs w:val="28"/>
+          <w:lang w:val="hu-HU"/>
+        </w:rPr>
+        <w:t>validálása</w:t>
+      </w:r>
+      <w:proofErr w:type="spellEnd"/>
+      <w:r>
+        <w:rPr>
+          <w:rFonts w:ascii="Times New Roman" w:eastAsiaTheme="majorEastAsia" w:hAnsi="Times New Roman" w:cs="Times New Roman"/>
+          <w:color w:val="000000" w:themeColor="text1"/>
+          <w:spacing w:val="5"/>
+          <w:kern w:val="28"/>
+          <w:sz w:val="28"/>
+          <w:szCs w:val="28"/>
+          <w:lang w:val="hu-HU"/>
+        </w:rPr>
+        <w:t xml:space="preserve">, </w:t>
       </w:r>
     </w:p>
     <w:p>
@@ -7270,12 +7717,10 @@
           <w:szCs w:val="28"/>
           <w:lang w:val="hu-HU"/>
         </w:rPr>
-        <w:t>A rendszer működésének egyik kulcsfontosságú eleme az autentikáció, amely JWT tokenek segítségével valósul meg.</w:t>
-      </w:r>
-    </w:p>
-    <w:p>
-      <w:pPr>
-        <w:spacing w:before="0"/>
+        <w:t xml:space="preserve">A rendszer működésének egyik kulcsfontosságú eleme az </w:t>
+      </w:r>
+      <w:proofErr w:type="spellStart"/>
+      <w:r>
         <w:rPr>
           <w:rFonts w:ascii="Times New Roman" w:eastAsiaTheme="majorEastAsia" w:hAnsi="Times New Roman" w:cs="Times New Roman"/>
           <w:color w:val="000000" w:themeColor="text1"/>
@@ -7285,7 +7730,9 @@
           <w:szCs w:val="28"/>
           <w:lang w:val="hu-HU"/>
         </w:rPr>
-      </w:pPr>
+        <w:t>autentikáció</w:t>
+      </w:r>
+      <w:proofErr w:type="spellEnd"/>
       <w:r>
         <w:rPr>
           <w:rFonts w:ascii="Times New Roman" w:eastAsiaTheme="majorEastAsia" w:hAnsi="Times New Roman" w:cs="Times New Roman"/>
@@ -7296,7 +7743,85 @@
           <w:szCs w:val="28"/>
           <w:lang w:val="hu-HU"/>
         </w:rPr>
-        <w:t>Az autentikáció biztosítja:</w:t>
+        <w:t xml:space="preserve">, amely JWT </w:t>
+      </w:r>
+      <w:proofErr w:type="spellStart"/>
+      <w:r>
+        <w:rPr>
+          <w:rFonts w:ascii="Times New Roman" w:eastAsiaTheme="majorEastAsia" w:hAnsi="Times New Roman" w:cs="Times New Roman"/>
+          <w:color w:val="000000" w:themeColor="text1"/>
+          <w:spacing w:val="5"/>
+          <w:kern w:val="28"/>
+          <w:sz w:val="28"/>
+          <w:szCs w:val="28"/>
+          <w:lang w:val="hu-HU"/>
+        </w:rPr>
+        <w:t>tokenek</w:t>
+      </w:r>
+      <w:proofErr w:type="spellEnd"/>
+      <w:r>
+        <w:rPr>
+          <w:rFonts w:ascii="Times New Roman" w:eastAsiaTheme="majorEastAsia" w:hAnsi="Times New Roman" w:cs="Times New Roman"/>
+          <w:color w:val="000000" w:themeColor="text1"/>
+          <w:spacing w:val="5"/>
+          <w:kern w:val="28"/>
+          <w:sz w:val="28"/>
+          <w:szCs w:val="28"/>
+          <w:lang w:val="hu-HU"/>
+        </w:rPr>
+        <w:t xml:space="preserve"> segítségével valósul meg.</w:t>
+      </w:r>
+    </w:p>
+    <w:p>
+      <w:pPr>
+        <w:spacing w:before="0"/>
+        <w:rPr>
+          <w:rFonts w:ascii="Times New Roman" w:eastAsiaTheme="majorEastAsia" w:hAnsi="Times New Roman" w:cs="Times New Roman"/>
+          <w:color w:val="000000" w:themeColor="text1"/>
+          <w:spacing w:val="5"/>
+          <w:kern w:val="28"/>
+          <w:sz w:val="28"/>
+          <w:szCs w:val="28"/>
+          <w:lang w:val="hu-HU"/>
+        </w:rPr>
+      </w:pPr>
+      <w:r>
+        <w:rPr>
+          <w:rFonts w:ascii="Times New Roman" w:eastAsiaTheme="majorEastAsia" w:hAnsi="Times New Roman" w:cs="Times New Roman"/>
+          <w:color w:val="000000" w:themeColor="text1"/>
+          <w:spacing w:val="5"/>
+          <w:kern w:val="28"/>
+          <w:sz w:val="28"/>
+          <w:szCs w:val="28"/>
+          <w:lang w:val="hu-HU"/>
+        </w:rPr>
+        <w:t xml:space="preserve">Az </w:t>
+      </w:r>
+      <w:proofErr w:type="spellStart"/>
+      <w:r>
+        <w:rPr>
+          <w:rFonts w:ascii="Times New Roman" w:eastAsiaTheme="majorEastAsia" w:hAnsi="Times New Roman" w:cs="Times New Roman"/>
+          <w:color w:val="000000" w:themeColor="text1"/>
+          <w:spacing w:val="5"/>
+          <w:kern w:val="28"/>
+          <w:sz w:val="28"/>
+          <w:szCs w:val="28"/>
+          <w:lang w:val="hu-HU"/>
+        </w:rPr>
+        <w:t>autentikáció</w:t>
+      </w:r>
+      <w:proofErr w:type="spellEnd"/>
+      <w:r>
+        <w:rPr>
+          <w:rFonts w:ascii="Times New Roman" w:eastAsiaTheme="majorEastAsia" w:hAnsi="Times New Roman" w:cs="Times New Roman"/>
+          <w:color w:val="000000" w:themeColor="text1"/>
+          <w:spacing w:val="5"/>
+          <w:kern w:val="28"/>
+          <w:sz w:val="28"/>
+          <w:szCs w:val="28"/>
+          <w:lang w:val="hu-HU"/>
+        </w:rPr>
+        <w:t xml:space="preserve"> biztosítja:</w:t>
       </w:r>
     </w:p>
     <w:p>
@@ -8147,9 +8672,31 @@
         <w:rPr>
           <w:szCs w:val="32"/>
         </w:rPr>
-        <w:t>4. Rendszer architektúra</w:t>
+        <w:t xml:space="preserve">4. </w:t>
+      </w:r>
+      <w:proofErr w:type="spellStart"/>
+      <w:r>
+        <w:rPr>
+          <w:szCs w:val="32"/>
+        </w:rPr>
+        <w:t>Rendszer</w:t>
+      </w:r>
+      <w:proofErr w:type="spellEnd"/>
+      <w:r>
+        <w:rPr>
+          <w:szCs w:val="32"/>
+        </w:rPr>
+        <w:t xml:space="preserve"> </w:t>
+      </w:r>
+      <w:proofErr w:type="spellStart"/>
+      <w:r>
+        <w:rPr>
+          <w:szCs w:val="32"/>
+        </w:rPr>
+        <w:t>architektúra</w:t>
       </w:r>
       <w:bookmarkEnd w:id="13"/>
+      <w:proofErr w:type="spellEnd"/>
     </w:p>
     <w:p>
       <w:pPr>
@@ -8194,7 +8741,29 @@
           <w:szCs w:val="28"/>
           <w:lang w:val="hu-HU"/>
         </w:rPr>
-        <w:t>A RaktárPro rendszer egy klasszikus háromrétegű architektúrára épül, amely a modern webalkalmazások egyik legelterjedtebb és legmegbízhatóbb felépítési módja. Ez a struktúra lehetővé teszi az egyes komponensek elkülönítését, ezáltal növeli a rendszer átláthatóságát, karbantarthatóságát és bővíthetőségét.</w:t>
+        <w:t xml:space="preserve">A </w:t>
+      </w:r>
+      <w:proofErr w:type="spellStart"/>
+      <w:r>
+        <w:rPr>
+          <w:rFonts w:ascii="Times New Roman" w:hAnsi="Times New Roman" w:cs="Times New Roman"/>
+          <w:color w:val="000000" w:themeColor="text1"/>
+          <w:sz w:val="28"/>
+          <w:szCs w:val="28"/>
+          <w:lang w:val="hu-HU"/>
+        </w:rPr>
+        <w:t>RaktárPro</w:t>
+      </w:r>
+      <w:proofErr w:type="spellEnd"/>
+      <w:r>
+        <w:rPr>
+          <w:rFonts w:ascii="Times New Roman" w:hAnsi="Times New Roman" w:cs="Times New Roman"/>
+          <w:color w:val="000000" w:themeColor="text1"/>
+          <w:sz w:val="28"/>
+          <w:szCs w:val="28"/>
+          <w:lang w:val="hu-HU"/>
+        </w:rPr>
+        <w:t xml:space="preserve"> rendszer egy klasszikus háromrétegű architektúrára épül, amely a modern webalkalmazások egyik legelterjedtebb és legmegbízhatóbb felépítési módja. Ez a struktúra lehetővé teszi az egyes komponensek elkülönítését, ezáltal növeli a rendszer átláthatóságát, karbantarthatóságát és bővíthetőségét.</w:t>
       </w:r>
     </w:p>
     <w:p>
@@ -8552,7 +9121,29 @@
           <w:szCs w:val="28"/>
           <w:lang w:val="hu-HU"/>
         </w:rPr>
-        <w:t>A frontend működése során folyamatosan kommunikál a backend API-val, amely JSON formátumban szolgáltatja az adatokat. Ez biztosítja az egységes adatkezelést és a platformfüggetlen működést.</w:t>
+        <w:t>A frontend működése során folyamatosan kommunikál a backend API-</w:t>
+      </w:r>
+      <w:proofErr w:type="spellStart"/>
+      <w:r>
+        <w:rPr>
+          <w:rFonts w:ascii="Times New Roman" w:hAnsi="Times New Roman" w:cs="Times New Roman"/>
+          <w:color w:val="000000" w:themeColor="text1"/>
+          <w:sz w:val="28"/>
+          <w:szCs w:val="28"/>
+          <w:lang w:val="hu-HU"/>
+        </w:rPr>
+        <w:t>val</w:t>
+      </w:r>
+      <w:proofErr w:type="spellEnd"/>
+      <w:r>
+        <w:rPr>
+          <w:rFonts w:ascii="Times New Roman" w:hAnsi="Times New Roman" w:cs="Times New Roman"/>
+          <w:color w:val="000000" w:themeColor="text1"/>
+          <w:sz w:val="28"/>
+          <w:szCs w:val="28"/>
+          <w:lang w:val="hu-HU"/>
+        </w:rPr>
+        <w:t>, amely JSON formátumban szolgáltatja az adatokat. Ez biztosítja az egységes adatkezelést és a platformfüggetlen működést.</w:t>
       </w:r>
     </w:p>
     <w:p>
@@ -8691,7 +9282,29 @@
           <w:szCs w:val="28"/>
           <w:lang w:val="hu-HU"/>
         </w:rPr>
-        <w:t xml:space="preserve">adatok validálása, </w:t>
+        <w:t xml:space="preserve">adatok </w:t>
+      </w:r>
+      <w:proofErr w:type="spellStart"/>
+      <w:r>
+        <w:rPr>
+          <w:rFonts w:ascii="Times New Roman" w:hAnsi="Times New Roman" w:cs="Times New Roman"/>
+          <w:color w:val="000000" w:themeColor="text1"/>
+          <w:sz w:val="28"/>
+          <w:szCs w:val="28"/>
+          <w:lang w:val="hu-HU"/>
+        </w:rPr>
+        <w:t>validálása</w:t>
+      </w:r>
+      <w:proofErr w:type="spellEnd"/>
+      <w:r>
+        <w:rPr>
+          <w:rFonts w:ascii="Times New Roman" w:hAnsi="Times New Roman" w:cs="Times New Roman"/>
+          <w:color w:val="000000" w:themeColor="text1"/>
+          <w:sz w:val="28"/>
+          <w:szCs w:val="28"/>
+          <w:lang w:val="hu-HU"/>
+        </w:rPr>
+        <w:t xml:space="preserve">, </w:t>
       </w:r>
     </w:p>
     <w:p>
@@ -8861,15 +9474,27 @@
           <w:lang w:val="hu-HU"/>
         </w:rPr>
       </w:pPr>
-      <w:r>
-        <w:rPr>
-          <w:rFonts w:ascii="Times New Roman" w:hAnsi="Times New Roman" w:cs="Times New Roman"/>
-          <w:color w:val="000000" w:themeColor="text1"/>
-          <w:sz w:val="28"/>
-          <w:szCs w:val="28"/>
-          <w:lang w:val="hu-HU"/>
-        </w:rPr>
-        <w:t xml:space="preserve">terméklekérdezés, </w:t>
+      <w:proofErr w:type="spellStart"/>
+      <w:r>
+        <w:rPr>
+          <w:rFonts w:ascii="Times New Roman" w:hAnsi="Times New Roman" w:cs="Times New Roman"/>
+          <w:color w:val="000000" w:themeColor="text1"/>
+          <w:sz w:val="28"/>
+          <w:szCs w:val="28"/>
+          <w:lang w:val="hu-HU"/>
+        </w:rPr>
+        <w:t>terméklekérdezés</w:t>
+      </w:r>
+      <w:proofErr w:type="spellEnd"/>
+      <w:r>
+        <w:rPr>
+          <w:rFonts w:ascii="Times New Roman" w:hAnsi="Times New Roman" w:cs="Times New Roman"/>
+          <w:color w:val="000000" w:themeColor="text1"/>
+          <w:sz w:val="28"/>
+          <w:szCs w:val="28"/>
+          <w:lang w:val="hu-HU"/>
+        </w:rPr>
+        <w:t xml:space="preserve">, </w:t>
       </w:r>
     </w:p>
     <w:p>
@@ -8918,7 +9543,73 @@
           <w:lang w:val="hu-HU"/>
         </w:rPr>
         <w:lastRenderedPageBreak/>
-        <w:t>A backend egyik legfontosabb eleme az autentikációs rendszer, amely JWT tokenek segítségével működik. A sikeres bejelentkezést követően a rendszer egy egyedi tokent generál, amely a felhasználó azonosítására szolgál a további kérések során.</w:t>
+        <w:t xml:space="preserve">A backend egyik legfontosabb eleme az </w:t>
+      </w:r>
+      <w:proofErr w:type="spellStart"/>
+      <w:r>
+        <w:rPr>
+          <w:rFonts w:ascii="Times New Roman" w:hAnsi="Times New Roman" w:cs="Times New Roman"/>
+          <w:color w:val="000000" w:themeColor="text1"/>
+          <w:sz w:val="28"/>
+          <w:szCs w:val="28"/>
+          <w:lang w:val="hu-HU"/>
+        </w:rPr>
+        <w:t>autentikációs</w:t>
+      </w:r>
+      <w:proofErr w:type="spellEnd"/>
+      <w:r>
+        <w:rPr>
+          <w:rFonts w:ascii="Times New Roman" w:hAnsi="Times New Roman" w:cs="Times New Roman"/>
+          <w:color w:val="000000" w:themeColor="text1"/>
+          <w:sz w:val="28"/>
+          <w:szCs w:val="28"/>
+          <w:lang w:val="hu-HU"/>
+        </w:rPr>
+        <w:t xml:space="preserve"> rendszer, amely JWT </w:t>
+      </w:r>
+      <w:proofErr w:type="spellStart"/>
+      <w:r>
+        <w:rPr>
+          <w:rFonts w:ascii="Times New Roman" w:hAnsi="Times New Roman" w:cs="Times New Roman"/>
+          <w:color w:val="000000" w:themeColor="text1"/>
+          <w:sz w:val="28"/>
+          <w:szCs w:val="28"/>
+          <w:lang w:val="hu-HU"/>
+        </w:rPr>
+        <w:t>tokenek</w:t>
+      </w:r>
+      <w:proofErr w:type="spellEnd"/>
+      <w:r>
+        <w:rPr>
+          <w:rFonts w:ascii="Times New Roman" w:hAnsi="Times New Roman" w:cs="Times New Roman"/>
+          <w:color w:val="000000" w:themeColor="text1"/>
+          <w:sz w:val="28"/>
+          <w:szCs w:val="28"/>
+          <w:lang w:val="hu-HU"/>
+        </w:rPr>
+        <w:t xml:space="preserve"> segítségével működik. A sikeres bejelentkezést követően a rendszer egy egyedi </w:t>
+      </w:r>
+      <w:proofErr w:type="spellStart"/>
+      <w:r>
+        <w:rPr>
+          <w:rFonts w:ascii="Times New Roman" w:hAnsi="Times New Roman" w:cs="Times New Roman"/>
+          <w:color w:val="000000" w:themeColor="text1"/>
+          <w:sz w:val="28"/>
+          <w:szCs w:val="28"/>
+          <w:lang w:val="hu-HU"/>
+        </w:rPr>
+        <w:t>tokent</w:t>
+      </w:r>
+      <w:proofErr w:type="spellEnd"/>
+      <w:r>
+        <w:rPr>
+          <w:rFonts w:ascii="Times New Roman" w:hAnsi="Times New Roman" w:cs="Times New Roman"/>
+          <w:color w:val="000000" w:themeColor="text1"/>
+          <w:sz w:val="28"/>
+          <w:szCs w:val="28"/>
+          <w:lang w:val="hu-HU"/>
+        </w:rPr>
+        <w:t xml:space="preserve"> generál, amely a felhasználó azonosítására szolgál a további kérések során.</w:t>
       </w:r>
     </w:p>
     <w:p>
@@ -9541,15 +10232,31 @@
         <w:rPr>
           <w:szCs w:val="32"/>
         </w:rPr>
-        <w:t xml:space="preserve">5. Adatbázis </w:t>
-      </w:r>
+        <w:t xml:space="preserve">5. </w:t>
+      </w:r>
+      <w:proofErr w:type="spellStart"/>
       <w:r>
         <w:rPr>
           <w:szCs w:val="32"/>
         </w:rPr>
+        <w:t>Adatbázis</w:t>
+      </w:r>
+      <w:proofErr w:type="spellEnd"/>
+      <w:r>
+        <w:rPr>
+          <w:szCs w:val="32"/>
+        </w:rPr>
+        <w:t xml:space="preserve"> </w:t>
+      </w:r>
+      <w:proofErr w:type="spellStart"/>
+      <w:r>
+        <w:rPr>
+          <w:szCs w:val="32"/>
+        </w:rPr>
         <w:t>működése</w:t>
       </w:r>
       <w:bookmarkEnd w:id="18"/>
+      <w:proofErr w:type="spellEnd"/>
     </w:p>
     <w:p>
       <w:pPr>
@@ -9582,7 +10289,29 @@
           <w:szCs w:val="28"/>
           <w:lang w:val="hu-HU"/>
         </w:rPr>
-        <w:t>A RaktárPro rendszer egyik legfontosabb eleme az adatbázis, amely az alkalmazás teljes működésének alapját képezi. Az adatbázis relációs modellben került kialakításra, amely lehetővé teszi az adatok strukturált, konzisztens és hatékony kezelését.</w:t>
+        <w:t xml:space="preserve">A </w:t>
+      </w:r>
+      <w:proofErr w:type="spellStart"/>
+      <w:r>
+        <w:rPr>
+          <w:rFonts w:ascii="Times New Roman" w:hAnsi="Times New Roman" w:cs="Times New Roman"/>
+          <w:color w:val="000000" w:themeColor="text1"/>
+          <w:sz w:val="28"/>
+          <w:szCs w:val="28"/>
+          <w:lang w:val="hu-HU"/>
+        </w:rPr>
+        <w:t>RaktárPro</w:t>
+      </w:r>
+      <w:proofErr w:type="spellEnd"/>
+      <w:r>
+        <w:rPr>
+          <w:rFonts w:ascii="Times New Roman" w:hAnsi="Times New Roman" w:cs="Times New Roman"/>
+          <w:color w:val="000000" w:themeColor="text1"/>
+          <w:sz w:val="28"/>
+          <w:szCs w:val="28"/>
+          <w:lang w:val="hu-HU"/>
+        </w:rPr>
+        <w:t xml:space="preserve"> rendszer egyik legfontosabb eleme az adatbázis, amely az alkalmazás teljes működésének alapját képezi. Az adatbázis relációs modellben került kialakításra, amely lehetővé teszi az adatok strukturált, konzisztens és hatékony kezelését.</w:t>
       </w:r>
     </w:p>
     <w:p>
@@ -9724,7 +10453,25 @@
           <w:szCs w:val="28"/>
           <w:lang w:val="hu-HU"/>
         </w:rPr>
-        <w:t>5.1 Felhasználók (users tábla)</w:t>
+        <w:t>5.1 Felhasználók (</w:t>
+      </w:r>
+      <w:proofErr w:type="spellStart"/>
+      <w:r>
+        <w:rPr>
+          <w:bCs/>
+          <w:szCs w:val="28"/>
+          <w:lang w:val="hu-HU"/>
+        </w:rPr>
+        <w:t>users</w:t>
+      </w:r>
+      <w:proofErr w:type="spellEnd"/>
+      <w:r>
+        <w:rPr>
+          <w:bCs/>
+          <w:szCs w:val="28"/>
+          <w:lang w:val="hu-HU"/>
+        </w:rPr>
+        <w:t xml:space="preserve"> tábla)</w:t>
       </w:r>
       <w:bookmarkEnd w:id="19"/>
     </w:p>
@@ -9747,7 +10494,51 @@
           <w:szCs w:val="28"/>
           <w:lang w:val="hu-HU"/>
         </w:rPr>
-        <w:t>A users tábla tartalmazza a rendszerben regisztrált felhasználók adatait. Ez a tábla kulcsszerepet játszik az autentikáció és a jogosultságkezelés szempontjából.</w:t>
+        <w:t xml:space="preserve">A </w:t>
+      </w:r>
+      <w:proofErr w:type="spellStart"/>
+      <w:r>
+        <w:rPr>
+          <w:rFonts w:ascii="Times New Roman" w:hAnsi="Times New Roman" w:cs="Times New Roman"/>
+          <w:color w:val="000000" w:themeColor="text1"/>
+          <w:sz w:val="28"/>
+          <w:szCs w:val="28"/>
+          <w:lang w:val="hu-HU"/>
+        </w:rPr>
+        <w:t>users</w:t>
+      </w:r>
+      <w:proofErr w:type="spellEnd"/>
+      <w:r>
+        <w:rPr>
+          <w:rFonts w:ascii="Times New Roman" w:hAnsi="Times New Roman" w:cs="Times New Roman"/>
+          <w:color w:val="000000" w:themeColor="text1"/>
+          <w:sz w:val="28"/>
+          <w:szCs w:val="28"/>
+          <w:lang w:val="hu-HU"/>
+        </w:rPr>
+        <w:t xml:space="preserve"> tábla tartalmazza a rendszerben regisztrált felhasználók adatait. Ez a tábla kulcsszerepet játszik az </w:t>
+      </w:r>
+      <w:proofErr w:type="spellStart"/>
+      <w:r>
+        <w:rPr>
+          <w:rFonts w:ascii="Times New Roman" w:hAnsi="Times New Roman" w:cs="Times New Roman"/>
+          <w:color w:val="000000" w:themeColor="text1"/>
+          <w:sz w:val="28"/>
+          <w:szCs w:val="28"/>
+          <w:lang w:val="hu-HU"/>
+        </w:rPr>
+        <w:t>autentikáció</w:t>
+      </w:r>
+      <w:proofErr w:type="spellEnd"/>
+      <w:r>
+        <w:rPr>
+          <w:rFonts w:ascii="Times New Roman" w:hAnsi="Times New Roman" w:cs="Times New Roman"/>
+          <w:color w:val="000000" w:themeColor="text1"/>
+          <w:sz w:val="28"/>
+          <w:szCs w:val="28"/>
+          <w:lang w:val="hu-HU"/>
+        </w:rPr>
+        <w:t xml:space="preserve"> és a jogosultságkezelés szempontjából.</w:t>
       </w:r>
     </w:p>
     <w:p>
@@ -9941,7 +10732,25 @@
           <w:szCs w:val="28"/>
           <w:lang w:val="hu-HU"/>
         </w:rPr>
-        <w:t>5.2 Termékek (products tábla)</w:t>
+        <w:t>5.2 Termékek (</w:t>
+      </w:r>
+      <w:proofErr w:type="spellStart"/>
+      <w:r>
+        <w:rPr>
+          <w:bCs/>
+          <w:szCs w:val="28"/>
+          <w:lang w:val="hu-HU"/>
+        </w:rPr>
+        <w:t>products</w:t>
+      </w:r>
+      <w:proofErr w:type="spellEnd"/>
+      <w:r>
+        <w:rPr>
+          <w:bCs/>
+          <w:szCs w:val="28"/>
+          <w:lang w:val="hu-HU"/>
+        </w:rPr>
+        <w:t xml:space="preserve"> tábla)</w:t>
       </w:r>
       <w:bookmarkEnd w:id="20"/>
     </w:p>
@@ -9964,7 +10773,29 @@
           <w:szCs w:val="28"/>
           <w:lang w:val="hu-HU"/>
         </w:rPr>
-        <w:t>A products tábla tartalmazza az összes elérhető terméket. Ez a rendszer egyik központi eleme, mivel a felhasználók ezekkel az adatokkal dolgoznak.</w:t>
+        <w:t xml:space="preserve">A </w:t>
+      </w:r>
+      <w:proofErr w:type="spellStart"/>
+      <w:r>
+        <w:rPr>
+          <w:rFonts w:ascii="Times New Roman" w:hAnsi="Times New Roman" w:cs="Times New Roman"/>
+          <w:color w:val="000000" w:themeColor="text1"/>
+          <w:sz w:val="28"/>
+          <w:szCs w:val="28"/>
+          <w:lang w:val="hu-HU"/>
+        </w:rPr>
+        <w:t>products</w:t>
+      </w:r>
+      <w:proofErr w:type="spellEnd"/>
+      <w:r>
+        <w:rPr>
+          <w:rFonts w:ascii="Times New Roman" w:hAnsi="Times New Roman" w:cs="Times New Roman"/>
+          <w:color w:val="000000" w:themeColor="text1"/>
+          <w:sz w:val="28"/>
+          <w:szCs w:val="28"/>
+          <w:lang w:val="hu-HU"/>
+        </w:rPr>
+        <w:t xml:space="preserve"> tábla tartalmazza az összes elérhető terméket. Ez a rendszer egyik központi eleme, mivel a felhasználók ezekkel az adatokkal dolgoznak.</w:t>
       </w:r>
     </w:p>
     <w:p>
@@ -10180,7 +11011,43 @@
           <w:szCs w:val="28"/>
           <w:lang w:val="hu-HU"/>
         </w:rPr>
-        <w:t>5.3 Rendelések (orders és order_items)</w:t>
+        <w:t>5.3 Rendelések (</w:t>
+      </w:r>
+      <w:proofErr w:type="spellStart"/>
+      <w:r>
+        <w:rPr>
+          <w:bCs/>
+          <w:szCs w:val="28"/>
+          <w:lang w:val="hu-HU"/>
+        </w:rPr>
+        <w:t>orders</w:t>
+      </w:r>
+      <w:proofErr w:type="spellEnd"/>
+      <w:r>
+        <w:rPr>
+          <w:bCs/>
+          <w:szCs w:val="28"/>
+          <w:lang w:val="hu-HU"/>
+        </w:rPr>
+        <w:t xml:space="preserve"> és </w:t>
+      </w:r>
+      <w:proofErr w:type="spellStart"/>
+      <w:r>
+        <w:rPr>
+          <w:bCs/>
+          <w:szCs w:val="28"/>
+          <w:lang w:val="hu-HU"/>
+        </w:rPr>
+        <w:t>order_items</w:t>
+      </w:r>
+      <w:proofErr w:type="spellEnd"/>
+      <w:r>
+        <w:rPr>
+          <w:bCs/>
+          <w:szCs w:val="28"/>
+          <w:lang w:val="hu-HU"/>
+        </w:rPr>
+        <w:t>)</w:t>
       </w:r>
       <w:bookmarkEnd w:id="21"/>
     </w:p>
@@ -10221,15 +11088,27 @@
           <w:lang w:val="hu-HU"/>
         </w:rPr>
       </w:pPr>
-      <w:r>
-        <w:rPr>
-          <w:rFonts w:ascii="Times New Roman" w:hAnsi="Times New Roman" w:cs="Times New Roman"/>
-          <w:color w:val="000000" w:themeColor="text1"/>
-          <w:sz w:val="28"/>
-          <w:szCs w:val="28"/>
-          <w:lang w:val="hu-HU"/>
-        </w:rPr>
-        <w:t xml:space="preserve">orders, </w:t>
+      <w:proofErr w:type="spellStart"/>
+      <w:r>
+        <w:rPr>
+          <w:rFonts w:ascii="Times New Roman" w:hAnsi="Times New Roman" w:cs="Times New Roman"/>
+          <w:color w:val="000000" w:themeColor="text1"/>
+          <w:sz w:val="28"/>
+          <w:szCs w:val="28"/>
+          <w:lang w:val="hu-HU"/>
+        </w:rPr>
+        <w:t>orders</w:t>
+      </w:r>
+      <w:proofErr w:type="spellEnd"/>
+      <w:r>
+        <w:rPr>
+          <w:rFonts w:ascii="Times New Roman" w:hAnsi="Times New Roman" w:cs="Times New Roman"/>
+          <w:color w:val="000000" w:themeColor="text1"/>
+          <w:sz w:val="28"/>
+          <w:szCs w:val="28"/>
+          <w:lang w:val="hu-HU"/>
+        </w:rPr>
+        <w:t xml:space="preserve">, </w:t>
       </w:r>
     </w:p>
     <w:p>
@@ -10247,15 +11126,27 @@
           <w:lang w:val="hu-HU"/>
         </w:rPr>
       </w:pPr>
-      <w:r>
-        <w:rPr>
-          <w:rFonts w:ascii="Times New Roman" w:hAnsi="Times New Roman" w:cs="Times New Roman"/>
-          <w:color w:val="000000" w:themeColor="text1"/>
-          <w:sz w:val="28"/>
-          <w:szCs w:val="28"/>
-          <w:lang w:val="hu-HU"/>
-        </w:rPr>
-        <w:t xml:space="preserve">order_items. </w:t>
+      <w:proofErr w:type="spellStart"/>
+      <w:r>
+        <w:rPr>
+          <w:rFonts w:ascii="Times New Roman" w:hAnsi="Times New Roman" w:cs="Times New Roman"/>
+          <w:color w:val="000000" w:themeColor="text1"/>
+          <w:sz w:val="28"/>
+          <w:szCs w:val="28"/>
+          <w:lang w:val="hu-HU"/>
+        </w:rPr>
+        <w:t>order_items</w:t>
+      </w:r>
+      <w:proofErr w:type="spellEnd"/>
+      <w:r>
+        <w:rPr>
+          <w:rFonts w:ascii="Times New Roman" w:hAnsi="Times New Roman" w:cs="Times New Roman"/>
+          <w:color w:val="000000" w:themeColor="text1"/>
+          <w:sz w:val="28"/>
+          <w:szCs w:val="28"/>
+          <w:lang w:val="hu-HU"/>
+        </w:rPr>
+        <w:t xml:space="preserve">. </w:t>
       </w:r>
     </w:p>
     <w:p>
@@ -10277,7 +11168,51 @@
           <w:szCs w:val="28"/>
           <w:lang w:val="hu-HU"/>
         </w:rPr>
-        <w:t>Az orders tábla tartalmazza a rendelés alapadatait, míg az order_items tábla a rendeléshez tartozó termékeket.</w:t>
+        <w:t xml:space="preserve">Az </w:t>
+      </w:r>
+      <w:proofErr w:type="spellStart"/>
+      <w:r>
+        <w:rPr>
+          <w:rFonts w:ascii="Times New Roman" w:hAnsi="Times New Roman" w:cs="Times New Roman"/>
+          <w:color w:val="000000" w:themeColor="text1"/>
+          <w:sz w:val="28"/>
+          <w:szCs w:val="28"/>
+          <w:lang w:val="hu-HU"/>
+        </w:rPr>
+        <w:t>orders</w:t>
+      </w:r>
+      <w:proofErr w:type="spellEnd"/>
+      <w:r>
+        <w:rPr>
+          <w:rFonts w:ascii="Times New Roman" w:hAnsi="Times New Roman" w:cs="Times New Roman"/>
+          <w:color w:val="000000" w:themeColor="text1"/>
+          <w:sz w:val="28"/>
+          <w:szCs w:val="28"/>
+          <w:lang w:val="hu-HU"/>
+        </w:rPr>
+        <w:t xml:space="preserve"> tábla tartalmazza a rendelés alapadatait, míg az </w:t>
+      </w:r>
+      <w:proofErr w:type="spellStart"/>
+      <w:r>
+        <w:rPr>
+          <w:rFonts w:ascii="Times New Roman" w:hAnsi="Times New Roman" w:cs="Times New Roman"/>
+          <w:color w:val="000000" w:themeColor="text1"/>
+          <w:sz w:val="28"/>
+          <w:szCs w:val="28"/>
+          <w:lang w:val="hu-HU"/>
+        </w:rPr>
+        <w:t>order_items</w:t>
+      </w:r>
+      <w:proofErr w:type="spellEnd"/>
+      <w:r>
+        <w:rPr>
+          <w:rFonts w:ascii="Times New Roman" w:hAnsi="Times New Roman" w:cs="Times New Roman"/>
+          <w:color w:val="000000" w:themeColor="text1"/>
+          <w:sz w:val="28"/>
+          <w:szCs w:val="28"/>
+          <w:lang w:val="hu-HU"/>
+        </w:rPr>
+        <w:t xml:space="preserve"> tábla a rendeléshez tartozó termékeket.</w:t>
       </w:r>
     </w:p>
     <w:p>
@@ -10379,7 +11314,25 @@
           <w:szCs w:val="28"/>
           <w:lang w:val="hu-HU"/>
         </w:rPr>
-        <w:t>5.4 Készletkezelés (stock)</w:t>
+        <w:t>5.4 Készletkezelés (</w:t>
+      </w:r>
+      <w:proofErr w:type="spellStart"/>
+      <w:r>
+        <w:rPr>
+          <w:bCs/>
+          <w:szCs w:val="28"/>
+          <w:lang w:val="hu-HU"/>
+        </w:rPr>
+        <w:t>stock</w:t>
+      </w:r>
+      <w:proofErr w:type="spellEnd"/>
+      <w:r>
+        <w:rPr>
+          <w:bCs/>
+          <w:szCs w:val="28"/>
+          <w:lang w:val="hu-HU"/>
+        </w:rPr>
+        <w:t>)</w:t>
       </w:r>
       <w:bookmarkEnd w:id="22"/>
     </w:p>
@@ -10402,7 +11355,29 @@
           <w:szCs w:val="28"/>
           <w:lang w:val="hu-HU"/>
         </w:rPr>
-        <w:t>A stock tábla a termékek aktuális készletinformációit tartalmazza. Ez biztosítja, hogy a rendszer mindig pontos adatokat szolgáltasson a rendelkezésre álló mennyiségekről.</w:t>
+        <w:t xml:space="preserve">A </w:t>
+      </w:r>
+      <w:proofErr w:type="spellStart"/>
+      <w:r>
+        <w:rPr>
+          <w:rFonts w:ascii="Times New Roman" w:hAnsi="Times New Roman" w:cs="Times New Roman"/>
+          <w:color w:val="000000" w:themeColor="text1"/>
+          <w:sz w:val="28"/>
+          <w:szCs w:val="28"/>
+          <w:lang w:val="hu-HU"/>
+        </w:rPr>
+        <w:t>stock</w:t>
+      </w:r>
+      <w:proofErr w:type="spellEnd"/>
+      <w:r>
+        <w:rPr>
+          <w:rFonts w:ascii="Times New Roman" w:hAnsi="Times New Roman" w:cs="Times New Roman"/>
+          <w:color w:val="000000" w:themeColor="text1"/>
+          <w:sz w:val="28"/>
+          <w:szCs w:val="28"/>
+          <w:lang w:val="hu-HU"/>
+        </w:rPr>
+        <w:t xml:space="preserve"> tábla a termékek aktuális készletinformációit tartalmazza. Ez biztosítja, hogy a rendszer mindig pontos adatokat szolgáltasson a rendelkezésre álló mennyiségekről.</w:t>
       </w:r>
     </w:p>
     <w:p>
@@ -10505,15 +11480,27 @@
           <w:lang w:val="hu-HU"/>
         </w:rPr>
       </w:pPr>
-      <w:r>
-        <w:rPr>
-          <w:rFonts w:ascii="Times New Roman" w:hAnsi="Times New Roman" w:cs="Times New Roman"/>
-          <w:color w:val="000000" w:themeColor="text1"/>
-          <w:sz w:val="28"/>
-          <w:szCs w:val="28"/>
-          <w:lang w:val="hu-HU"/>
-        </w:rPr>
-        <w:t xml:space="preserve">1:N kapcsolat: egy rekord több másik rekordhoz kapcsolódhat (például egy felhasználó több rendelést is leadhat). </w:t>
+      <w:proofErr w:type="gramStart"/>
+      <w:r>
+        <w:rPr>
+          <w:rFonts w:ascii="Times New Roman" w:hAnsi="Times New Roman" w:cs="Times New Roman"/>
+          <w:color w:val="000000" w:themeColor="text1"/>
+          <w:sz w:val="28"/>
+          <w:szCs w:val="28"/>
+          <w:lang w:val="hu-HU"/>
+        </w:rPr>
+        <w:t>1:N</w:t>
+      </w:r>
+      <w:proofErr w:type="gramEnd"/>
+      <w:r>
+        <w:rPr>
+          <w:rFonts w:ascii="Times New Roman" w:hAnsi="Times New Roman" w:cs="Times New Roman"/>
+          <w:color w:val="000000" w:themeColor="text1"/>
+          <w:sz w:val="28"/>
+          <w:szCs w:val="28"/>
+          <w:lang w:val="hu-HU"/>
+        </w:rPr>
+        <w:t xml:space="preserve"> kapcsolat: egy rekord több másik rekordhoz kapcsolódhat (például egy felhasználó több rendelést is leadhat). </w:t>
       </w:r>
     </w:p>
     <w:p>
@@ -10598,15 +11585,23 @@
         <w:rPr>
           <w:szCs w:val="32"/>
         </w:rPr>
-        <w:t>6. Backend működés</w:t>
-      </w:r>
+        <w:t xml:space="preserve">6. Backend </w:t>
+      </w:r>
+      <w:proofErr w:type="spellStart"/>
       <w:r>
         <w:rPr>
           <w:szCs w:val="32"/>
         </w:rPr>
+        <w:t>működés</w:t>
+      </w:r>
+      <w:r>
+        <w:rPr>
+          <w:szCs w:val="32"/>
+        </w:rPr>
         <w:t>e</w:t>
       </w:r>
       <w:bookmarkEnd w:id="24"/>
+      <w:proofErr w:type="spellEnd"/>
     </w:p>
     <w:p>
       <w:pPr>
@@ -10810,7 +11805,25 @@
           <w:szCs w:val="28"/>
           <w:lang w:val="hu-HU"/>
         </w:rPr>
-        <w:t>6.2 Autentikáció (JWT)</w:t>
+        <w:t xml:space="preserve">6.2 </w:t>
+      </w:r>
+      <w:proofErr w:type="spellStart"/>
+      <w:r>
+        <w:rPr>
+          <w:bCs/>
+          <w:szCs w:val="28"/>
+          <w:lang w:val="hu-HU"/>
+        </w:rPr>
+        <w:t>Autentikáció</w:t>
+      </w:r>
+      <w:proofErr w:type="spellEnd"/>
+      <w:r>
+        <w:rPr>
+          <w:bCs/>
+          <w:szCs w:val="28"/>
+          <w:lang w:val="hu-HU"/>
+        </w:rPr>
+        <w:t xml:space="preserve"> (JWT)</w:t>
       </w:r>
       <w:bookmarkEnd w:id="27"/>
     </w:p>
@@ -10833,7 +11846,29 @@
           <w:szCs w:val="28"/>
           <w:lang w:val="hu-HU"/>
         </w:rPr>
-        <w:t>A rendszer JWT (JSON Web Token) alapú hitelesítést alkalmaz.</w:t>
+        <w:t xml:space="preserve">A rendszer JWT (JSON Web </w:t>
+      </w:r>
+      <w:proofErr w:type="spellStart"/>
+      <w:r>
+        <w:rPr>
+          <w:rFonts w:ascii="Times New Roman" w:hAnsi="Times New Roman" w:cs="Times New Roman"/>
+          <w:color w:val="000000" w:themeColor="text1"/>
+          <w:sz w:val="28"/>
+          <w:szCs w:val="28"/>
+          <w:lang w:val="hu-HU"/>
+        </w:rPr>
+        <w:t>Token</w:t>
+      </w:r>
+      <w:proofErr w:type="spellEnd"/>
+      <w:r>
+        <w:rPr>
+          <w:rFonts w:ascii="Times New Roman" w:hAnsi="Times New Roman" w:cs="Times New Roman"/>
+          <w:color w:val="000000" w:themeColor="text1"/>
+          <w:sz w:val="28"/>
+          <w:szCs w:val="28"/>
+          <w:lang w:val="hu-HU"/>
+        </w:rPr>
+        <w:t>) alapú hitelesítést alkalmaz.</w:t>
       </w:r>
     </w:p>
     <w:p>
@@ -10925,15 +11960,27 @@
           <w:lang w:val="hu-HU"/>
         </w:rPr>
       </w:pPr>
-      <w:r>
-        <w:rPr>
-          <w:rFonts w:ascii="Times New Roman" w:hAnsi="Times New Roman" w:cs="Times New Roman"/>
-          <w:color w:val="000000" w:themeColor="text1"/>
-          <w:sz w:val="28"/>
-          <w:szCs w:val="28"/>
-          <w:lang w:val="hu-HU"/>
-        </w:rPr>
-        <w:t xml:space="preserve">token generálódik </w:t>
+      <w:proofErr w:type="spellStart"/>
+      <w:r>
+        <w:rPr>
+          <w:rFonts w:ascii="Times New Roman" w:hAnsi="Times New Roman" w:cs="Times New Roman"/>
+          <w:color w:val="000000" w:themeColor="text1"/>
+          <w:sz w:val="28"/>
+          <w:szCs w:val="28"/>
+          <w:lang w:val="hu-HU"/>
+        </w:rPr>
+        <w:t>token</w:t>
+      </w:r>
+      <w:proofErr w:type="spellEnd"/>
+      <w:r>
+        <w:rPr>
+          <w:rFonts w:ascii="Times New Roman" w:hAnsi="Times New Roman" w:cs="Times New Roman"/>
+          <w:color w:val="000000" w:themeColor="text1"/>
+          <w:sz w:val="28"/>
+          <w:szCs w:val="28"/>
+          <w:lang w:val="hu-HU"/>
+        </w:rPr>
+        <w:t xml:space="preserve"> generálódik </w:t>
       </w:r>
     </w:p>
     <w:p>
@@ -10951,15 +11998,49 @@
           <w:lang w:val="hu-HU"/>
         </w:rPr>
       </w:pPr>
-      <w:r>
-        <w:rPr>
-          <w:rFonts w:ascii="Times New Roman" w:hAnsi="Times New Roman" w:cs="Times New Roman"/>
-          <w:color w:val="000000" w:themeColor="text1"/>
-          <w:sz w:val="28"/>
-          <w:szCs w:val="28"/>
-          <w:lang w:val="hu-HU"/>
-        </w:rPr>
-        <w:t xml:space="preserve">token tárolódik (localStorage) </w:t>
+      <w:proofErr w:type="spellStart"/>
+      <w:r>
+        <w:rPr>
+          <w:rFonts w:ascii="Times New Roman" w:hAnsi="Times New Roman" w:cs="Times New Roman"/>
+          <w:color w:val="000000" w:themeColor="text1"/>
+          <w:sz w:val="28"/>
+          <w:szCs w:val="28"/>
+          <w:lang w:val="hu-HU"/>
+        </w:rPr>
+        <w:t>token</w:t>
+      </w:r>
+      <w:proofErr w:type="spellEnd"/>
+      <w:r>
+        <w:rPr>
+          <w:rFonts w:ascii="Times New Roman" w:hAnsi="Times New Roman" w:cs="Times New Roman"/>
+          <w:color w:val="000000" w:themeColor="text1"/>
+          <w:sz w:val="28"/>
+          <w:szCs w:val="28"/>
+          <w:lang w:val="hu-HU"/>
+        </w:rPr>
+        <w:t xml:space="preserve"> tárolódik (</w:t>
+      </w:r>
+      <w:proofErr w:type="spellStart"/>
+      <w:r>
+        <w:rPr>
+          <w:rFonts w:ascii="Times New Roman" w:hAnsi="Times New Roman" w:cs="Times New Roman"/>
+          <w:color w:val="000000" w:themeColor="text1"/>
+          <w:sz w:val="28"/>
+          <w:szCs w:val="28"/>
+          <w:lang w:val="hu-HU"/>
+        </w:rPr>
+        <w:t>localStorage</w:t>
+      </w:r>
+      <w:proofErr w:type="spellEnd"/>
+      <w:r>
+        <w:rPr>
+          <w:rFonts w:ascii="Times New Roman" w:hAnsi="Times New Roman" w:cs="Times New Roman"/>
+          <w:color w:val="000000" w:themeColor="text1"/>
+          <w:sz w:val="28"/>
+          <w:szCs w:val="28"/>
+          <w:lang w:val="hu-HU"/>
+        </w:rPr>
+        <w:t xml:space="preserve">) </w:t>
       </w:r>
     </w:p>
     <w:p>
@@ -11007,7 +12088,29 @@
           <w:szCs w:val="28"/>
           <w:lang w:val="hu-HU"/>
         </w:rPr>
-        <w:t>Ez a megoldás biztonságos és skálázható autentikációt tesz lehetővé.</w:t>
+        <w:t xml:space="preserve">Ez a megoldás biztonságos és skálázható </w:t>
+      </w:r>
+      <w:proofErr w:type="spellStart"/>
+      <w:r>
+        <w:rPr>
+          <w:rFonts w:ascii="Times New Roman" w:hAnsi="Times New Roman" w:cs="Times New Roman"/>
+          <w:color w:val="000000" w:themeColor="text1"/>
+          <w:sz w:val="28"/>
+          <w:szCs w:val="28"/>
+          <w:lang w:val="hu-HU"/>
+        </w:rPr>
+        <w:t>autentikációt</w:t>
+      </w:r>
+      <w:proofErr w:type="spellEnd"/>
+      <w:r>
+        <w:rPr>
+          <w:rFonts w:ascii="Times New Roman" w:hAnsi="Times New Roman" w:cs="Times New Roman"/>
+          <w:color w:val="000000" w:themeColor="text1"/>
+          <w:sz w:val="28"/>
+          <w:szCs w:val="28"/>
+          <w:lang w:val="hu-HU"/>
+        </w:rPr>
+        <w:t xml:space="preserve"> tesz lehetővé.</w:t>
       </w:r>
     </w:p>
     <w:p>
@@ -11290,15 +12393,23 @@
         <w:rPr>
           <w:szCs w:val="32"/>
         </w:rPr>
-        <w:t>7. Frontend működés</w:t>
-      </w:r>
+        <w:t xml:space="preserve">7. Frontend </w:t>
+      </w:r>
+      <w:proofErr w:type="spellStart"/>
       <w:r>
         <w:rPr>
           <w:szCs w:val="32"/>
         </w:rPr>
+        <w:t>működés</w:t>
+      </w:r>
+      <w:r>
+        <w:rPr>
+          <w:szCs w:val="32"/>
+        </w:rPr>
         <w:t>e</w:t>
       </w:r>
       <w:bookmarkEnd w:id="29"/>
+      <w:proofErr w:type="spellEnd"/>
     </w:p>
     <w:p>
       <w:pPr>
@@ -11343,7 +12454,51 @@
           <w:szCs w:val="28"/>
           <w:lang w:val="hu-HU"/>
         </w:rPr>
-        <w:t>A RaktárPro rendszer frontend rétege felelős a felhasználói felület megjelenítéséért, valamint a felhasználó és a rendszer közötti interakciók kezeléséért. A frontend a backend által biztosított API-n keresztül működik, így minden adat dinamikusan kerül betöltésre.</w:t>
+        <w:t xml:space="preserve">A </w:t>
+      </w:r>
+      <w:proofErr w:type="spellStart"/>
+      <w:r>
+        <w:rPr>
+          <w:rFonts w:ascii="Times New Roman" w:hAnsi="Times New Roman" w:cs="Times New Roman"/>
+          <w:color w:val="000000" w:themeColor="text1"/>
+          <w:sz w:val="28"/>
+          <w:szCs w:val="28"/>
+          <w:lang w:val="hu-HU"/>
+        </w:rPr>
+        <w:t>RaktárPro</w:t>
+      </w:r>
+      <w:proofErr w:type="spellEnd"/>
+      <w:r>
+        <w:rPr>
+          <w:rFonts w:ascii="Times New Roman" w:hAnsi="Times New Roman" w:cs="Times New Roman"/>
+          <w:color w:val="000000" w:themeColor="text1"/>
+          <w:sz w:val="28"/>
+          <w:szCs w:val="28"/>
+          <w:lang w:val="hu-HU"/>
+        </w:rPr>
+        <w:t xml:space="preserve"> rendszer frontend </w:t>
+      </w:r>
+      <w:proofErr w:type="spellStart"/>
+      <w:r>
+        <w:rPr>
+          <w:rFonts w:ascii="Times New Roman" w:hAnsi="Times New Roman" w:cs="Times New Roman"/>
+          <w:color w:val="000000" w:themeColor="text1"/>
+          <w:sz w:val="28"/>
+          <w:szCs w:val="28"/>
+          <w:lang w:val="hu-HU"/>
+        </w:rPr>
+        <w:t>rétege</w:t>
+      </w:r>
+      <w:proofErr w:type="spellEnd"/>
+      <w:r>
+        <w:rPr>
+          <w:rFonts w:ascii="Times New Roman" w:hAnsi="Times New Roman" w:cs="Times New Roman"/>
+          <w:color w:val="000000" w:themeColor="text1"/>
+          <w:sz w:val="28"/>
+          <w:szCs w:val="28"/>
+          <w:lang w:val="hu-HU"/>
+        </w:rPr>
+        <w:t xml:space="preserve"> felelős a felhasználói felület megjelenítéséért, valamint a felhasználó és a rendszer közötti interakciók kezeléséért. A frontend a backend által biztosított API-n keresztül működik, így minden adat dinamikusan kerül betöltésre.</w:t>
       </w:r>
     </w:p>
     <w:p>
@@ -11556,7 +12711,29 @@
           <w:szCs w:val="28"/>
           <w:lang w:val="hu-HU"/>
         </w:rPr>
-        <w:t xml:space="preserve">kezdőoldal (home) </w:t>
+        <w:t>kezdőoldal (</w:t>
+      </w:r>
+      <w:proofErr w:type="spellStart"/>
+      <w:r>
+        <w:rPr>
+          <w:rFonts w:ascii="Times New Roman" w:hAnsi="Times New Roman" w:cs="Times New Roman"/>
+          <w:color w:val="000000" w:themeColor="text1"/>
+          <w:sz w:val="28"/>
+          <w:szCs w:val="28"/>
+          <w:lang w:val="hu-HU"/>
+        </w:rPr>
+        <w:t>home</w:t>
+      </w:r>
+      <w:proofErr w:type="spellEnd"/>
+      <w:r>
+        <w:rPr>
+          <w:rFonts w:ascii="Times New Roman" w:hAnsi="Times New Roman" w:cs="Times New Roman"/>
+          <w:color w:val="000000" w:themeColor="text1"/>
+          <w:sz w:val="28"/>
+          <w:szCs w:val="28"/>
+          <w:lang w:val="hu-HU"/>
+        </w:rPr>
+        <w:t xml:space="preserve">) </w:t>
       </w:r>
     </w:p>
     <w:p>
@@ -12193,15 +13370,27 @@
           <w:lang w:val="hu-HU"/>
         </w:rPr>
       </w:pPr>
-      <w:r>
-        <w:rPr>
-          <w:rFonts w:ascii="Times New Roman" w:hAnsi="Times New Roman" w:cs="Times New Roman"/>
-          <w:color w:val="000000" w:themeColor="text1"/>
-          <w:sz w:val="28"/>
-          <w:szCs w:val="28"/>
-          <w:lang w:val="hu-HU"/>
-        </w:rPr>
-        <w:t xml:space="preserve">LocalStorage segítségével, </w:t>
+      <w:proofErr w:type="spellStart"/>
+      <w:r>
+        <w:rPr>
+          <w:rFonts w:ascii="Times New Roman" w:hAnsi="Times New Roman" w:cs="Times New Roman"/>
+          <w:color w:val="000000" w:themeColor="text1"/>
+          <w:sz w:val="28"/>
+          <w:szCs w:val="28"/>
+          <w:lang w:val="hu-HU"/>
+        </w:rPr>
+        <w:t>LocalStorage</w:t>
+      </w:r>
+      <w:proofErr w:type="spellEnd"/>
+      <w:r>
+        <w:rPr>
+          <w:rFonts w:ascii="Times New Roman" w:hAnsi="Times New Roman" w:cs="Times New Roman"/>
+          <w:color w:val="000000" w:themeColor="text1"/>
+          <w:sz w:val="28"/>
+          <w:szCs w:val="28"/>
+          <w:lang w:val="hu-HU"/>
+        </w:rPr>
+        <w:t xml:space="preserve"> segítségével, </w:t>
       </w:r>
     </w:p>
     <w:p>
@@ -12227,7 +13416,29 @@
           <w:szCs w:val="28"/>
           <w:lang w:val="hu-HU"/>
         </w:rPr>
-        <w:t xml:space="preserve">vagy cookie alapú megoldással. </w:t>
+        <w:t xml:space="preserve">vagy </w:t>
+      </w:r>
+      <w:proofErr w:type="spellStart"/>
+      <w:r>
+        <w:rPr>
+          <w:rFonts w:ascii="Times New Roman" w:hAnsi="Times New Roman" w:cs="Times New Roman"/>
+          <w:color w:val="000000" w:themeColor="text1"/>
+          <w:sz w:val="28"/>
+          <w:szCs w:val="28"/>
+          <w:lang w:val="hu-HU"/>
+        </w:rPr>
+        <w:t>cookie</w:t>
+      </w:r>
+      <w:proofErr w:type="spellEnd"/>
+      <w:r>
+        <w:rPr>
+          <w:rFonts w:ascii="Times New Roman" w:hAnsi="Times New Roman" w:cs="Times New Roman"/>
+          <w:color w:val="000000" w:themeColor="text1"/>
+          <w:sz w:val="28"/>
+          <w:szCs w:val="28"/>
+          <w:lang w:val="hu-HU"/>
+        </w:rPr>
+        <w:t xml:space="preserve"> alapú megoldással. </w:t>
       </w:r>
     </w:p>
     <w:p>
@@ -12249,7 +13460,29 @@
           <w:szCs w:val="28"/>
           <w:lang w:val="hu-HU"/>
         </w:rPr>
-        <w:t>A token tárolása lehetővé teszi, hogy a felhasználó ne veszítse el a bejelentkezett állapotát az oldal frissítésekor.</w:t>
+        <w:t xml:space="preserve">A </w:t>
+      </w:r>
+      <w:proofErr w:type="spellStart"/>
+      <w:r>
+        <w:rPr>
+          <w:rFonts w:ascii="Times New Roman" w:hAnsi="Times New Roman" w:cs="Times New Roman"/>
+          <w:color w:val="000000" w:themeColor="text1"/>
+          <w:sz w:val="28"/>
+          <w:szCs w:val="28"/>
+          <w:lang w:val="hu-HU"/>
+        </w:rPr>
+        <w:t>token</w:t>
+      </w:r>
+      <w:proofErr w:type="spellEnd"/>
+      <w:r>
+        <w:rPr>
+          <w:rFonts w:ascii="Times New Roman" w:hAnsi="Times New Roman" w:cs="Times New Roman"/>
+          <w:color w:val="000000" w:themeColor="text1"/>
+          <w:sz w:val="28"/>
+          <w:szCs w:val="28"/>
+          <w:lang w:val="hu-HU"/>
+        </w:rPr>
+        <w:t xml:space="preserve"> tárolása lehetővé teszi, hogy a felhasználó ne veszítse el a bejelentkezett állapotát az oldal frissítésekor.</w:t>
       </w:r>
     </w:p>
     <w:p>
@@ -12673,9 +13906,31 @@
         <w:rPr>
           <w:szCs w:val="32"/>
         </w:rPr>
-        <w:t xml:space="preserve"> Telepítési útmutató</w:t>
+        <w:t xml:space="preserve"> </w:t>
+      </w:r>
+      <w:proofErr w:type="spellStart"/>
+      <w:r>
+        <w:rPr>
+          <w:szCs w:val="32"/>
+        </w:rPr>
+        <w:t>Telepítési</w:t>
+      </w:r>
+      <w:proofErr w:type="spellEnd"/>
+      <w:r>
+        <w:rPr>
+          <w:szCs w:val="32"/>
+        </w:rPr>
+        <w:t xml:space="preserve"> </w:t>
+      </w:r>
+      <w:proofErr w:type="spellStart"/>
+      <w:r>
+        <w:rPr>
+          <w:szCs w:val="32"/>
+        </w:rPr>
+        <w:t>útmutató</w:t>
       </w:r>
       <w:bookmarkEnd w:id="35"/>
+      <w:proofErr w:type="spellEnd"/>
       <w:r>
         <w:rPr>
           <w:szCs w:val="32"/>
@@ -12913,7 +14168,51 @@
           <w:szCs w:val="28"/>
           <w:lang w:val="hu-HU"/>
         </w:rPr>
-        <w:t xml:space="preserve">Indítsuk el az Apache és MySQL szervereket </w:t>
+        <w:t xml:space="preserve">Indítsuk el az </w:t>
+      </w:r>
+      <w:proofErr w:type="spellStart"/>
+      <w:r>
+        <w:rPr>
+          <w:rFonts w:ascii="Times New Roman" w:hAnsi="Times New Roman" w:cs="Times New Roman"/>
+          <w:color w:val="000000" w:themeColor="text1"/>
+          <w:sz w:val="28"/>
+          <w:szCs w:val="28"/>
+          <w:lang w:val="hu-HU"/>
+        </w:rPr>
+        <w:t>Apache</w:t>
+      </w:r>
+      <w:proofErr w:type="spellEnd"/>
+      <w:r>
+        <w:rPr>
+          <w:rFonts w:ascii="Times New Roman" w:hAnsi="Times New Roman" w:cs="Times New Roman"/>
+          <w:color w:val="000000" w:themeColor="text1"/>
+          <w:sz w:val="28"/>
+          <w:szCs w:val="28"/>
+          <w:lang w:val="hu-HU"/>
+        </w:rPr>
+        <w:t xml:space="preserve"> és </w:t>
+      </w:r>
+      <w:proofErr w:type="spellStart"/>
+      <w:r>
+        <w:rPr>
+          <w:rFonts w:ascii="Times New Roman" w:hAnsi="Times New Roman" w:cs="Times New Roman"/>
+          <w:color w:val="000000" w:themeColor="text1"/>
+          <w:sz w:val="28"/>
+          <w:szCs w:val="28"/>
+          <w:lang w:val="hu-HU"/>
+        </w:rPr>
+        <w:t>MySQL</w:t>
+      </w:r>
+      <w:proofErr w:type="spellEnd"/>
+      <w:r>
+        <w:rPr>
+          <w:rFonts w:ascii="Times New Roman" w:hAnsi="Times New Roman" w:cs="Times New Roman"/>
+          <w:color w:val="000000" w:themeColor="text1"/>
+          <w:sz w:val="28"/>
+          <w:szCs w:val="28"/>
+          <w:lang w:val="hu-HU"/>
+        </w:rPr>
+        <w:t xml:space="preserve"> szervereket </w:t>
       </w:r>
     </w:p>
     <w:p>
@@ -12993,7 +14292,29 @@
           <w:szCs w:val="28"/>
           <w:lang w:val="hu-HU"/>
         </w:rPr>
-        <w:t xml:space="preserve">Hozzunk létre egy új adatbázist (például: raktarpro) </w:t>
+        <w:t xml:space="preserve">Hozzunk létre egy új adatbázist (például: </w:t>
+      </w:r>
+      <w:proofErr w:type="spellStart"/>
+      <w:r>
+        <w:rPr>
+          <w:rFonts w:ascii="Times New Roman" w:hAnsi="Times New Roman" w:cs="Times New Roman"/>
+          <w:color w:val="000000" w:themeColor="text1"/>
+          <w:sz w:val="28"/>
+          <w:szCs w:val="28"/>
+          <w:lang w:val="hu-HU"/>
+        </w:rPr>
+        <w:t>raktarpro</w:t>
+      </w:r>
+      <w:proofErr w:type="spellEnd"/>
+      <w:r>
+        <w:rPr>
+          <w:rFonts w:ascii="Times New Roman" w:hAnsi="Times New Roman" w:cs="Times New Roman"/>
+          <w:color w:val="000000" w:themeColor="text1"/>
+          <w:sz w:val="28"/>
+          <w:szCs w:val="28"/>
+          <w:lang w:val="hu-HU"/>
+        </w:rPr>
+        <w:t xml:space="preserve">) </w:t>
       </w:r>
     </w:p>
     <w:p>
@@ -13071,17 +14392,83 @@
           <w:szCs w:val="28"/>
           <w:lang w:val="hu-HU"/>
         </w:rPr>
-        <w:t>Tallózzuk be a ZIP fájlban található .sql állomán</w:t>
-      </w:r>
-      <w:r>
-        <w:rPr>
-          <w:rFonts w:ascii="Times New Roman" w:hAnsi="Times New Roman" w:cs="Times New Roman"/>
-          <w:color w:val="000000" w:themeColor="text1"/>
-          <w:sz w:val="28"/>
-          <w:szCs w:val="28"/>
-          <w:lang w:val="hu-HU"/>
-        </w:rPr>
-        <w:t>yt (Raktarpro/database) és importáljuk</w:t>
+        <w:t>Tallózzuk be a ZIP fájlban található .</w:t>
+      </w:r>
+      <w:proofErr w:type="spellStart"/>
+      <w:r>
+        <w:rPr>
+          <w:rFonts w:ascii="Times New Roman" w:hAnsi="Times New Roman" w:cs="Times New Roman"/>
+          <w:color w:val="000000" w:themeColor="text1"/>
+          <w:sz w:val="28"/>
+          <w:szCs w:val="28"/>
+          <w:lang w:val="hu-HU"/>
+        </w:rPr>
+        <w:t>sql</w:t>
+      </w:r>
+      <w:proofErr w:type="spellEnd"/>
+      <w:r>
+        <w:rPr>
+          <w:rFonts w:ascii="Times New Roman" w:hAnsi="Times New Roman" w:cs="Times New Roman"/>
+          <w:color w:val="000000" w:themeColor="text1"/>
+          <w:sz w:val="28"/>
+          <w:szCs w:val="28"/>
+          <w:lang w:val="hu-HU"/>
+        </w:rPr>
+        <w:t xml:space="preserve"> állomán</w:t>
+      </w:r>
+      <w:r>
+        <w:rPr>
+          <w:rFonts w:ascii="Times New Roman" w:hAnsi="Times New Roman" w:cs="Times New Roman"/>
+          <w:color w:val="000000" w:themeColor="text1"/>
+          <w:sz w:val="28"/>
+          <w:szCs w:val="28"/>
+          <w:lang w:val="hu-HU"/>
+        </w:rPr>
+        <w:t>yt (</w:t>
+      </w:r>
+      <w:proofErr w:type="spellStart"/>
+      <w:r>
+        <w:rPr>
+          <w:rFonts w:ascii="Times New Roman" w:hAnsi="Times New Roman" w:cs="Times New Roman"/>
+          <w:color w:val="000000" w:themeColor="text1"/>
+          <w:sz w:val="28"/>
+          <w:szCs w:val="28"/>
+          <w:lang w:val="hu-HU"/>
+        </w:rPr>
+        <w:t>Raktarpro</w:t>
+      </w:r>
+      <w:proofErr w:type="spellEnd"/>
+      <w:r>
+        <w:rPr>
+          <w:rFonts w:ascii="Times New Roman" w:hAnsi="Times New Roman" w:cs="Times New Roman"/>
+          <w:color w:val="000000" w:themeColor="text1"/>
+          <w:sz w:val="28"/>
+          <w:szCs w:val="28"/>
+          <w:lang w:val="hu-HU"/>
+        </w:rPr>
+        <w:t>/</w:t>
+      </w:r>
+      <w:proofErr w:type="spellStart"/>
+      <w:r>
+        <w:rPr>
+          <w:rFonts w:ascii="Times New Roman" w:hAnsi="Times New Roman" w:cs="Times New Roman"/>
+          <w:color w:val="000000" w:themeColor="text1"/>
+          <w:sz w:val="28"/>
+          <w:szCs w:val="28"/>
+          <w:lang w:val="hu-HU"/>
+        </w:rPr>
+        <w:t>database</w:t>
+      </w:r>
+      <w:proofErr w:type="spellEnd"/>
+      <w:r>
+        <w:rPr>
+          <w:rFonts w:ascii="Times New Roman" w:hAnsi="Times New Roman" w:cs="Times New Roman"/>
+          <w:color w:val="000000" w:themeColor="text1"/>
+          <w:sz w:val="28"/>
+          <w:szCs w:val="28"/>
+          <w:lang w:val="hu-HU"/>
+        </w:rPr>
+        <w:t>) és importáljuk</w:t>
       </w:r>
       <w:r>
         <w:rPr>
@@ -13118,6 +14505,7 @@
         </w:rPr>
         <w:t xml:space="preserve">8.1 </w:t>
       </w:r>
+      <w:proofErr w:type="spellStart"/>
       <w:r>
         <w:rPr>
           <w:rFonts w:ascii="Times New Roman" w:hAnsi="Times New Roman" w:cs="Times New Roman"/>
@@ -13136,7 +14524,30 @@
           <w:szCs w:val="28"/>
           <w:lang w:val="hu-HU"/>
         </w:rPr>
-        <w:t>.sql, products.sql,</w:t>
+        <w:t>.sql</w:t>
+      </w:r>
+      <w:proofErr w:type="spellEnd"/>
+      <w:r>
+        <w:rPr>
+          <w:rFonts w:ascii="Times New Roman" w:hAnsi="Times New Roman" w:cs="Times New Roman"/>
+          <w:color w:val="000000" w:themeColor="text1"/>
+          <w:sz w:val="28"/>
+          <w:szCs w:val="28"/>
+          <w:lang w:val="hu-HU"/>
+        </w:rPr>
+        <w:t xml:space="preserve">, </w:t>
+      </w:r>
+      <w:proofErr w:type="spellStart"/>
+      <w:proofErr w:type="gramStart"/>
+      <w:r>
+        <w:rPr>
+          <w:rFonts w:ascii="Times New Roman" w:hAnsi="Times New Roman" w:cs="Times New Roman"/>
+          <w:color w:val="000000" w:themeColor="text1"/>
+          <w:sz w:val="28"/>
+          <w:szCs w:val="28"/>
+          <w:lang w:val="hu-HU"/>
+        </w:rPr>
+        <w:t>products.sql,</w:t>
       </w:r>
       <w:r>
         <w:rPr>
@@ -13158,6 +14569,8 @@
         </w:rPr>
         <w:t>.sql</w:t>
       </w:r>
+      <w:proofErr w:type="spellEnd"/>
+      <w:proofErr w:type="gramEnd"/>
     </w:p>
     <w:p>
       <w:pPr>
@@ -13228,7 +14641,7 @@
         </w:rPr>
         <w:lastRenderedPageBreak/>
         <w:pict w14:anchorId="1D9947AC">
-          <v:rect id="_x0000_i1066" style="width:0;height:1.5pt" o:hralign="center" o:hrstd="t" o:hr="t" fillcolor="#a0a0a0" stroked="f"/>
+          <v:rect id="_x0000_i1065" style="width:0;height:1.5pt" o:hralign="center" o:hrstd="t" o:hr="t" fillcolor="#a0a0a0" stroked="f"/>
         </w:pict>
       </w:r>
     </w:p>
@@ -13323,7 +14736,7 @@
           <w:lang w:val="hu-HU"/>
         </w:rPr>
         <w:pict w14:anchorId="68BAE7FC">
-          <v:rect id="_x0000_i1067" style="width:0;height:1.5pt" o:hralign="center" o:hrstd="t" o:hr="t" fillcolor="#a0a0a0" stroked="f"/>
+          <v:rect id="_x0000_i1066" style="width:0;height:1.5pt" o:hralign="center" o:hrstd="t" o:hr="t" fillcolor="#a0a0a0" stroked="f"/>
         </w:pict>
       </w:r>
     </w:p>
@@ -13346,9 +14759,59 @@
         <w:rPr>
           <w:szCs w:val="32"/>
         </w:rPr>
-        <w:t xml:space="preserve"> Gyakori hibák és megoldások</w:t>
+        <w:t xml:space="preserve"> </w:t>
+      </w:r>
+      <w:proofErr w:type="spellStart"/>
+      <w:r>
+        <w:rPr>
+          <w:szCs w:val="32"/>
+        </w:rPr>
+        <w:t>Gyakori</w:t>
+      </w:r>
+      <w:proofErr w:type="spellEnd"/>
+      <w:r>
+        <w:rPr>
+          <w:szCs w:val="32"/>
+        </w:rPr>
+        <w:t xml:space="preserve"> </w:t>
+      </w:r>
+      <w:proofErr w:type="spellStart"/>
+      <w:r>
+        <w:rPr>
+          <w:szCs w:val="32"/>
+        </w:rPr>
+        <w:t>hibák</w:t>
+      </w:r>
+      <w:proofErr w:type="spellEnd"/>
+      <w:r>
+        <w:rPr>
+          <w:szCs w:val="32"/>
+        </w:rPr>
+        <w:t xml:space="preserve"> </w:t>
+      </w:r>
+      <w:proofErr w:type="spellStart"/>
+      <w:r>
+        <w:rPr>
+          <w:szCs w:val="32"/>
+        </w:rPr>
+        <w:t>és</w:t>
+      </w:r>
+      <w:proofErr w:type="spellEnd"/>
+      <w:r>
+        <w:rPr>
+          <w:szCs w:val="32"/>
+        </w:rPr>
+        <w:t xml:space="preserve"> </w:t>
+      </w:r>
+      <w:proofErr w:type="spellStart"/>
+      <w:r>
+        <w:rPr>
+          <w:szCs w:val="32"/>
+        </w:rPr>
+        <w:t>megoldások</w:t>
       </w:r>
       <w:bookmarkEnd w:id="36"/>
+      <w:proofErr w:type="spellEnd"/>
       <w:r>
         <w:rPr>
           <w:szCs w:val="32"/>
@@ -13421,7 +14884,7 @@
           <w:lang w:val="hu-HU"/>
         </w:rPr>
         <w:pict w14:anchorId="0C07650F">
-          <v:rect id="_x0000_i1068" style="width:0;height:1.5pt" o:hralign="center" o:hrstd="t" o:hr="t" fillcolor="#a0a0a0" stroked="f"/>
+          <v:rect id="_x0000_i1067" style="width:0;height:1.5pt" o:hralign="center" o:hrstd="t" o:hr="t" fillcolor="#a0a0a0" stroked="f"/>
         </w:pict>
       </w:r>
     </w:p>
@@ -13752,7 +15215,7 @@
         </w:rPr>
         <w:lastRenderedPageBreak/>
         <w:pict w14:anchorId="12BCAABF">
-          <v:rect id="_x0000_i1069" style="width:0;height:1.5pt" o:hralign="center" o:hrstd="t" o:hr="t" fillcolor="#a0a0a0" stroked="f"/>
+          <v:rect id="_x0000_i1068" style="width:0;height:1.5pt" o:hralign="center" o:hrstd="t" o:hr="t" fillcolor="#a0a0a0" stroked="f"/>
         </w:pict>
       </w:r>
     </w:p>
@@ -13984,7 +15447,7 @@
           <w:lang w:val="hu-HU"/>
         </w:rPr>
         <w:pict w14:anchorId="6AEF2100">
-          <v:rect id="_x0000_i1070" style="width:0;height:1.5pt" o:hralign="center" o:hrstd="t" o:hr="t" fillcolor="#a0a0a0" stroked="f"/>
+          <v:rect id="_x0000_i1069" style="width:0;height:1.5pt" o:hralign="center" o:hrstd="t" o:hr="t" fillcolor="#a0a0a0" stroked="f"/>
         </w:pict>
       </w:r>
     </w:p>
@@ -14216,7 +15679,7 @@
           <w:lang w:val="hu-HU"/>
         </w:rPr>
         <w:pict w14:anchorId="0B638494">
-          <v:rect id="_x0000_i1071" style="width:0;height:1.5pt" o:hralign="center" o:hrstd="t" o:hr="t" fillcolor="#a0a0a0" stroked="f"/>
+          <v:rect id="_x0000_i1070" style="width:0;height:1.5pt" o:hralign="center" o:hrstd="t" o:hr="t" fillcolor="#a0a0a0" stroked="f"/>
         </w:pict>
       </w:r>
     </w:p>
@@ -14262,7 +15725,7 @@
         </w:rPr>
         <w:lastRenderedPageBreak/>
         <w:pict w14:anchorId="72D1DF01">
-          <v:rect id="_x0000_i1072" style="width:0;height:1.5pt" o:hralign="center" o:hrstd="t" o:hr="t" fillcolor="#a0a0a0" stroked="f"/>
+          <v:rect id="_x0000_i1071" style="width:0;height:1.5pt" o:hralign="center" o:hrstd="t" o:hr="t" fillcolor="#a0a0a0" stroked="f"/>
         </w:pict>
       </w:r>
     </w:p>
@@ -14446,7 +15909,29 @@
           <w:szCs w:val="28"/>
           <w:lang w:val="hu-HU"/>
         </w:rPr>
-        <w:t>Ez azért történhet, mert a rendszer a bejelentkezési adatokat a böngészőben (LocalStorage-ben) tárolja.</w:t>
+        <w:t>Ez azért történhet, mert a rendszer a bejelentkezési adatokat a böngészőben (</w:t>
+      </w:r>
+      <w:proofErr w:type="spellStart"/>
+      <w:r>
+        <w:rPr>
+          <w:rFonts w:ascii="Times New Roman" w:hAnsi="Times New Roman" w:cs="Times New Roman"/>
+          <w:color w:val="000000" w:themeColor="text1"/>
+          <w:sz w:val="28"/>
+          <w:szCs w:val="28"/>
+          <w:lang w:val="hu-HU"/>
+        </w:rPr>
+        <w:t>LocalStorage</w:t>
+      </w:r>
+      <w:proofErr w:type="spellEnd"/>
+      <w:r>
+        <w:rPr>
+          <w:rFonts w:ascii="Times New Roman" w:hAnsi="Times New Roman" w:cs="Times New Roman"/>
+          <w:color w:val="000000" w:themeColor="text1"/>
+          <w:sz w:val="28"/>
+          <w:szCs w:val="28"/>
+          <w:lang w:val="hu-HU"/>
+        </w:rPr>
+        <w:t>-ben) tárolja.</w:t>
       </w:r>
     </w:p>
     <w:p>
@@ -14468,7 +15953,7 @@
           <w:lang w:val="hu-HU"/>
         </w:rPr>
         <w:pict w14:anchorId="786519AD">
-          <v:rect id="_x0000_i1073" style="width:0;height:1.5pt" o:hralign="center" o:hrstd="t" o:hr="t" fillcolor="#a0a0a0" stroked="f"/>
+          <v:rect id="_x0000_i1072" style="width:0;height:1.5pt" o:hralign="center" o:hrstd="t" o:hr="t" fillcolor="#a0a0a0" stroked="f"/>
         </w:pict>
       </w:r>
     </w:p>
@@ -14693,7 +16178,7 @@
           <w:lang w:val="hu-HU"/>
         </w:rPr>
         <w:pict w14:anchorId="3E595792">
-          <v:rect id="_x0000_i1074" style="width:0;height:1.5pt" o:hralign="center" o:hrstd="t" o:hr="t" fillcolor="#a0a0a0" stroked="f"/>
+          <v:rect id="_x0000_i1073" style="width:0;height:1.5pt" o:hralign="center" o:hrstd="t" o:hr="t" fillcolor="#a0a0a0" stroked="f"/>
         </w:pict>
       </w:r>
     </w:p>
@@ -14761,7 +16246,7 @@
         </w:rPr>
         <w:lastRenderedPageBreak/>
         <w:pict w14:anchorId="59970CD7">
-          <v:rect id="_x0000_i1075" style="width:0;height:1.5pt" o:hralign="center" o:hrstd="t" o:hr="t" fillcolor="#a0a0a0" stroked="f"/>
+          <v:rect id="_x0000_i1074" style="width:0;height:1.5pt" o:hralign="center" o:hrstd="t" o:hr="t" fillcolor="#a0a0a0" stroked="f"/>
         </w:pict>
       </w:r>
     </w:p>
@@ -14897,7 +16382,29 @@
           <w:szCs w:val="28"/>
           <w:lang w:val="hu-HU"/>
         </w:rPr>
-        <w:t xml:space="preserve">zárjon be minden más programot, ami használhatja a portot </w:t>
+        <w:t xml:space="preserve">zárjon be minden más programot, ami használhatja a </w:t>
+      </w:r>
+      <w:proofErr w:type="spellStart"/>
+      <w:r>
+        <w:rPr>
+          <w:rFonts w:ascii="Times New Roman" w:hAnsi="Times New Roman" w:cs="Times New Roman"/>
+          <w:color w:val="000000" w:themeColor="text1"/>
+          <w:sz w:val="28"/>
+          <w:szCs w:val="28"/>
+          <w:lang w:val="hu-HU"/>
+        </w:rPr>
+        <w:t>portot</w:t>
+      </w:r>
+      <w:proofErr w:type="spellEnd"/>
+      <w:r>
+        <w:rPr>
+          <w:rFonts w:ascii="Times New Roman" w:hAnsi="Times New Roman" w:cs="Times New Roman"/>
+          <w:color w:val="000000" w:themeColor="text1"/>
+          <w:sz w:val="28"/>
+          <w:szCs w:val="28"/>
+          <w:lang w:val="hu-HU"/>
+        </w:rPr>
+        <w:t xml:space="preserve"> </w:t>
       </w:r>
     </w:p>
     <w:p>
@@ -14945,238 +16452,294 @@
           <w:lang w:val="hu-HU"/>
         </w:rPr>
         <w:pict w14:anchorId="12D46BD9">
+          <v:rect id="_x0000_i1075" style="width:0;height:1.5pt" o:hralign="center" o:hrstd="t" o:hr="t" fillcolor="#a0a0a0" stroked="f"/>
+        </w:pict>
+      </w:r>
+    </w:p>
+    <w:p>
+      <w:pPr>
+        <w:pStyle w:val="Cmsor2"/>
+        <w:rPr>
+          <w:bCs/>
+          <w:szCs w:val="28"/>
+          <w:lang w:val="hu-HU"/>
+        </w:rPr>
+      </w:pPr>
+      <w:bookmarkStart w:id="43" w:name="_Toc228378822"/>
+      <w:r>
+        <w:rPr>
+          <w:bCs/>
+          <w:szCs w:val="28"/>
+          <w:lang w:val="hu-HU"/>
+        </w:rPr>
+        <w:t>Segítségkérés lehetősége</w:t>
+      </w:r>
+      <w:bookmarkEnd w:id="43"/>
+    </w:p>
+    <w:p>
+      <w:pPr>
+        <w:spacing w:before="0"/>
+        <w:rPr>
+          <w:rFonts w:ascii="Times New Roman" w:hAnsi="Times New Roman" w:cs="Times New Roman"/>
+          <w:color w:val="000000" w:themeColor="text1"/>
+          <w:sz w:val="28"/>
+          <w:szCs w:val="28"/>
+          <w:lang w:val="hu-HU"/>
+        </w:rPr>
+      </w:pPr>
+      <w:r>
+        <w:rPr>
+          <w:rFonts w:ascii="Times New Roman" w:hAnsi="Times New Roman" w:cs="Times New Roman"/>
+          <w:color w:val="000000" w:themeColor="text1"/>
+          <w:sz w:val="28"/>
+          <w:szCs w:val="28"/>
+          <w:lang w:val="hu-HU"/>
+        </w:rPr>
+        <w:t>Amennyiben a fenti lépések egyike sem oldja meg a problémát, a felhasználónak lehetősége van közvetlenül segítséget kérni.</w:t>
+      </w:r>
+    </w:p>
+    <w:p>
+      <w:pPr>
+        <w:spacing w:before="0"/>
+        <w:rPr>
+          <w:rFonts w:ascii="Times New Roman" w:hAnsi="Times New Roman" w:cs="Times New Roman"/>
+          <w:color w:val="000000" w:themeColor="text1"/>
+          <w:sz w:val="28"/>
+          <w:szCs w:val="28"/>
+          <w:lang w:val="hu-HU"/>
+        </w:rPr>
+      </w:pPr>
+      <w:r>
+        <w:rPr>
+          <w:rFonts w:ascii="Times New Roman" w:hAnsi="Times New Roman" w:cs="Times New Roman"/>
+          <w:color w:val="000000" w:themeColor="text1"/>
+          <w:sz w:val="28"/>
+          <w:szCs w:val="28"/>
+          <w:lang w:val="hu-HU"/>
+        </w:rPr>
+        <w:t>A bejelentkezési oldalon található egy „</w:t>
+      </w:r>
+      <w:proofErr w:type="spellStart"/>
+      <w:r>
+        <w:rPr>
+          <w:rFonts w:ascii="Times New Roman" w:hAnsi="Times New Roman" w:cs="Times New Roman"/>
+          <w:color w:val="000000" w:themeColor="text1"/>
+          <w:sz w:val="28"/>
+          <w:szCs w:val="28"/>
+          <w:u w:val="single"/>
+        </w:rPr>
+        <w:t>Segítségre</w:t>
+      </w:r>
+      <w:proofErr w:type="spellEnd"/>
+      <w:r>
+        <w:rPr>
+          <w:rFonts w:ascii="Times New Roman" w:hAnsi="Times New Roman" w:cs="Times New Roman"/>
+          <w:color w:val="000000" w:themeColor="text1"/>
+          <w:sz w:val="28"/>
+          <w:szCs w:val="28"/>
+          <w:u w:val="single"/>
+        </w:rPr>
+        <w:t xml:space="preserve"> van </w:t>
+      </w:r>
+      <w:proofErr w:type="spellStart"/>
+      <w:r>
+        <w:rPr>
+          <w:rFonts w:ascii="Times New Roman" w:hAnsi="Times New Roman" w:cs="Times New Roman"/>
+          <w:color w:val="000000" w:themeColor="text1"/>
+          <w:sz w:val="28"/>
+          <w:szCs w:val="28"/>
+          <w:u w:val="single"/>
+        </w:rPr>
+        <w:t>szükséged</w:t>
+      </w:r>
+      <w:proofErr w:type="spellEnd"/>
+      <w:r>
+        <w:rPr>
+          <w:rFonts w:ascii="Times New Roman" w:hAnsi="Times New Roman" w:cs="Times New Roman"/>
+          <w:color w:val="000000" w:themeColor="text1"/>
+          <w:sz w:val="28"/>
+          <w:szCs w:val="28"/>
+          <w:u w:val="single"/>
+        </w:rPr>
+        <w:t xml:space="preserve"> a </w:t>
+      </w:r>
+      <w:proofErr w:type="spellStart"/>
+      <w:r>
+        <w:rPr>
+          <w:rFonts w:ascii="Times New Roman" w:hAnsi="Times New Roman" w:cs="Times New Roman"/>
+          <w:color w:val="000000" w:themeColor="text1"/>
+          <w:sz w:val="28"/>
+          <w:szCs w:val="28"/>
+          <w:u w:val="single"/>
+        </w:rPr>
+        <w:t>belépésnél</w:t>
+      </w:r>
+      <w:proofErr w:type="spellEnd"/>
+      <w:r>
+        <w:rPr>
+          <w:rFonts w:ascii="Times New Roman" w:hAnsi="Times New Roman" w:cs="Times New Roman"/>
+          <w:color w:val="000000" w:themeColor="text1"/>
+          <w:sz w:val="28"/>
+          <w:szCs w:val="28"/>
+          <w:u w:val="single"/>
+        </w:rPr>
+        <w:t xml:space="preserve">?” </w:t>
+      </w:r>
+      <w:r>
+        <w:rPr>
+          <w:rFonts w:ascii="Times New Roman" w:hAnsi="Times New Roman" w:cs="Times New Roman"/>
+          <w:color w:val="000000" w:themeColor="text1"/>
+          <w:sz w:val="28"/>
+          <w:szCs w:val="28"/>
+          <w:lang w:val="hu-HU"/>
+        </w:rPr>
+        <w:t>fül, amelyen keresztül üzenetet küldhet az oldal fejlesztőinek. Ebben röviden leírhatja a problémáját, és a fejlesztői csapat a lehető legrövidebb időn belül válaszol, valamint segítséget nyújt a hiba megoldásában.</w:t>
+      </w:r>
+    </w:p>
+    <w:p>
+      <w:pPr>
+        <w:spacing w:before="0"/>
+        <w:rPr>
+          <w:rFonts w:ascii="Times New Roman" w:hAnsi="Times New Roman" w:cs="Times New Roman"/>
+          <w:color w:val="000000" w:themeColor="text1"/>
+          <w:sz w:val="28"/>
+          <w:szCs w:val="28"/>
+          <w:lang w:val="hu-HU"/>
+        </w:rPr>
+      </w:pPr>
+      <w:r>
+        <w:rPr>
+          <w:rFonts w:ascii="Times New Roman" w:hAnsi="Times New Roman" w:cs="Times New Roman"/>
+          <w:color w:val="000000" w:themeColor="text1"/>
+          <w:sz w:val="28"/>
+          <w:szCs w:val="28"/>
+          <w:lang w:val="hu-HU"/>
+        </w:rPr>
+        <w:t>Ez a funkció biztosítja, hogy a felhasználó ne maradjon egyedül a problémával, és mindig legyen lehetősége támogatást kérni.</w:t>
+      </w:r>
+    </w:p>
+    <w:p>
+      <w:pPr>
+        <w:spacing w:before="0"/>
+        <w:rPr>
+          <w:rFonts w:ascii="Times New Roman" w:hAnsi="Times New Roman" w:cs="Times New Roman"/>
+          <w:color w:val="000000" w:themeColor="text1"/>
+          <w:sz w:val="28"/>
+          <w:szCs w:val="28"/>
+          <w:lang w:val="hu-HU"/>
+        </w:rPr>
+      </w:pPr>
+      <w:r>
+        <w:rPr>
+          <w:rFonts w:ascii="Times New Roman" w:hAnsi="Times New Roman" w:cs="Times New Roman"/>
+          <w:color w:val="000000" w:themeColor="text1"/>
+          <w:sz w:val="28"/>
+          <w:szCs w:val="28"/>
+          <w:lang w:val="hu-HU"/>
+        </w:rPr>
+        <w:pict w14:anchorId="26F84AEB">
           <v:rect id="_x0000_i1076" style="width:0;height:1.5pt" o:hralign="center" o:hrstd="t" o:hr="t" fillcolor="#a0a0a0" stroked="f"/>
         </w:pict>
       </w:r>
     </w:p>
     <w:p>
       <w:pPr>
-        <w:pStyle w:val="Cmsor2"/>
+        <w:spacing w:before="0"/>
+        <w:rPr>
+          <w:rFonts w:ascii="Times New Roman" w:hAnsi="Times New Roman" w:cs="Times New Roman"/>
+          <w:color w:val="000000" w:themeColor="text1"/>
+          <w:sz w:val="28"/>
+          <w:szCs w:val="28"/>
+          <w:lang w:val="hu-HU"/>
+        </w:rPr>
+      </w:pPr>
+    </w:p>
+    <w:p>
+      <w:pPr>
+        <w:spacing w:before="0"/>
+        <w:rPr>
+          <w:rFonts w:ascii="Times New Roman" w:hAnsi="Times New Roman" w:cs="Times New Roman"/>
+          <w:color w:val="000000" w:themeColor="text1"/>
+          <w:sz w:val="28"/>
+          <w:szCs w:val="28"/>
+          <w:lang w:val="hu-HU"/>
+        </w:rPr>
+      </w:pPr>
+    </w:p>
+    <w:p>
+      <w:pPr>
+        <w:spacing w:before="0"/>
+        <w:rPr>
+          <w:rFonts w:ascii="Times New Roman" w:hAnsi="Times New Roman" w:cs="Times New Roman"/>
+          <w:color w:val="000000" w:themeColor="text1"/>
+          <w:sz w:val="28"/>
+          <w:szCs w:val="28"/>
+          <w:lang w:val="hu-HU"/>
+        </w:rPr>
+      </w:pPr>
+    </w:p>
+    <w:p>
+      <w:pPr>
+        <w:spacing w:before="0"/>
+        <w:rPr>
+          <w:rFonts w:ascii="Times New Roman" w:hAnsi="Times New Roman" w:cs="Times New Roman"/>
+          <w:color w:val="000000" w:themeColor="text1"/>
+          <w:sz w:val="28"/>
+          <w:szCs w:val="28"/>
+          <w:lang w:val="hu-HU"/>
+        </w:rPr>
+      </w:pPr>
+    </w:p>
+    <w:p>
+      <w:pPr>
+        <w:spacing w:before="0"/>
+        <w:rPr>
+          <w:rFonts w:ascii="Times New Roman" w:hAnsi="Times New Roman" w:cs="Times New Roman"/>
+          <w:color w:val="000000" w:themeColor="text1"/>
+          <w:sz w:val="28"/>
+          <w:szCs w:val="28"/>
+          <w:lang w:val="hu-HU"/>
+        </w:rPr>
+      </w:pPr>
+    </w:p>
+    <w:p>
+      <w:pPr>
+        <w:spacing w:before="0"/>
+        <w:rPr>
+          <w:rFonts w:ascii="Times New Roman" w:hAnsi="Times New Roman" w:cs="Times New Roman"/>
+          <w:color w:val="000000" w:themeColor="text1"/>
+          <w:sz w:val="28"/>
+          <w:szCs w:val="28"/>
+          <w:lang w:val="hu-HU"/>
+        </w:rPr>
+      </w:pPr>
+    </w:p>
+    <w:p>
+      <w:pPr>
+        <w:spacing w:before="0"/>
+        <w:rPr>
+          <w:rFonts w:ascii="Times New Roman" w:hAnsi="Times New Roman" w:cs="Times New Roman"/>
+          <w:color w:val="000000" w:themeColor="text1"/>
+          <w:sz w:val="28"/>
+          <w:szCs w:val="28"/>
+          <w:lang w:val="hu-HU"/>
+        </w:rPr>
+      </w:pPr>
+      <w:r>
         <w:rPr>
           <w:bCs/>
-          <w:szCs w:val="28"/>
-          <w:lang w:val="hu-HU"/>
-        </w:rPr>
-      </w:pPr>
-      <w:bookmarkStart w:id="43" w:name="_Toc228378822"/>
-      <w:r>
-        <w:rPr>
-          <w:bCs/>
-          <w:szCs w:val="28"/>
-          <w:lang w:val="hu-HU"/>
-        </w:rPr>
-        <w:t>Segítségkérés lehetősége</w:t>
-      </w:r>
-      <w:bookmarkEnd w:id="43"/>
-    </w:p>
-    <w:p>
-      <w:pPr>
-        <w:spacing w:before="0"/>
-        <w:rPr>
-          <w:rFonts w:ascii="Times New Roman" w:hAnsi="Times New Roman" w:cs="Times New Roman"/>
-          <w:color w:val="000000" w:themeColor="text1"/>
-          <w:sz w:val="28"/>
-          <w:szCs w:val="28"/>
-          <w:lang w:val="hu-HU"/>
-        </w:rPr>
-      </w:pPr>
-      <w:r>
-        <w:rPr>
-          <w:rFonts w:ascii="Times New Roman" w:hAnsi="Times New Roman" w:cs="Times New Roman"/>
-          <w:color w:val="000000" w:themeColor="text1"/>
-          <w:sz w:val="28"/>
-          <w:szCs w:val="28"/>
-          <w:lang w:val="hu-HU"/>
-        </w:rPr>
-        <w:t>Amennyiben a fenti lépések egyike sem oldja meg a problémát, a felhasználónak lehetősége van közvetlenül segítséget kérni.</w:t>
-      </w:r>
-    </w:p>
-    <w:p>
-      <w:pPr>
-        <w:spacing w:before="0"/>
-        <w:rPr>
-          <w:rFonts w:ascii="Times New Roman" w:hAnsi="Times New Roman" w:cs="Times New Roman"/>
-          <w:color w:val="000000" w:themeColor="text1"/>
-          <w:sz w:val="28"/>
-          <w:szCs w:val="28"/>
-          <w:lang w:val="hu-HU"/>
-        </w:rPr>
-      </w:pPr>
-      <w:r>
-        <w:rPr>
-          <w:rFonts w:ascii="Times New Roman" w:hAnsi="Times New Roman" w:cs="Times New Roman"/>
-          <w:color w:val="000000" w:themeColor="text1"/>
-          <w:sz w:val="28"/>
-          <w:szCs w:val="28"/>
-          <w:lang w:val="hu-HU"/>
-        </w:rPr>
-        <w:t>A bejelentkezési oldalon található egy „</w:t>
-      </w:r>
-      <w:r>
-        <w:rPr>
-          <w:rFonts w:ascii="Times New Roman" w:hAnsi="Times New Roman" w:cs="Times New Roman"/>
-          <w:color w:val="000000" w:themeColor="text1"/>
-          <w:sz w:val="28"/>
-          <w:szCs w:val="28"/>
-          <w:u w:val="single"/>
-        </w:rPr>
-        <w:t xml:space="preserve">Segítségre van szükséged a belépésnél?” </w:t>
-      </w:r>
-      <w:r>
-        <w:rPr>
-          <w:rFonts w:ascii="Times New Roman" w:hAnsi="Times New Roman" w:cs="Times New Roman"/>
-          <w:color w:val="000000" w:themeColor="text1"/>
-          <w:sz w:val="28"/>
-          <w:szCs w:val="28"/>
-          <w:lang w:val="hu-HU"/>
-        </w:rPr>
-        <w:t>fül, amelyen keresztül üzenetet küldhet az oldal fejlesztőinek. Ebben röviden leírhatja a problémáját, és a fejlesztői csapat a lehető legrövidebb időn belül válaszol, valamint segítséget nyújt a hiba megoldásában.</w:t>
-      </w:r>
-    </w:p>
-    <w:p>
-      <w:pPr>
-        <w:spacing w:before="0"/>
-        <w:rPr>
-          <w:rFonts w:ascii="Times New Roman" w:hAnsi="Times New Roman" w:cs="Times New Roman"/>
-          <w:color w:val="000000" w:themeColor="text1"/>
-          <w:sz w:val="28"/>
-          <w:szCs w:val="28"/>
-          <w:lang w:val="hu-HU"/>
-        </w:rPr>
-      </w:pPr>
-      <w:r>
-        <w:rPr>
-          <w:rFonts w:ascii="Times New Roman" w:hAnsi="Times New Roman" w:cs="Times New Roman"/>
-          <w:color w:val="000000" w:themeColor="text1"/>
-          <w:sz w:val="28"/>
-          <w:szCs w:val="28"/>
-          <w:lang w:val="hu-HU"/>
-        </w:rPr>
-        <w:t>Ez a funkció biztosítja, hogy a felhasználó ne maradjon egyedül a problémával, és mindig legyen lehetősége támogatást kérni.</w:t>
-      </w:r>
-    </w:p>
-    <w:p>
-      <w:pPr>
-        <w:spacing w:before="0"/>
-        <w:rPr>
-          <w:rFonts w:ascii="Times New Roman" w:hAnsi="Times New Roman" w:cs="Times New Roman"/>
-          <w:color w:val="000000" w:themeColor="text1"/>
-          <w:sz w:val="28"/>
-          <w:szCs w:val="28"/>
-          <w:lang w:val="hu-HU"/>
-        </w:rPr>
-      </w:pPr>
-      <w:r>
-        <w:rPr>
-          <w:rFonts w:ascii="Times New Roman" w:hAnsi="Times New Roman" w:cs="Times New Roman"/>
-          <w:color w:val="000000" w:themeColor="text1"/>
-          <w:sz w:val="28"/>
-          <w:szCs w:val="28"/>
-          <w:lang w:val="hu-HU"/>
-        </w:rPr>
-        <w:pict w14:anchorId="26F84AEB">
+          <w:sz w:val="28"/>
+          <w:szCs w:val="28"/>
+          <w:lang w:val="hu-HU"/>
+        </w:rPr>
+        <w:lastRenderedPageBreak/>
+        <w:pict w14:anchorId="116353FD">
           <v:rect id="_x0000_i1077" style="width:0;height:1.5pt" o:hralign="center" o:hrstd="t" o:hr="t" fillcolor="#a0a0a0" stroked="f"/>
         </w:pict>
       </w:r>
     </w:p>
     <w:p>
       <w:pPr>
-        <w:spacing w:before="0"/>
-        <w:rPr>
-          <w:rFonts w:ascii="Times New Roman" w:hAnsi="Times New Roman" w:cs="Times New Roman"/>
-          <w:color w:val="000000" w:themeColor="text1"/>
-          <w:sz w:val="28"/>
-          <w:szCs w:val="28"/>
-          <w:lang w:val="hu-HU"/>
-        </w:rPr>
-      </w:pPr>
-    </w:p>
-    <w:p>
-      <w:pPr>
-        <w:spacing w:before="0"/>
-        <w:rPr>
-          <w:rFonts w:ascii="Times New Roman" w:hAnsi="Times New Roman" w:cs="Times New Roman"/>
-          <w:color w:val="000000" w:themeColor="text1"/>
-          <w:sz w:val="28"/>
-          <w:szCs w:val="28"/>
-          <w:lang w:val="hu-HU"/>
-        </w:rPr>
-      </w:pPr>
-    </w:p>
-    <w:p>
-      <w:pPr>
-        <w:spacing w:before="0"/>
-        <w:rPr>
-          <w:rFonts w:ascii="Times New Roman" w:hAnsi="Times New Roman" w:cs="Times New Roman"/>
-          <w:color w:val="000000" w:themeColor="text1"/>
-          <w:sz w:val="28"/>
-          <w:szCs w:val="28"/>
-          <w:lang w:val="hu-HU"/>
-        </w:rPr>
-      </w:pPr>
-    </w:p>
-    <w:p>
-      <w:pPr>
-        <w:spacing w:before="0"/>
-        <w:rPr>
-          <w:rFonts w:ascii="Times New Roman" w:hAnsi="Times New Roman" w:cs="Times New Roman"/>
-          <w:color w:val="000000" w:themeColor="text1"/>
-          <w:sz w:val="28"/>
-          <w:szCs w:val="28"/>
-          <w:lang w:val="hu-HU"/>
-        </w:rPr>
-      </w:pPr>
-    </w:p>
-    <w:p>
-      <w:pPr>
-        <w:spacing w:before="0"/>
-        <w:rPr>
-          <w:rFonts w:ascii="Times New Roman" w:hAnsi="Times New Roman" w:cs="Times New Roman"/>
-          <w:color w:val="000000" w:themeColor="text1"/>
-          <w:sz w:val="28"/>
-          <w:szCs w:val="28"/>
-          <w:lang w:val="hu-HU"/>
-        </w:rPr>
-      </w:pPr>
-    </w:p>
-    <w:p>
-      <w:pPr>
-        <w:spacing w:before="0"/>
-        <w:rPr>
-          <w:rFonts w:ascii="Times New Roman" w:hAnsi="Times New Roman" w:cs="Times New Roman"/>
-          <w:color w:val="000000" w:themeColor="text1"/>
-          <w:sz w:val="28"/>
-          <w:szCs w:val="28"/>
-          <w:lang w:val="hu-HU"/>
-        </w:rPr>
-      </w:pPr>
-    </w:p>
-    <w:p>
-      <w:pPr>
-        <w:spacing w:before="0"/>
-        <w:rPr>
-          <w:rFonts w:ascii="Times New Roman" w:hAnsi="Times New Roman" w:cs="Times New Roman"/>
-          <w:color w:val="000000" w:themeColor="text1"/>
-          <w:sz w:val="28"/>
-          <w:szCs w:val="28"/>
-          <w:lang w:val="hu-HU"/>
-        </w:rPr>
-      </w:pPr>
-      <w:r>
-        <w:rPr>
-          <w:bCs/>
-          <w:sz w:val="28"/>
-          <w:szCs w:val="28"/>
-          <w:lang w:val="hu-HU"/>
-        </w:rPr>
-        <w:lastRenderedPageBreak/>
-        <w:pict w14:anchorId="116353FD">
-          <v:rect id="_x0000_i1078" style="width:0;height:1.5pt" o:hralign="center" o:hrstd="t" o:hr="t" fillcolor="#a0a0a0" stroked="f"/>
-        </w:pict>
-      </w:r>
-    </w:p>
-    <w:p>
-      <w:pPr>
         <w:pStyle w:val="Cmsor1"/>
         <w:framePr w:wrap="around"/>
         <w:rPr>
@@ -15189,9 +16752,45 @@
         <w:rPr>
           <w:szCs w:val="32"/>
         </w:rPr>
-        <w:t>10. Tesztelés és hibakezelés</w:t>
+        <w:t xml:space="preserve">10. </w:t>
+      </w:r>
+      <w:proofErr w:type="spellStart"/>
+      <w:r>
+        <w:rPr>
+          <w:szCs w:val="32"/>
+        </w:rPr>
+        <w:t>Tesztelés</w:t>
+      </w:r>
+      <w:proofErr w:type="spellEnd"/>
+      <w:r>
+        <w:rPr>
+          <w:szCs w:val="32"/>
+        </w:rPr>
+        <w:t xml:space="preserve"> </w:t>
+      </w:r>
+      <w:proofErr w:type="spellStart"/>
+      <w:r>
+        <w:rPr>
+          <w:szCs w:val="32"/>
+        </w:rPr>
+        <w:t>és</w:t>
+      </w:r>
+      <w:proofErr w:type="spellEnd"/>
+      <w:r>
+        <w:rPr>
+          <w:szCs w:val="32"/>
+        </w:rPr>
+        <w:t xml:space="preserve"> </w:t>
+      </w:r>
+      <w:proofErr w:type="spellStart"/>
+      <w:r>
+        <w:rPr>
+          <w:szCs w:val="32"/>
+        </w:rPr>
+        <w:t>hibakezelés</w:t>
       </w:r>
       <w:bookmarkEnd w:id="44"/>
+      <w:proofErr w:type="spellEnd"/>
     </w:p>
     <w:p>
       <w:pPr>
@@ -15236,7 +16835,73 @@
           <w:szCs w:val="28"/>
           <w:lang w:val="hu-HU"/>
         </w:rPr>
-        <w:t>A RaktárPro rendszer fejlesztése során kiemelt figyelmet kapott a tesztelés, mivel egy több rétegből álló alkalmazás esetén különösen fontos a megbízható működés biztosítása. A tesztelés célja az volt, hogy minden funkció megfelelően működjön, valamint hogy a rendszer stabil maradjon különböző felhasználói műveletek során is.</w:t>
+        <w:t xml:space="preserve">A </w:t>
+      </w:r>
+      <w:proofErr w:type="spellStart"/>
+      <w:r>
+        <w:rPr>
+          <w:rFonts w:ascii="Times New Roman" w:hAnsi="Times New Roman" w:cs="Times New Roman"/>
+          <w:color w:val="000000" w:themeColor="text1"/>
+          <w:sz w:val="28"/>
+          <w:szCs w:val="28"/>
+          <w:lang w:val="hu-HU"/>
+        </w:rPr>
+        <w:t>RaktárPro</w:t>
+      </w:r>
+      <w:proofErr w:type="spellEnd"/>
+      <w:r>
+        <w:rPr>
+          <w:rFonts w:ascii="Times New Roman" w:hAnsi="Times New Roman" w:cs="Times New Roman"/>
+          <w:color w:val="000000" w:themeColor="text1"/>
+          <w:sz w:val="28"/>
+          <w:szCs w:val="28"/>
+          <w:lang w:val="hu-HU"/>
+        </w:rPr>
+        <w:t xml:space="preserve"> rendszer fejlesztése során kiemelt figyelmet kapott a tesztelés, mivel egy több rétegből álló alkalmazás esetén különösen fontos a megbízható működés biztosítása. A tesztelés célja az volt, hogy minden funkció megfelelően </w:t>
+      </w:r>
+      <w:proofErr w:type="spellStart"/>
+      <w:r>
+        <w:rPr>
+          <w:rFonts w:ascii="Times New Roman" w:hAnsi="Times New Roman" w:cs="Times New Roman"/>
+          <w:color w:val="000000" w:themeColor="text1"/>
+          <w:sz w:val="28"/>
+          <w:szCs w:val="28"/>
+          <w:lang w:val="hu-HU"/>
+        </w:rPr>
+        <w:t>működjön</w:t>
+      </w:r>
+      <w:proofErr w:type="spellEnd"/>
+      <w:r>
+        <w:rPr>
+          <w:rFonts w:ascii="Times New Roman" w:hAnsi="Times New Roman" w:cs="Times New Roman"/>
+          <w:color w:val="000000" w:themeColor="text1"/>
+          <w:sz w:val="28"/>
+          <w:szCs w:val="28"/>
+          <w:lang w:val="hu-HU"/>
+        </w:rPr>
+        <w:t xml:space="preserve">, </w:t>
+      </w:r>
+      <w:proofErr w:type="gramStart"/>
+      <w:r>
+        <w:rPr>
+          <w:rFonts w:ascii="Times New Roman" w:hAnsi="Times New Roman" w:cs="Times New Roman"/>
+          <w:color w:val="000000" w:themeColor="text1"/>
+          <w:sz w:val="28"/>
+          <w:szCs w:val="28"/>
+          <w:lang w:val="hu-HU"/>
+        </w:rPr>
+        <w:t>valamint</w:t>
+      </w:r>
+      <w:proofErr w:type="gramEnd"/>
+      <w:r>
+        <w:rPr>
+          <w:rFonts w:ascii="Times New Roman" w:hAnsi="Times New Roman" w:cs="Times New Roman"/>
+          <w:color w:val="000000" w:themeColor="text1"/>
+          <w:sz w:val="28"/>
+          <w:szCs w:val="28"/>
+          <w:lang w:val="hu-HU"/>
+        </w:rPr>
+        <w:t xml:space="preserve"> hogy a rendszer stabil maradjon különböző felhasználói műveletek során is.</w:t>
       </w:r>
     </w:p>
     <w:p>
@@ -15280,7 +16945,7 @@
           <w:lang w:val="hu-HU"/>
         </w:rPr>
         <w:pict w14:anchorId="3D6409A2">
-          <v:rect id="_x0000_i1079" style="width:0;height:1.5pt" o:hralign="center" o:hrstd="t" o:hr="t" fillcolor="#a0a0a0" stroked="f"/>
+          <v:rect id="_x0000_i1078" style="width:0;height:1.5pt" o:hralign="center" o:hrstd="t" o:hr="t" fillcolor="#a0a0a0" stroked="f"/>
         </w:pict>
       </w:r>
     </w:p>
@@ -15455,7 +17120,73 @@
           <w:szCs w:val="28"/>
           <w:lang w:val="hu-HU"/>
         </w:rPr>
-        <w:t>Külön figyelmet kapott az, hogy minden CRUD művelet (Create, Read, Update, Delete) helyesen működjön, és ne okozzon adatvesztést vagy inkonzisztenciát.</w:t>
+        <w:t>Külön figyelmet kapott az, hogy minden CRUD művelet (</w:t>
+      </w:r>
+      <w:proofErr w:type="spellStart"/>
+      <w:r>
+        <w:rPr>
+          <w:rFonts w:ascii="Times New Roman" w:hAnsi="Times New Roman" w:cs="Times New Roman"/>
+          <w:color w:val="000000" w:themeColor="text1"/>
+          <w:sz w:val="28"/>
+          <w:szCs w:val="28"/>
+          <w:lang w:val="hu-HU"/>
+        </w:rPr>
+        <w:t>Create</w:t>
+      </w:r>
+      <w:proofErr w:type="spellEnd"/>
+      <w:r>
+        <w:rPr>
+          <w:rFonts w:ascii="Times New Roman" w:hAnsi="Times New Roman" w:cs="Times New Roman"/>
+          <w:color w:val="000000" w:themeColor="text1"/>
+          <w:sz w:val="28"/>
+          <w:szCs w:val="28"/>
+          <w:lang w:val="hu-HU"/>
+        </w:rPr>
+        <w:t xml:space="preserve">, Read, Update, </w:t>
+      </w:r>
+      <w:proofErr w:type="spellStart"/>
+      <w:r>
+        <w:rPr>
+          <w:rFonts w:ascii="Times New Roman" w:hAnsi="Times New Roman" w:cs="Times New Roman"/>
+          <w:color w:val="000000" w:themeColor="text1"/>
+          <w:sz w:val="28"/>
+          <w:szCs w:val="28"/>
+          <w:lang w:val="hu-HU"/>
+        </w:rPr>
+        <w:t>Delete</w:t>
+      </w:r>
+      <w:proofErr w:type="spellEnd"/>
+      <w:r>
+        <w:rPr>
+          <w:rFonts w:ascii="Times New Roman" w:hAnsi="Times New Roman" w:cs="Times New Roman"/>
+          <w:color w:val="000000" w:themeColor="text1"/>
+          <w:sz w:val="28"/>
+          <w:szCs w:val="28"/>
+          <w:lang w:val="hu-HU"/>
+        </w:rPr>
+        <w:t xml:space="preserve">) helyesen </w:t>
+      </w:r>
+      <w:proofErr w:type="spellStart"/>
+      <w:r>
+        <w:rPr>
+          <w:rFonts w:ascii="Times New Roman" w:hAnsi="Times New Roman" w:cs="Times New Roman"/>
+          <w:color w:val="000000" w:themeColor="text1"/>
+          <w:sz w:val="28"/>
+          <w:szCs w:val="28"/>
+          <w:lang w:val="hu-HU"/>
+        </w:rPr>
+        <w:t>működjön</w:t>
+      </w:r>
+      <w:proofErr w:type="spellEnd"/>
+      <w:r>
+        <w:rPr>
+          <w:rFonts w:ascii="Times New Roman" w:hAnsi="Times New Roman" w:cs="Times New Roman"/>
+          <w:color w:val="000000" w:themeColor="text1"/>
+          <w:sz w:val="28"/>
+          <w:szCs w:val="28"/>
+          <w:lang w:val="hu-HU"/>
+        </w:rPr>
+        <w:t>, és ne okozzon adatvesztést vagy inkonzisztenciát.</w:t>
       </w:r>
     </w:p>
     <w:p>
@@ -15477,7 +17208,7 @@
           <w:lang w:val="hu-HU"/>
         </w:rPr>
         <w:pict w14:anchorId="41D26CA9">
-          <v:rect id="_x0000_i1080" style="width:0;height:1.5pt" o:hralign="center" o:hrstd="t" o:hr="t" fillcolor="#a0a0a0" stroked="f"/>
+          <v:rect id="_x0000_i1079" style="width:0;height:1.5pt" o:hralign="center" o:hrstd="t" o:hr="t" fillcolor="#a0a0a0" stroked="f"/>
         </w:pict>
       </w:r>
     </w:p>
@@ -15497,7 +17228,25 @@
           <w:szCs w:val="28"/>
           <w:lang w:val="hu-HU"/>
         </w:rPr>
-        <w:t>10.2 Autentikáció és jogosultságkezelés tesztelése</w:t>
+        <w:t xml:space="preserve">10.2 </w:t>
+      </w:r>
+      <w:proofErr w:type="spellStart"/>
+      <w:r>
+        <w:rPr>
+          <w:bCs/>
+          <w:szCs w:val="28"/>
+          <w:lang w:val="hu-HU"/>
+        </w:rPr>
+        <w:t>Autentikáció</w:t>
+      </w:r>
+      <w:proofErr w:type="spellEnd"/>
+      <w:r>
+        <w:rPr>
+          <w:bCs/>
+          <w:szCs w:val="28"/>
+          <w:lang w:val="hu-HU"/>
+        </w:rPr>
+        <w:t xml:space="preserve"> és jogosultságkezelés tesztelése</w:t>
       </w:r>
       <w:bookmarkEnd w:id="46"/>
     </w:p>
@@ -15520,7 +17269,51 @@
           <w:szCs w:val="28"/>
           <w:lang w:val="hu-HU"/>
         </w:rPr>
-        <w:t>A rendszer egyik legfontosabb része az autentikáció, amely JWT tokenek segítségével valósul meg. Ennek megfelelő működése kulcsfontosságú a biztonság szempontjából.</w:t>
+        <w:t xml:space="preserve">A rendszer egyik legfontosabb része az </w:t>
+      </w:r>
+      <w:proofErr w:type="spellStart"/>
+      <w:r>
+        <w:rPr>
+          <w:rFonts w:ascii="Times New Roman" w:hAnsi="Times New Roman" w:cs="Times New Roman"/>
+          <w:color w:val="000000" w:themeColor="text1"/>
+          <w:sz w:val="28"/>
+          <w:szCs w:val="28"/>
+          <w:lang w:val="hu-HU"/>
+        </w:rPr>
+        <w:t>autentikáció</w:t>
+      </w:r>
+      <w:proofErr w:type="spellEnd"/>
+      <w:r>
+        <w:rPr>
+          <w:rFonts w:ascii="Times New Roman" w:hAnsi="Times New Roman" w:cs="Times New Roman"/>
+          <w:color w:val="000000" w:themeColor="text1"/>
+          <w:sz w:val="28"/>
+          <w:szCs w:val="28"/>
+          <w:lang w:val="hu-HU"/>
+        </w:rPr>
+        <w:t xml:space="preserve">, amely JWT </w:t>
+      </w:r>
+      <w:proofErr w:type="spellStart"/>
+      <w:r>
+        <w:rPr>
+          <w:rFonts w:ascii="Times New Roman" w:hAnsi="Times New Roman" w:cs="Times New Roman"/>
+          <w:color w:val="000000" w:themeColor="text1"/>
+          <w:sz w:val="28"/>
+          <w:szCs w:val="28"/>
+          <w:lang w:val="hu-HU"/>
+        </w:rPr>
+        <w:t>tokenek</w:t>
+      </w:r>
+      <w:proofErr w:type="spellEnd"/>
+      <w:r>
+        <w:rPr>
+          <w:rFonts w:ascii="Times New Roman" w:hAnsi="Times New Roman" w:cs="Times New Roman"/>
+          <w:color w:val="000000" w:themeColor="text1"/>
+          <w:sz w:val="28"/>
+          <w:szCs w:val="28"/>
+          <w:lang w:val="hu-HU"/>
+        </w:rPr>
+        <w:t xml:space="preserve"> segítségével valósul meg. Ennek megfelelő működése kulcsfontosságú a biztonság szempontjából.</w:t>
       </w:r>
     </w:p>
     <w:p>
@@ -15581,7 +17374,29 @@
           <w:szCs w:val="28"/>
           <w:lang w:val="hu-HU"/>
         </w:rPr>
-        <w:t xml:space="preserve">sikeres bejelentkezés esetén a token generálását, </w:t>
+        <w:t xml:space="preserve">sikeres bejelentkezés esetén a </w:t>
+      </w:r>
+      <w:proofErr w:type="spellStart"/>
+      <w:r>
+        <w:rPr>
+          <w:rFonts w:ascii="Times New Roman" w:hAnsi="Times New Roman" w:cs="Times New Roman"/>
+          <w:color w:val="000000" w:themeColor="text1"/>
+          <w:sz w:val="28"/>
+          <w:szCs w:val="28"/>
+          <w:lang w:val="hu-HU"/>
+        </w:rPr>
+        <w:t>token</w:t>
+      </w:r>
+      <w:proofErr w:type="spellEnd"/>
+      <w:r>
+        <w:rPr>
+          <w:rFonts w:ascii="Times New Roman" w:hAnsi="Times New Roman" w:cs="Times New Roman"/>
+          <w:color w:val="000000" w:themeColor="text1"/>
+          <w:sz w:val="28"/>
+          <w:szCs w:val="28"/>
+          <w:lang w:val="hu-HU"/>
+        </w:rPr>
+        <w:t xml:space="preserve"> generálását, </w:t>
       </w:r>
     </w:p>
     <w:p>
@@ -15607,7 +17422,29 @@
           <w:szCs w:val="28"/>
           <w:lang w:val="hu-HU"/>
         </w:rPr>
-        <w:t xml:space="preserve">a token helyes tárolását a böngészőben, </w:t>
+        <w:t xml:space="preserve">a </w:t>
+      </w:r>
+      <w:proofErr w:type="spellStart"/>
+      <w:r>
+        <w:rPr>
+          <w:rFonts w:ascii="Times New Roman" w:hAnsi="Times New Roman" w:cs="Times New Roman"/>
+          <w:color w:val="000000" w:themeColor="text1"/>
+          <w:sz w:val="28"/>
+          <w:szCs w:val="28"/>
+          <w:lang w:val="hu-HU"/>
+        </w:rPr>
+        <w:t>token</w:t>
+      </w:r>
+      <w:proofErr w:type="spellEnd"/>
+      <w:r>
+        <w:rPr>
+          <w:rFonts w:ascii="Times New Roman" w:hAnsi="Times New Roman" w:cs="Times New Roman"/>
+          <w:color w:val="000000" w:themeColor="text1"/>
+          <w:sz w:val="28"/>
+          <w:szCs w:val="28"/>
+          <w:lang w:val="hu-HU"/>
+        </w:rPr>
+        <w:t xml:space="preserve"> helyes tárolását a böngészőben, </w:t>
       </w:r>
     </w:p>
     <w:p>
@@ -15681,7 +17518,29 @@
           <w:szCs w:val="28"/>
           <w:lang w:val="hu-HU"/>
         </w:rPr>
-        <w:t xml:space="preserve">hibás jelszó esetén a rendszer 401 (Unauthorized) hibát ad vissza, </w:t>
+        <w:t>hibás jelszó esetén a rendszer 401 (</w:t>
+      </w:r>
+      <w:proofErr w:type="spellStart"/>
+      <w:r>
+        <w:rPr>
+          <w:rFonts w:ascii="Times New Roman" w:hAnsi="Times New Roman" w:cs="Times New Roman"/>
+          <w:color w:val="000000" w:themeColor="text1"/>
+          <w:sz w:val="28"/>
+          <w:szCs w:val="28"/>
+          <w:lang w:val="hu-HU"/>
+        </w:rPr>
+        <w:t>Unauthorized</w:t>
+      </w:r>
+      <w:proofErr w:type="spellEnd"/>
+      <w:r>
+        <w:rPr>
+          <w:rFonts w:ascii="Times New Roman" w:hAnsi="Times New Roman" w:cs="Times New Roman"/>
+          <w:color w:val="000000" w:themeColor="text1"/>
+          <w:sz w:val="28"/>
+          <w:szCs w:val="28"/>
+          <w:lang w:val="hu-HU"/>
+        </w:rPr>
+        <w:t xml:space="preserve">) hibát ad vissza, </w:t>
       </w:r>
     </w:p>
     <w:p>
@@ -15707,7 +17566,29 @@
           <w:szCs w:val="28"/>
           <w:lang w:val="hu-HU"/>
         </w:rPr>
-        <w:t xml:space="preserve">hiányzó token esetén a rendszer nem engedélyezi a műveletet. </w:t>
+        <w:t xml:space="preserve">hiányzó </w:t>
+      </w:r>
+      <w:proofErr w:type="spellStart"/>
+      <w:r>
+        <w:rPr>
+          <w:rFonts w:ascii="Times New Roman" w:hAnsi="Times New Roman" w:cs="Times New Roman"/>
+          <w:color w:val="000000" w:themeColor="text1"/>
+          <w:sz w:val="28"/>
+          <w:szCs w:val="28"/>
+          <w:lang w:val="hu-HU"/>
+        </w:rPr>
+        <w:t>token</w:t>
+      </w:r>
+      <w:proofErr w:type="spellEnd"/>
+      <w:r>
+        <w:rPr>
+          <w:rFonts w:ascii="Times New Roman" w:hAnsi="Times New Roman" w:cs="Times New Roman"/>
+          <w:color w:val="000000" w:themeColor="text1"/>
+          <w:sz w:val="28"/>
+          <w:szCs w:val="28"/>
+          <w:lang w:val="hu-HU"/>
+        </w:rPr>
+        <w:t xml:space="preserve"> esetén a rendszer nem engedélyezi a műveletet. </w:t>
       </w:r>
     </w:p>
     <w:p>
@@ -15751,7 +17632,7 @@
           <w:lang w:val="hu-HU"/>
         </w:rPr>
         <w:pict w14:anchorId="409F5CF2">
-          <v:rect id="_x0000_i1081" style="width:0;height:1.5pt" o:hralign="center" o:hrstd="t" o:hr="t" fillcolor="#a0a0a0" stroked="f"/>
+          <v:rect id="_x0000_i1080" style="width:0;height:1.5pt" o:hralign="center" o:hrstd="t" o:hr="t" fillcolor="#a0a0a0" stroked="f"/>
         </w:pict>
       </w:r>
     </w:p>
@@ -15984,7 +17865,7 @@
           <w:lang w:val="hu-HU"/>
         </w:rPr>
         <w:pict w14:anchorId="3CBD89AE">
-          <v:rect id="_x0000_i1082" style="width:0;height:1.5pt" o:hralign="center" o:hrstd="t" o:hr="t" fillcolor="#a0a0a0" stroked="f"/>
+          <v:rect id="_x0000_i1081" style="width:0;height:1.5pt" o:hralign="center" o:hrstd="t" o:hr="t" fillcolor="#a0a0a0" stroked="f"/>
         </w:pict>
       </w:r>
     </w:p>
@@ -16039,7 +17920,7 @@
         </w:rPr>
         <w:lastRenderedPageBreak/>
         <w:pict w14:anchorId="725AE5A6">
-          <v:rect id="_x0000_i1083" style="width:0;height:1.5pt" o:hralign="center" o:hrstd="t" o:hr="t" fillcolor="#a0a0a0" stroked="f"/>
+          <v:rect id="_x0000_i1082" style="width:0;height:1.5pt" o:hralign="center" o:hrstd="t" o:hr="t" fillcolor="#a0a0a0" stroked="f"/>
         </w:pict>
       </w:r>
     </w:p>
@@ -16130,7 +18011,51 @@
           <w:szCs w:val="28"/>
           <w:lang w:val="hu-HU"/>
         </w:rPr>
-        <w:t xml:space="preserve">hogy a token megfelelően kerül-e tárolásra a LocalStorage-ben, </w:t>
+        <w:t xml:space="preserve">hogy a </w:t>
+      </w:r>
+      <w:proofErr w:type="spellStart"/>
+      <w:r>
+        <w:rPr>
+          <w:rFonts w:ascii="Times New Roman" w:hAnsi="Times New Roman" w:cs="Times New Roman"/>
+          <w:color w:val="000000" w:themeColor="text1"/>
+          <w:sz w:val="28"/>
+          <w:szCs w:val="28"/>
+          <w:lang w:val="hu-HU"/>
+        </w:rPr>
+        <w:t>token</w:t>
+      </w:r>
+      <w:proofErr w:type="spellEnd"/>
+      <w:r>
+        <w:rPr>
+          <w:rFonts w:ascii="Times New Roman" w:hAnsi="Times New Roman" w:cs="Times New Roman"/>
+          <w:color w:val="000000" w:themeColor="text1"/>
+          <w:sz w:val="28"/>
+          <w:szCs w:val="28"/>
+          <w:lang w:val="hu-HU"/>
+        </w:rPr>
+        <w:t xml:space="preserve"> megfelelően kerül-e tárolásra a </w:t>
+      </w:r>
+      <w:proofErr w:type="spellStart"/>
+      <w:r>
+        <w:rPr>
+          <w:rFonts w:ascii="Times New Roman" w:hAnsi="Times New Roman" w:cs="Times New Roman"/>
+          <w:color w:val="000000" w:themeColor="text1"/>
+          <w:sz w:val="28"/>
+          <w:szCs w:val="28"/>
+          <w:lang w:val="hu-HU"/>
+        </w:rPr>
+        <w:t>LocalStorage</w:t>
+      </w:r>
+      <w:proofErr w:type="spellEnd"/>
+      <w:r>
+        <w:rPr>
+          <w:rFonts w:ascii="Times New Roman" w:hAnsi="Times New Roman" w:cs="Times New Roman"/>
+          <w:color w:val="000000" w:themeColor="text1"/>
+          <w:sz w:val="28"/>
+          <w:szCs w:val="28"/>
+          <w:lang w:val="hu-HU"/>
+        </w:rPr>
+        <w:t xml:space="preserve">-ben, </w:t>
       </w:r>
     </w:p>
     <w:p>
@@ -16236,7 +18161,7 @@
           <w:lang w:val="hu-HU"/>
         </w:rPr>
         <w:pict w14:anchorId="4E57A2EA">
-          <v:rect id="_x0000_i1084" style="width:0;height:1.5pt" o:hralign="center" o:hrstd="t" o:hr="t" fillcolor="#a0a0a0" stroked="f"/>
+          <v:rect id="_x0000_i1083" style="width:0;height:1.5pt" o:hralign="center" o:hrstd="t" o:hr="t" fillcolor="#a0a0a0" stroked="f"/>
         </w:pict>
       </w:r>
     </w:p>
@@ -16353,7 +18278,29 @@
           <w:szCs w:val="28"/>
           <w:lang w:val="hu-HU"/>
         </w:rPr>
-        <w:t xml:space="preserve">az adatáramlást a rendszer különböző rétegei között, </w:t>
+        <w:t xml:space="preserve">az adatáramlást a rendszer különböző </w:t>
+      </w:r>
+      <w:proofErr w:type="spellStart"/>
+      <w:r>
+        <w:rPr>
+          <w:rFonts w:ascii="Times New Roman" w:hAnsi="Times New Roman" w:cs="Times New Roman"/>
+          <w:color w:val="000000" w:themeColor="text1"/>
+          <w:sz w:val="28"/>
+          <w:szCs w:val="28"/>
+          <w:lang w:val="hu-HU"/>
+        </w:rPr>
+        <w:t>rétegei</w:t>
+      </w:r>
+      <w:proofErr w:type="spellEnd"/>
+      <w:r>
+        <w:rPr>
+          <w:rFonts w:ascii="Times New Roman" w:hAnsi="Times New Roman" w:cs="Times New Roman"/>
+          <w:color w:val="000000" w:themeColor="text1"/>
+          <w:sz w:val="28"/>
+          <w:szCs w:val="28"/>
+          <w:lang w:val="hu-HU"/>
+        </w:rPr>
+        <w:t xml:space="preserve"> között, </w:t>
       </w:r>
     </w:p>
     <w:p>
@@ -16401,7 +18348,29 @@
           <w:szCs w:val="28"/>
           <w:lang w:val="hu-HU"/>
         </w:rPr>
-        <w:t>Ez a tesztelési szint biztosítja, hogy a rendszer egésze hibamentesen működjön.</w:t>
+        <w:t xml:space="preserve">Ez a tesztelési szint biztosítja, hogy a rendszer egésze hibamentesen </w:t>
+      </w:r>
+      <w:proofErr w:type="spellStart"/>
+      <w:r>
+        <w:rPr>
+          <w:rFonts w:ascii="Times New Roman" w:hAnsi="Times New Roman" w:cs="Times New Roman"/>
+          <w:color w:val="000000" w:themeColor="text1"/>
+          <w:sz w:val="28"/>
+          <w:szCs w:val="28"/>
+          <w:lang w:val="hu-HU"/>
+        </w:rPr>
+        <w:t>működjön</w:t>
+      </w:r>
+      <w:proofErr w:type="spellEnd"/>
+      <w:r>
+        <w:rPr>
+          <w:rFonts w:ascii="Times New Roman" w:hAnsi="Times New Roman" w:cs="Times New Roman"/>
+          <w:color w:val="000000" w:themeColor="text1"/>
+          <w:sz w:val="28"/>
+          <w:szCs w:val="28"/>
+          <w:lang w:val="hu-HU"/>
+        </w:rPr>
+        <w:t>.</w:t>
       </w:r>
     </w:p>
     <w:p>
@@ -16423,12 +18392,144 @@
           <w:lang w:val="hu-HU"/>
         </w:rPr>
         <w:pict w14:anchorId="1311C885">
+          <v:rect id="_x0000_i1084" style="width:0;height:1.5pt" o:hralign="center" o:hrstd="t" o:hr="t" fillcolor="#a0a0a0" stroked="f"/>
+        </w:pict>
+      </w:r>
+    </w:p>
+    <w:p>
+      <w:pPr>
+        <w:spacing w:before="0"/>
+        <w:rPr>
+          <w:rFonts w:ascii="Times New Roman" w:hAnsi="Times New Roman" w:cs="Times New Roman"/>
+          <w:color w:val="000000" w:themeColor="text1"/>
+          <w:sz w:val="28"/>
+          <w:szCs w:val="28"/>
+          <w:lang w:val="hu-HU"/>
+        </w:rPr>
+      </w:pPr>
+    </w:p>
+    <w:p>
+      <w:pPr>
+        <w:spacing w:before="0"/>
+        <w:rPr>
+          <w:rFonts w:ascii="Times New Roman" w:hAnsi="Times New Roman" w:cs="Times New Roman"/>
+          <w:color w:val="000000" w:themeColor="text1"/>
+          <w:sz w:val="28"/>
+          <w:szCs w:val="28"/>
+          <w:lang w:val="hu-HU"/>
+        </w:rPr>
+      </w:pPr>
+    </w:p>
+    <w:p>
+      <w:pPr>
+        <w:spacing w:before="0"/>
+        <w:rPr>
+          <w:rFonts w:ascii="Times New Roman" w:hAnsi="Times New Roman" w:cs="Times New Roman"/>
+          <w:color w:val="000000" w:themeColor="text1"/>
+          <w:sz w:val="28"/>
+          <w:szCs w:val="28"/>
+          <w:lang w:val="hu-HU"/>
+        </w:rPr>
+      </w:pPr>
+    </w:p>
+    <w:p>
+      <w:pPr>
+        <w:spacing w:before="0"/>
+        <w:rPr>
+          <w:rFonts w:ascii="Times New Roman" w:hAnsi="Times New Roman" w:cs="Times New Roman"/>
+          <w:color w:val="000000" w:themeColor="text1"/>
+          <w:sz w:val="28"/>
+          <w:szCs w:val="28"/>
+          <w:lang w:val="hu-HU"/>
+        </w:rPr>
+      </w:pPr>
+    </w:p>
+    <w:p>
+      <w:pPr>
+        <w:spacing w:before="0"/>
+        <w:rPr>
+          <w:rFonts w:ascii="Times New Roman" w:hAnsi="Times New Roman" w:cs="Times New Roman"/>
+          <w:color w:val="000000" w:themeColor="text1"/>
+          <w:sz w:val="28"/>
+          <w:szCs w:val="28"/>
+          <w:lang w:val="hu-HU"/>
+        </w:rPr>
+      </w:pPr>
+      <w:r>
+        <w:rPr>
+          <w:rFonts w:ascii="Times New Roman" w:hAnsi="Times New Roman" w:cs="Times New Roman"/>
+          <w:color w:val="000000" w:themeColor="text1"/>
+          <w:sz w:val="28"/>
+          <w:szCs w:val="28"/>
+          <w:lang w:val="hu-HU"/>
+        </w:rPr>
+        <w:lastRenderedPageBreak/>
+        <w:pict w14:anchorId="3B6B9EBE">
           <v:rect id="_x0000_i1085" style="width:0;height:1.5pt" o:hralign="center" o:hrstd="t" o:hr="t" fillcolor="#a0a0a0" stroked="f"/>
         </w:pict>
       </w:r>
     </w:p>
     <w:p>
       <w:pPr>
+        <w:pStyle w:val="Cmsor1"/>
+        <w:framePr w:wrap="around"/>
+        <w:rPr>
+          <w:szCs w:val="32"/>
+        </w:rPr>
+      </w:pPr>
+      <w:bookmarkStart w:id="50" w:name="_Toc228378829"/>
+      <w:r>
+        <w:rPr>
+          <w:szCs w:val="32"/>
+        </w:rPr>
+        <w:t xml:space="preserve">11. </w:t>
+      </w:r>
+      <w:proofErr w:type="spellStart"/>
+      <w:r>
+        <w:rPr>
+          <w:szCs w:val="32"/>
+        </w:rPr>
+        <w:t>Teljes</w:t>
+      </w:r>
+      <w:proofErr w:type="spellEnd"/>
+      <w:r>
+        <w:rPr>
+          <w:szCs w:val="32"/>
+        </w:rPr>
+        <w:t xml:space="preserve"> </w:t>
+      </w:r>
+      <w:proofErr w:type="spellStart"/>
+      <w:r>
+        <w:rPr>
+          <w:szCs w:val="32"/>
+        </w:rPr>
+        <w:t>működési</w:t>
+      </w:r>
+      <w:proofErr w:type="spellEnd"/>
+      <w:r>
+        <w:rPr>
+          <w:szCs w:val="32"/>
+        </w:rPr>
+        <w:t xml:space="preserve"> </w:t>
+      </w:r>
+      <w:proofErr w:type="spellStart"/>
+      <w:r>
+        <w:rPr>
+          <w:szCs w:val="32"/>
+        </w:rPr>
+        <w:t>folyamat</w:t>
+      </w:r>
+      <w:bookmarkEnd w:id="50"/>
+      <w:proofErr w:type="spellEnd"/>
+      <w:r>
+        <w:rPr>
+          <w:szCs w:val="32"/>
+        </w:rPr>
+        <w:t xml:space="preserve"> </w:t>
+      </w:r>
+    </w:p>
+    <w:p>
+      <w:pPr>
         <w:spacing w:before="0"/>
         <w:rPr>
           <w:rFonts w:ascii="Times New Roman" w:hAnsi="Times New Roman" w:cs="Times New Roman"/>
@@ -16462,6 +18563,16 @@
           <w:lang w:val="hu-HU"/>
         </w:rPr>
       </w:pPr>
+      <w:r>
+        <w:rPr>
+          <w:rFonts w:ascii="Times New Roman" w:hAnsi="Times New Roman" w:cs="Times New Roman"/>
+          <w:color w:val="000000" w:themeColor="text1"/>
+          <w:sz w:val="28"/>
+          <w:szCs w:val="28"/>
+          <w:lang w:val="hu-HU"/>
+        </w:rPr>
+        <w:t>A rendszer működésének megértéséhez fontos egy teljes folyamat részletes vizsgálata. Az alábbiakban egy rendelési folyamat kerül bemutatásra, amely jól szemlélteti a rendszer működését.</w:t>
+      </w:r>
     </w:p>
     <w:p>
       <w:pPr>
@@ -16474,6 +18585,16 @@
           <w:lang w:val="hu-HU"/>
         </w:rPr>
       </w:pPr>
+      <w:r>
+        <w:rPr>
+          <w:rFonts w:ascii="Times New Roman" w:hAnsi="Times New Roman" w:cs="Times New Roman"/>
+          <w:color w:val="000000" w:themeColor="text1"/>
+          <w:sz w:val="28"/>
+          <w:szCs w:val="28"/>
+          <w:lang w:val="hu-HU"/>
+        </w:rPr>
+        <w:t>A folyamat során a frontend, backend és adatbázis folyamatos együttműködésben dolgozik.</w:t>
+      </w:r>
     </w:p>
     <w:p>
       <w:pPr>
@@ -16494,8 +18615,114 @@
           <w:szCs w:val="28"/>
           <w:lang w:val="hu-HU"/>
         </w:rPr>
-        <w:lastRenderedPageBreak/>
-        <w:pict w14:anchorId="3B6B9EBE">
+        <w:t xml:space="preserve">A felhasználó először kiválaszt egy terméket a felületen. Ekkor a frontend egy </w:t>
+      </w:r>
+      <w:r>
+        <w:rPr>
+          <w:rFonts w:ascii="Times New Roman" w:hAnsi="Times New Roman" w:cs="Times New Roman"/>
+          <w:color w:val="000000" w:themeColor="text1"/>
+          <w:sz w:val="28"/>
+          <w:szCs w:val="28"/>
+          <w:lang w:val="hu-HU"/>
+        </w:rPr>
+        <w:t>http</w:t>
+      </w:r>
+      <w:r>
+        <w:rPr>
+          <w:rFonts w:ascii="Times New Roman" w:hAnsi="Times New Roman" w:cs="Times New Roman"/>
+          <w:color w:val="000000" w:themeColor="text1"/>
+          <w:sz w:val="28"/>
+          <w:szCs w:val="28"/>
+          <w:lang w:val="hu-HU"/>
+        </w:rPr>
+        <w:t xml:space="preserve"> kérést küld a backend felé, amely lekérdezi az adatbázisból a szükséges információkat. Az adatok JSON formátumban visszakerülnek a frontendhez, ahol megjelenítésre kerülnek.</w:t>
+      </w:r>
+    </w:p>
+    <w:p>
+      <w:pPr>
+        <w:spacing w:before="0"/>
+        <w:rPr>
+          <w:rFonts w:ascii="Times New Roman" w:hAnsi="Times New Roman" w:cs="Times New Roman"/>
+          <w:color w:val="000000" w:themeColor="text1"/>
+          <w:sz w:val="28"/>
+          <w:szCs w:val="28"/>
+          <w:lang w:val="hu-HU"/>
+        </w:rPr>
+      </w:pPr>
+      <w:r>
+        <w:rPr>
+          <w:rFonts w:ascii="Times New Roman" w:hAnsi="Times New Roman" w:cs="Times New Roman"/>
+          <w:color w:val="000000" w:themeColor="text1"/>
+          <w:sz w:val="28"/>
+          <w:szCs w:val="28"/>
+          <w:lang w:val="hu-HU"/>
+        </w:rPr>
+        <w:t>Amikor a felhasználó rendelést ad le, a frontend elküldi a szükséges adatokat a backendnek, amely ellenőrzi a jogosultságokat és a készletet. Ezt követően az adatbázisban létrejön egy új rendelés, valamint a hozzá tartozó tételek.</w:t>
+      </w:r>
+    </w:p>
+    <w:p>
+      <w:pPr>
+        <w:spacing w:before="0"/>
+        <w:rPr>
+          <w:rFonts w:ascii="Times New Roman" w:hAnsi="Times New Roman" w:cs="Times New Roman"/>
+          <w:color w:val="000000" w:themeColor="text1"/>
+          <w:sz w:val="28"/>
+          <w:szCs w:val="28"/>
+          <w:lang w:val="hu-HU"/>
+        </w:rPr>
+      </w:pPr>
+      <w:r>
+        <w:rPr>
+          <w:rFonts w:ascii="Times New Roman" w:hAnsi="Times New Roman" w:cs="Times New Roman"/>
+          <w:color w:val="000000" w:themeColor="text1"/>
+          <w:sz w:val="28"/>
+          <w:szCs w:val="28"/>
+          <w:lang w:val="hu-HU"/>
+        </w:rPr>
+        <w:t>A folyamat végén a backend visszajelzést küld, amelyet a frontend megjelenít a felhasználó számára.</w:t>
+      </w:r>
+    </w:p>
+    <w:p>
+      <w:pPr>
+        <w:spacing w:before="0"/>
+        <w:rPr>
+          <w:rFonts w:ascii="Times New Roman" w:hAnsi="Times New Roman" w:cs="Times New Roman"/>
+          <w:color w:val="000000" w:themeColor="text1"/>
+          <w:sz w:val="28"/>
+          <w:szCs w:val="28"/>
+          <w:lang w:val="hu-HU"/>
+        </w:rPr>
+      </w:pPr>
+      <w:r>
+        <w:rPr>
+          <w:rFonts w:ascii="Times New Roman" w:hAnsi="Times New Roman" w:cs="Times New Roman"/>
+          <w:color w:val="000000" w:themeColor="text1"/>
+          <w:sz w:val="28"/>
+          <w:szCs w:val="28"/>
+          <w:lang w:val="hu-HU"/>
+        </w:rPr>
+        <w:t>Ez a működés jól mutatja, hogy a rendszer nem statikus, hanem valós idejű adatfeldolgozásra képes.</w:t>
+      </w:r>
+    </w:p>
+    <w:p>
+      <w:pPr>
+        <w:rPr>
+          <w:rFonts w:ascii="Times New Roman" w:hAnsi="Times New Roman" w:cs="Times New Roman"/>
+          <w:color w:val="000000" w:themeColor="text1"/>
+          <w:sz w:val="28"/>
+          <w:szCs w:val="28"/>
+          <w:lang w:val="hu-HU"/>
+        </w:rPr>
+      </w:pPr>
+      <w:r>
+        <w:rPr>
+          <w:rFonts w:ascii="Times New Roman" w:hAnsi="Times New Roman" w:cs="Times New Roman"/>
+          <w:color w:val="000000" w:themeColor="text1"/>
+          <w:sz w:val="28"/>
+          <w:szCs w:val="28"/>
+          <w:lang w:val="hu-HU"/>
+        </w:rPr>
+        <w:pict w14:anchorId="2C46642B">
           <v:rect id="_x0000_i1086" style="width:0;height:1.5pt" o:hralign="center" o:hrstd="t" o:hr="t" fillcolor="#a0a0a0" stroked="f"/>
         </w:pict>
       </w:r>
@@ -16508,20 +18735,50 @@
           <w:szCs w:val="32"/>
         </w:rPr>
       </w:pPr>
-      <w:bookmarkStart w:id="50" w:name="_Toc228378829"/>
+      <w:bookmarkStart w:id="51" w:name="_Toc228378830"/>
       <w:r>
         <w:rPr>
           <w:szCs w:val="32"/>
         </w:rPr>
-        <w:t>11. Teljes működési folyamat</w:t>
-      </w:r>
-      <w:bookmarkEnd w:id="50"/>
+        <w:t xml:space="preserve">12. </w:t>
+      </w:r>
+      <w:proofErr w:type="spellStart"/>
       <w:r>
         <w:rPr>
           <w:szCs w:val="32"/>
         </w:rPr>
+        <w:t>Adatbiztonság</w:t>
+      </w:r>
+      <w:proofErr w:type="spellEnd"/>
+      <w:r>
+        <w:rPr>
+          <w:szCs w:val="32"/>
+        </w:rPr>
         <w:t xml:space="preserve"> </w:t>
       </w:r>
+      <w:proofErr w:type="spellStart"/>
+      <w:r>
+        <w:rPr>
+          <w:szCs w:val="32"/>
+        </w:rPr>
+        <w:t>és</w:t>
+      </w:r>
+      <w:proofErr w:type="spellEnd"/>
+      <w:r>
+        <w:rPr>
+          <w:szCs w:val="32"/>
+        </w:rPr>
+        <w:t xml:space="preserve"> </w:t>
+      </w:r>
+      <w:proofErr w:type="spellStart"/>
+      <w:r>
+        <w:rPr>
+          <w:szCs w:val="32"/>
+        </w:rPr>
+        <w:t>védelem</w:t>
+      </w:r>
+      <w:bookmarkEnd w:id="51"/>
+      <w:proofErr w:type="spellEnd"/>
     </w:p>
     <w:p>
       <w:pPr>
@@ -16566,7 +18823,7 @@
           <w:szCs w:val="28"/>
           <w:lang w:val="hu-HU"/>
         </w:rPr>
-        <w:t>A rendszer működésének megértéséhez fontos egy teljes folyamat részletes vizsgálata. Az alábbiakban egy rendelési folyamat kerül bemutatásra, amely jól szemlélteti a rendszer működését.</w:t>
+        <w:t>A modern webalkalmazások esetében kiemelten fontos az adatbiztonság, különösen akkor, ha a rendszer felhasználói adatokat és tranzakciókat kezel.</w:t>
       </w:r>
     </w:p>
     <w:p>
@@ -16588,7 +18845,29 @@
           <w:szCs w:val="28"/>
           <w:lang w:val="hu-HU"/>
         </w:rPr>
-        <w:t>A folyamat során a frontend, backend és adatbázis folyamatos együttműködésben dolgozik.</w:t>
+        <w:t xml:space="preserve">A </w:t>
+      </w:r>
+      <w:proofErr w:type="spellStart"/>
+      <w:r>
+        <w:rPr>
+          <w:rFonts w:ascii="Times New Roman" w:hAnsi="Times New Roman" w:cs="Times New Roman"/>
+          <w:color w:val="000000" w:themeColor="text1"/>
+          <w:sz w:val="28"/>
+          <w:szCs w:val="28"/>
+          <w:lang w:val="hu-HU"/>
+        </w:rPr>
+        <w:t>RaktárPro</w:t>
+      </w:r>
+      <w:proofErr w:type="spellEnd"/>
+      <w:r>
+        <w:rPr>
+          <w:rFonts w:ascii="Times New Roman" w:hAnsi="Times New Roman" w:cs="Times New Roman"/>
+          <w:color w:val="000000" w:themeColor="text1"/>
+          <w:sz w:val="28"/>
+          <w:szCs w:val="28"/>
+          <w:lang w:val="hu-HU"/>
+        </w:rPr>
+        <w:t xml:space="preserve"> rendszer több szinten biztosítja az adatok védelmét.</w:t>
       </w:r>
     </w:p>
     <w:p>
@@ -16610,27 +18889,8 @@
           <w:szCs w:val="28"/>
           <w:lang w:val="hu-HU"/>
         </w:rPr>
-        <w:t xml:space="preserve">A felhasználó először kiválaszt egy terméket a felületen. Ekkor a frontend egy </w:t>
-      </w:r>
-      <w:r>
-        <w:rPr>
-          <w:rFonts w:ascii="Times New Roman" w:hAnsi="Times New Roman" w:cs="Times New Roman"/>
-          <w:color w:val="000000" w:themeColor="text1"/>
-          <w:sz w:val="28"/>
-          <w:szCs w:val="28"/>
-          <w:lang w:val="hu-HU"/>
-        </w:rPr>
-        <w:t>http</w:t>
-      </w:r>
-      <w:r>
-        <w:rPr>
-          <w:rFonts w:ascii="Times New Roman" w:hAnsi="Times New Roman" w:cs="Times New Roman"/>
-          <w:color w:val="000000" w:themeColor="text1"/>
-          <w:sz w:val="28"/>
-          <w:szCs w:val="28"/>
-          <w:lang w:val="hu-HU"/>
-        </w:rPr>
-        <w:t xml:space="preserve"> kérést küld a backend felé, amely lekérdezi az adatbázisból a szükséges információkat. Az adatok JSON formátumban visszakerülnek a frontendhez, ahol megjelenítésre kerülnek.</w:t>
+        <w:lastRenderedPageBreak/>
+        <w:t>Az egyik legfontosabb elem a jelszavak biztonságos kezelése. A jelszavak nem kerülnek tárolásra nyílt formában, hanem titkosított módon vannak elmentve az adatbázisban, így azok közvetlenül nem olvashatók ki.</w:t>
       </w:r>
     </w:p>
     <w:p>
@@ -16652,7 +18912,29 @@
           <w:szCs w:val="28"/>
           <w:lang w:val="hu-HU"/>
         </w:rPr>
-        <w:t>Amikor a felhasználó rendelést ad le, a frontend elküldi a szükséges adatokat a backendnek, amely ellenőrzi a jogosultságokat és a készletet. Ezt követően az adatbázisban létrejön egy új rendelés, valamint a hozzá tartozó tételek.</w:t>
+        <w:t xml:space="preserve">A rendszer JWT </w:t>
+      </w:r>
+      <w:proofErr w:type="spellStart"/>
+      <w:r>
+        <w:rPr>
+          <w:rFonts w:ascii="Times New Roman" w:hAnsi="Times New Roman" w:cs="Times New Roman"/>
+          <w:color w:val="000000" w:themeColor="text1"/>
+          <w:sz w:val="28"/>
+          <w:szCs w:val="28"/>
+          <w:lang w:val="hu-HU"/>
+        </w:rPr>
+        <w:t>token</w:t>
+      </w:r>
+      <w:proofErr w:type="spellEnd"/>
+      <w:r>
+        <w:rPr>
+          <w:rFonts w:ascii="Times New Roman" w:hAnsi="Times New Roman" w:cs="Times New Roman"/>
+          <w:color w:val="000000" w:themeColor="text1"/>
+          <w:sz w:val="28"/>
+          <w:szCs w:val="28"/>
+          <w:lang w:val="hu-HU"/>
+        </w:rPr>
+        <w:t xml:space="preserve"> alapú hitelesítést alkalmaz, amely biztosítja, hogy minden kérés egyértelműen azonosítható felhasználóhoz köthető. Ez megakadályozza az illetéktelen hozzáférést.</w:t>
       </w:r>
     </w:p>
     <w:p>
@@ -16674,7 +18956,7 @@
           <w:szCs w:val="28"/>
           <w:lang w:val="hu-HU"/>
         </w:rPr>
-        <w:t>A folyamat végén a backend visszajelzést küld, amelyet a frontend megjelenít a felhasználó számára.</w:t>
+        <w:t>A backend minden beérkező kérést ellenőriz, és csak a megfelelő jogosultsággal rendelkező felhasználók számára engedélyezi a műveleteket.</w:t>
       </w:r>
     </w:p>
     <w:p>
@@ -16696,28 +18978,28 @@
           <w:szCs w:val="28"/>
           <w:lang w:val="hu-HU"/>
         </w:rPr>
-        <w:t>Ez a működés jól mutatja, hogy a rendszer nem statikus, hanem valós idejű adatfeldolgozásra képes.</w:t>
-      </w:r>
-    </w:p>
-    <w:p>
-      <w:pPr>
-        <w:rPr>
-          <w:rFonts w:ascii="Times New Roman" w:hAnsi="Times New Roman" w:cs="Times New Roman"/>
-          <w:color w:val="000000" w:themeColor="text1"/>
-          <w:sz w:val="28"/>
-          <w:szCs w:val="28"/>
-          <w:lang w:val="hu-HU"/>
-        </w:rPr>
-      </w:pPr>
-      <w:r>
-        <w:rPr>
-          <w:rFonts w:ascii="Times New Roman" w:hAnsi="Times New Roman" w:cs="Times New Roman"/>
-          <w:color w:val="000000" w:themeColor="text1"/>
-          <w:sz w:val="28"/>
-          <w:szCs w:val="28"/>
-          <w:lang w:val="hu-HU"/>
-        </w:rPr>
-        <w:pict w14:anchorId="2C46642B">
+        <w:t>Emellett a rendszer hibakezelése is hozzájárul a biztonsághoz, mivel nem ad ki érzékeny információkat a felhasználónak hiba esetén.</w:t>
+      </w:r>
+    </w:p>
+    <w:p>
+      <w:pPr>
+        <w:rPr>
+          <w:rFonts w:ascii="Times New Roman" w:hAnsi="Times New Roman" w:cs="Times New Roman"/>
+          <w:color w:val="000000" w:themeColor="text1"/>
+          <w:sz w:val="28"/>
+          <w:szCs w:val="28"/>
+          <w:lang w:val="hu-HU"/>
+        </w:rPr>
+      </w:pPr>
+      <w:r>
+        <w:rPr>
+          <w:rFonts w:ascii="Times New Roman" w:hAnsi="Times New Roman" w:cs="Times New Roman"/>
+          <w:color w:val="000000" w:themeColor="text1"/>
+          <w:sz w:val="28"/>
+          <w:szCs w:val="28"/>
+          <w:lang w:val="hu-HU"/>
+        </w:rPr>
+        <w:pict w14:anchorId="237D94E6">
           <v:rect id="_x0000_i1087" style="width:0;height:1.5pt" o:hralign="center" o:hrstd="t" o:hr="t" fillcolor="#a0a0a0" stroked="f"/>
         </w:pict>
       </w:r>
@@ -16730,211 +19012,50 @@
           <w:szCs w:val="32"/>
         </w:rPr>
       </w:pPr>
-      <w:bookmarkStart w:id="51" w:name="_Toc228378830"/>
+      <w:bookmarkStart w:id="52" w:name="_Toc228378831"/>
       <w:r>
         <w:rPr>
           <w:szCs w:val="32"/>
         </w:rPr>
-        <w:t>12. Adatbiztonság és védelem</w:t>
-      </w:r>
-      <w:bookmarkEnd w:id="51"/>
-    </w:p>
-    <w:p>
-      <w:pPr>
-        <w:spacing w:before="0"/>
-        <w:rPr>
-          <w:rFonts w:ascii="Times New Roman" w:hAnsi="Times New Roman" w:cs="Times New Roman"/>
-          <w:color w:val="000000" w:themeColor="text1"/>
-          <w:sz w:val="28"/>
-          <w:szCs w:val="28"/>
-          <w:lang w:val="hu-HU"/>
-        </w:rPr>
-      </w:pPr>
-    </w:p>
-    <w:p>
-      <w:pPr>
-        <w:spacing w:before="0"/>
-        <w:rPr>
-          <w:rFonts w:ascii="Times New Roman" w:hAnsi="Times New Roman" w:cs="Times New Roman"/>
-          <w:color w:val="000000" w:themeColor="text1"/>
-          <w:sz w:val="28"/>
-          <w:szCs w:val="28"/>
-          <w:lang w:val="hu-HU"/>
-        </w:rPr>
-      </w:pPr>
-    </w:p>
-    <w:p>
-      <w:pPr>
-        <w:spacing w:before="0"/>
-        <w:rPr>
-          <w:rFonts w:ascii="Times New Roman" w:hAnsi="Times New Roman" w:cs="Times New Roman"/>
-          <w:color w:val="000000" w:themeColor="text1"/>
-          <w:sz w:val="28"/>
-          <w:szCs w:val="28"/>
-          <w:lang w:val="hu-HU"/>
-        </w:rPr>
-      </w:pPr>
-      <w:r>
-        <w:rPr>
-          <w:rFonts w:ascii="Times New Roman" w:hAnsi="Times New Roman" w:cs="Times New Roman"/>
-          <w:color w:val="000000" w:themeColor="text1"/>
-          <w:sz w:val="28"/>
-          <w:szCs w:val="28"/>
-          <w:lang w:val="hu-HU"/>
-        </w:rPr>
-        <w:t>A modern webalkalmazások esetében kiemelten fontos az adatbiztonság, különösen akkor, ha a rendszer felhasználói adatokat és tranzakciókat kezel.</w:t>
-      </w:r>
-    </w:p>
-    <w:p>
-      <w:pPr>
-        <w:spacing w:before="0"/>
-        <w:rPr>
-          <w:rFonts w:ascii="Times New Roman" w:hAnsi="Times New Roman" w:cs="Times New Roman"/>
-          <w:color w:val="000000" w:themeColor="text1"/>
-          <w:sz w:val="28"/>
-          <w:szCs w:val="28"/>
-          <w:lang w:val="hu-HU"/>
-        </w:rPr>
-      </w:pPr>
-      <w:r>
-        <w:rPr>
-          <w:rFonts w:ascii="Times New Roman" w:hAnsi="Times New Roman" w:cs="Times New Roman"/>
-          <w:color w:val="000000" w:themeColor="text1"/>
-          <w:sz w:val="28"/>
-          <w:szCs w:val="28"/>
-          <w:lang w:val="hu-HU"/>
-        </w:rPr>
-        <w:t>A RaktárPro rendszer több szinten biztosítja az adatok védelmét.</w:t>
-      </w:r>
-    </w:p>
-    <w:p>
-      <w:pPr>
-        <w:spacing w:before="0"/>
-        <w:rPr>
-          <w:rFonts w:ascii="Times New Roman" w:hAnsi="Times New Roman" w:cs="Times New Roman"/>
-          <w:color w:val="000000" w:themeColor="text1"/>
-          <w:sz w:val="28"/>
-          <w:szCs w:val="28"/>
-          <w:lang w:val="hu-HU"/>
-        </w:rPr>
-      </w:pPr>
-      <w:r>
-        <w:rPr>
-          <w:rFonts w:ascii="Times New Roman" w:hAnsi="Times New Roman" w:cs="Times New Roman"/>
-          <w:color w:val="000000" w:themeColor="text1"/>
-          <w:sz w:val="28"/>
-          <w:szCs w:val="28"/>
-          <w:lang w:val="hu-HU"/>
-        </w:rPr>
-        <w:lastRenderedPageBreak/>
-        <w:t>Az egyik legfontosabb elem a jelszavak biztonságos kezelése. A jelszavak nem kerülnek tárolásra nyílt formában, hanem titkosított módon vannak elmentve az adatbázisban, így azok közvetlenül nem olvashatók ki.</w:t>
-      </w:r>
-    </w:p>
-    <w:p>
-      <w:pPr>
-        <w:spacing w:before="0"/>
-        <w:rPr>
-          <w:rFonts w:ascii="Times New Roman" w:hAnsi="Times New Roman" w:cs="Times New Roman"/>
-          <w:color w:val="000000" w:themeColor="text1"/>
-          <w:sz w:val="28"/>
-          <w:szCs w:val="28"/>
-          <w:lang w:val="hu-HU"/>
-        </w:rPr>
-      </w:pPr>
-      <w:r>
-        <w:rPr>
-          <w:rFonts w:ascii="Times New Roman" w:hAnsi="Times New Roman" w:cs="Times New Roman"/>
-          <w:color w:val="000000" w:themeColor="text1"/>
-          <w:sz w:val="28"/>
-          <w:szCs w:val="28"/>
-          <w:lang w:val="hu-HU"/>
-        </w:rPr>
-        <w:t>A rendszer JWT token alapú hitelesítést alkalmaz, amely biztosítja, hogy minden kérés egyértelműen azonosítható felhasználóhoz köthető. Ez megakadályozza az illetéktelen hozzáférést.</w:t>
-      </w:r>
-    </w:p>
-    <w:p>
-      <w:pPr>
-        <w:spacing w:before="0"/>
-        <w:rPr>
-          <w:rFonts w:ascii="Times New Roman" w:hAnsi="Times New Roman" w:cs="Times New Roman"/>
-          <w:color w:val="000000" w:themeColor="text1"/>
-          <w:sz w:val="28"/>
-          <w:szCs w:val="28"/>
-          <w:lang w:val="hu-HU"/>
-        </w:rPr>
-      </w:pPr>
-      <w:r>
-        <w:rPr>
-          <w:rFonts w:ascii="Times New Roman" w:hAnsi="Times New Roman" w:cs="Times New Roman"/>
-          <w:color w:val="000000" w:themeColor="text1"/>
-          <w:sz w:val="28"/>
-          <w:szCs w:val="28"/>
-          <w:lang w:val="hu-HU"/>
-        </w:rPr>
-        <w:t>A backend minden beérkező kérést ellenőriz, és csak a megfelelő jogosultsággal rendelkező felhasználók számára engedélyezi a műveleteket.</w:t>
-      </w:r>
-    </w:p>
-    <w:p>
-      <w:pPr>
-        <w:spacing w:before="0"/>
-        <w:rPr>
-          <w:rFonts w:ascii="Times New Roman" w:hAnsi="Times New Roman" w:cs="Times New Roman"/>
-          <w:color w:val="000000" w:themeColor="text1"/>
-          <w:sz w:val="28"/>
-          <w:szCs w:val="28"/>
-          <w:lang w:val="hu-HU"/>
-        </w:rPr>
-      </w:pPr>
-      <w:r>
-        <w:rPr>
-          <w:rFonts w:ascii="Times New Roman" w:hAnsi="Times New Roman" w:cs="Times New Roman"/>
-          <w:color w:val="000000" w:themeColor="text1"/>
-          <w:sz w:val="28"/>
-          <w:szCs w:val="28"/>
-          <w:lang w:val="hu-HU"/>
-        </w:rPr>
-        <w:t>Emellett a rendszer hibakezelése is hozzájárul a biztonsághoz, mivel nem ad ki érzékeny információkat a felhasználónak hiba esetén.</w:t>
-      </w:r>
-    </w:p>
-    <w:p>
-      <w:pPr>
-        <w:rPr>
-          <w:rFonts w:ascii="Times New Roman" w:hAnsi="Times New Roman" w:cs="Times New Roman"/>
-          <w:color w:val="000000" w:themeColor="text1"/>
-          <w:sz w:val="28"/>
-          <w:szCs w:val="28"/>
-          <w:lang w:val="hu-HU"/>
-        </w:rPr>
-      </w:pPr>
-      <w:r>
-        <w:rPr>
-          <w:rFonts w:ascii="Times New Roman" w:hAnsi="Times New Roman" w:cs="Times New Roman"/>
-          <w:color w:val="000000" w:themeColor="text1"/>
-          <w:sz w:val="28"/>
-          <w:szCs w:val="28"/>
-          <w:lang w:val="hu-HU"/>
-        </w:rPr>
-        <w:pict w14:anchorId="237D94E6">
-          <v:rect id="_x0000_i1088" style="width:0;height:1.5pt" o:hralign="center" o:hrstd="t" o:hr="t" fillcolor="#a0a0a0" stroked="f"/>
-        </w:pict>
-      </w:r>
-    </w:p>
-    <w:p>
-      <w:pPr>
-        <w:pStyle w:val="Cmsor1"/>
-        <w:framePr w:wrap="around"/>
+        <w:t xml:space="preserve">13. </w:t>
+      </w:r>
+      <w:proofErr w:type="spellStart"/>
+      <w:r>
         <w:rPr>
           <w:szCs w:val="32"/>
         </w:rPr>
-      </w:pPr>
-      <w:bookmarkStart w:id="52" w:name="_Toc228378831"/>
+        <w:t>Jövőbeli</w:t>
+      </w:r>
+      <w:proofErr w:type="spellEnd"/>
       <w:r>
         <w:rPr>
           <w:szCs w:val="32"/>
         </w:rPr>
-        <w:t>13. Jövőbeli fejlesztési lehetőségek</w:t>
+        <w:t xml:space="preserve"> </w:t>
+      </w:r>
+      <w:proofErr w:type="spellStart"/>
+      <w:r>
+        <w:rPr>
+          <w:szCs w:val="32"/>
+        </w:rPr>
+        <w:t>fejlesztési</w:t>
+      </w:r>
+      <w:proofErr w:type="spellEnd"/>
+      <w:r>
+        <w:rPr>
+          <w:szCs w:val="32"/>
+        </w:rPr>
+        <w:t xml:space="preserve"> </w:t>
+      </w:r>
+      <w:proofErr w:type="spellStart"/>
+      <w:r>
+        <w:rPr>
+          <w:szCs w:val="32"/>
+        </w:rPr>
+        <w:t>lehetőségek</w:t>
       </w:r>
       <w:bookmarkEnd w:id="52"/>
+      <w:proofErr w:type="spellEnd"/>
     </w:p>
     <w:p>
       <w:pPr>
@@ -17105,7 +19226,29 @@
           <w:szCs w:val="28"/>
           <w:lang w:val="hu-HU"/>
         </w:rPr>
-        <w:t xml:space="preserve">értesítési rendszer kialakítása (például email vagy push értesítések), </w:t>
+        <w:t xml:space="preserve">értesítési rendszer kialakítása (például email vagy </w:t>
+      </w:r>
+      <w:proofErr w:type="spellStart"/>
+      <w:r>
+        <w:rPr>
+          <w:rFonts w:ascii="Times New Roman" w:hAnsi="Times New Roman" w:cs="Times New Roman"/>
+          <w:color w:val="000000" w:themeColor="text1"/>
+          <w:sz w:val="28"/>
+          <w:szCs w:val="28"/>
+          <w:lang w:val="hu-HU"/>
+        </w:rPr>
+        <w:t>push</w:t>
+      </w:r>
+      <w:proofErr w:type="spellEnd"/>
+      <w:r>
+        <w:rPr>
+          <w:rFonts w:ascii="Times New Roman" w:hAnsi="Times New Roman" w:cs="Times New Roman"/>
+          <w:color w:val="000000" w:themeColor="text1"/>
+          <w:sz w:val="28"/>
+          <w:szCs w:val="28"/>
+          <w:lang w:val="hu-HU"/>
+        </w:rPr>
+        <w:t xml:space="preserve"> értesítések), </w:t>
       </w:r>
     </w:p>
     <w:p>
@@ -17175,36 +19318,36 @@
           <w:lang w:val="hu-HU"/>
         </w:rPr>
         <w:pict w14:anchorId="23C5F5C7">
+          <v:rect id="_x0000_i1088" style="width:0;height:1.5pt" o:hralign="center" o:hrstd="t" o:hr="t" fillcolor="#a0a0a0" stroked="f"/>
+        </w:pict>
+      </w:r>
+    </w:p>
+    <w:p>
+      <w:pPr>
+        <w:rPr>
+          <w:rFonts w:ascii="Times New Roman" w:hAnsi="Times New Roman" w:cs="Times New Roman"/>
+          <w:color w:val="000000" w:themeColor="text1"/>
+          <w:sz w:val="28"/>
+          <w:szCs w:val="28"/>
+          <w:lang w:val="hu-HU"/>
+        </w:rPr>
+      </w:pPr>
+      <w:r>
+        <w:rPr>
+          <w:rFonts w:ascii="Times New Roman" w:hAnsi="Times New Roman" w:cs="Times New Roman"/>
+          <w:color w:val="000000" w:themeColor="text1"/>
+          <w:sz w:val="28"/>
+          <w:szCs w:val="28"/>
+          <w:lang w:val="hu-HU"/>
+        </w:rPr>
+        <w:lastRenderedPageBreak/>
+        <w:pict w14:anchorId="6117C195">
           <v:rect id="_x0000_i1089" style="width:0;height:1.5pt" o:hralign="center" o:hrstd="t" o:hr="t" fillcolor="#a0a0a0" stroked="f"/>
         </w:pict>
       </w:r>
     </w:p>
     <w:p>
       <w:pPr>
-        <w:rPr>
-          <w:rFonts w:ascii="Times New Roman" w:hAnsi="Times New Roman" w:cs="Times New Roman"/>
-          <w:color w:val="000000" w:themeColor="text1"/>
-          <w:sz w:val="28"/>
-          <w:szCs w:val="28"/>
-          <w:lang w:val="hu-HU"/>
-        </w:rPr>
-      </w:pPr>
-      <w:r>
-        <w:rPr>
-          <w:rFonts w:ascii="Times New Roman" w:hAnsi="Times New Roman" w:cs="Times New Roman"/>
-          <w:color w:val="000000" w:themeColor="text1"/>
-          <w:sz w:val="28"/>
-          <w:szCs w:val="28"/>
-          <w:lang w:val="hu-HU"/>
-        </w:rPr>
-        <w:lastRenderedPageBreak/>
-        <w:pict w14:anchorId="6117C195">
-          <v:rect id="_x0000_i1090" style="width:0;height:1.5pt" o:hralign="center" o:hrstd="t" o:hr="t" fillcolor="#a0a0a0" stroked="f"/>
-        </w:pict>
-      </w:r>
-    </w:p>
-    <w:p>
-      <w:pPr>
         <w:pStyle w:val="Cmsor1"/>
         <w:framePr w:wrap="around"/>
         <w:rPr>
@@ -17216,9 +19359,17 @@
         <w:rPr>
           <w:szCs w:val="32"/>
         </w:rPr>
-        <w:t>14. Összegzés</w:t>
+        <w:t xml:space="preserve">14. </w:t>
+      </w:r>
+      <w:proofErr w:type="spellStart"/>
+      <w:r>
+        <w:rPr>
+          <w:szCs w:val="32"/>
+        </w:rPr>
+        <w:t>Összegzés</w:t>
       </w:r>
       <w:bookmarkEnd w:id="53"/>
+      <w:proofErr w:type="spellEnd"/>
     </w:p>
     <w:p>
       <w:pPr>
@@ -17263,7 +19414,29 @@
           <w:szCs w:val="28"/>
           <w:lang w:val="hu-HU"/>
         </w:rPr>
-        <w:t>A RaktárPro projekt során egy komplex, több rétegből álló webalkalmazás került megvalósításra, amely megfelel a modern fejlesztési követelményeknek.</w:t>
+        <w:t xml:space="preserve">A </w:t>
+      </w:r>
+      <w:proofErr w:type="spellStart"/>
+      <w:r>
+        <w:rPr>
+          <w:rFonts w:ascii="Times New Roman" w:hAnsi="Times New Roman" w:cs="Times New Roman"/>
+          <w:color w:val="000000" w:themeColor="text1"/>
+          <w:sz w:val="28"/>
+          <w:szCs w:val="28"/>
+          <w:lang w:val="hu-HU"/>
+        </w:rPr>
+        <w:t>RaktárPro</w:t>
+      </w:r>
+      <w:proofErr w:type="spellEnd"/>
+      <w:r>
+        <w:rPr>
+          <w:rFonts w:ascii="Times New Roman" w:hAnsi="Times New Roman" w:cs="Times New Roman"/>
+          <w:color w:val="000000" w:themeColor="text1"/>
+          <w:sz w:val="28"/>
+          <w:szCs w:val="28"/>
+          <w:lang w:val="hu-HU"/>
+        </w:rPr>
+        <w:t xml:space="preserve"> projekt során egy komplex, több rétegből álló webalkalmazás került megvalósításra, amely megfelel a modern fejlesztési követelményeknek.</w:t>
       </w:r>
     </w:p>
     <w:p>

</xml_diff>